<commit_message>
Fixed type conversion issues: Cast all cell text values to strings before assignment
</commit_message>
<xml_diff>
--- a/src/Migration.Toolkit.Assessment/config/Template - Discovery and Assessment Findings Report V1.0 - Quest 2025 style.docx
+++ b/src/Migration.Toolkit.Assessment/config/Template - Discovery and Assessment Findings Report V1.0 - Quest 2025 style.docx
@@ -2,8 +2,6 @@
 <file path=word/document.xml><?xml version="1.0" encoding="utf-8"?>
 <w:document xmlns:wpc="http://schemas.microsoft.com/office/word/2010/wordprocessingCanvas" xmlns:cx="http://schemas.microsoft.com/office/drawing/2014/chartex" xmlns:cx1="http://schemas.microsoft.com/office/drawing/2015/9/8/chartex" xmlns:cx2="http://schemas.microsoft.com/office/drawing/2015/10/21/chartex" xmlns:cx3="http://schemas.microsoft.com/office/drawing/2016/5/9/chartex" xmlns:cx4="http://schemas.microsoft.com/office/drawing/2016/5/10/chartex" xmlns:cx5="http://schemas.microsoft.com/office/drawing/2016/5/11/chartex" xmlns:cx6="http://schemas.microsoft.com/office/drawing/2016/5/12/chartex" xmlns:cx7="http://schemas.microsoft.com/office/drawing/2016/5/13/chartex" xmlns:cx8="http://schemas.microsoft.com/office/drawing/2016/5/14/chartex" xmlns:mc="http://schemas.openxmlformats.org/markup-compatibility/2006" xmlns:aink="http://schemas.microsoft.com/office/drawing/2016/ink" xmlns:am3d="http://schemas.microsoft.com/office/drawing/2017/model3d" xmlns:o="urn:schemas-microsoft-com:office:office" xmlns:oel="http://schemas.microsoft.com/office/2019/extlst" xmlns:r="http://schemas.openxmlformats.org/officeDocument/2006/relationships" xmlns:m="http://schemas.openxmlformats.org/officeDocument/2006/math" xmlns:v="urn:schemas-microsoft-com:vml" xmlns:wp14="http://schemas.microsoft.com/office/word/2010/wordprocessingDrawing" xmlns:wp="http://schemas.openxmlformats.org/drawingml/2006/wordprocessingDrawing" xmlns:w10="urn:schemas-microsoft-com:office:word" xmlns:w="http://schemas.openxmlformats.org/wordprocessingml/2006/main" xmlns:w14="http://schemas.microsoft.com/office/word/2010/wordml" xmlns:w15="http://schemas.microsoft.com/office/word/2012/wordml" xmlns:w16cex="http://schemas.microsoft.com/office/word/2018/wordml/cex" xmlns:w16cid="http://schemas.microsoft.com/office/word/2016/wordml/cid" xmlns:w16="http://schemas.microsoft.com/office/word/2018/wordml" xmlns:w16du="http://schemas.microsoft.com/office/word/2023/wordml/word16du" xmlns:w16sdtdh="http://schemas.microsoft.com/office/word/2020/wordml/sdtdatahash" xmlns:w16sdtfl="http://schemas.microsoft.com/office/word/2024/wordml/sdtformatlock" xmlns:w16se="http://schemas.microsoft.com/office/word/2015/wordml/symex" xmlns:wpg="http://schemas.microsoft.com/office/word/2010/wordprocessingGroup" xmlns:wpi="http://schemas.microsoft.com/office/word/2010/wordprocessingInk" xmlns:wne="http://schemas.microsoft.com/office/word/2006/wordml" xmlns:wps="http://schemas.microsoft.com/office/word/2010/wordprocessingShape" mc:Ignorable="w14 w15 w16se w16cid w16 w16cex w16sdtdh w16sdtfl w16du wp14">
   <w:body>
-    <w:bookmarkStart w:id="0" w:name="_Toc442453119"/>
-    <w:bookmarkStart w:id="1" w:name="_Toc300077986"/>
     <w:p>
       <w:pPr>
         <w:tabs>
@@ -14,6 +12,8 @@
           <w:color w:val="0A0E20"/>
         </w:rPr>
       </w:pPr>
+      <w:bookmarkStart w:id="0" w:name="_Toc442453119"/>
+      <w:bookmarkStart w:id="1" w:name="_Toc300077986"/>
       <w:r>
         <w:rPr>
           <w:noProof/>
@@ -124,7 +124,6 @@
                               </w:rPr>
                               <w:t>N</w:t>
                             </w:r>
-                            <w:proofErr w:type="spellStart"/>
                             <w:r>
                               <w:rPr>
                                 <w:rFonts w:eastAsiaTheme="majorEastAsia" w:cstheme="majorBidi"/>
@@ -137,7 +136,6 @@
                               </w:rPr>
                               <w:t>ame</w:t>
                             </w:r>
-                            <w:proofErr w:type="spellEnd"/>
                             <w:r>
                               <w:rPr>
                                 <w:rFonts w:eastAsiaTheme="majorEastAsia" w:cstheme="majorBidi"/>
@@ -397,7 +395,6 @@
                         </w:rPr>
                         <w:t>N</w:t>
                       </w:r>
-                      <w:proofErr w:type="spellStart"/>
                       <w:r>
                         <w:rPr>
                           <w:rFonts w:eastAsiaTheme="majorEastAsia" w:cstheme="majorBidi"/>
@@ -410,7 +407,6 @@
                         </w:rPr>
                         <w:t>ame</w:t>
                       </w:r>
-                      <w:proofErr w:type="spellEnd"/>
                       <w:r>
                         <w:rPr>
                           <w:rFonts w:eastAsiaTheme="majorEastAsia" w:cstheme="majorBidi"/>
@@ -7088,13 +7084,57 @@
     </w:p>
     <w:p>
       <w:pPr>
+        <w:rPr>
+          <w:lang w:val="en-US"/>
+        </w:rPr>
+      </w:pPr>
+    </w:p>
+    <w:p>
+      <w:pPr>
         <w:pStyle w:val="Heading2"/>
         <w:rPr>
+          <w:lang w:val="en-US"/>
+        </w:rPr>
+      </w:pPr>
+      <w:r>
+        <w:rPr>
+          <w:lang w:val="en-US"/>
+        </w:rPr>
+        <w:t>UPN Suffixes</w:t>
+      </w:r>
+    </w:p>
+    <w:p>
+      <w:pPr>
+        <w:rPr>
+          <w:lang w:val="en-US"/>
+        </w:rPr>
+      </w:pPr>
+    </w:p>
+    <w:p>
+      <w:pPr>
+        <w:rPr>
+          <w:lang w:val="en-US"/>
+        </w:rPr>
+      </w:pPr>
+      <w:bookmarkStart w:id="21" w:name="BK_AD_UPN_Suffixes_Table"/>
+      <w:bookmarkEnd w:id="21"/>
+    </w:p>
+    <w:p>
+      <w:pPr>
+        <w:rPr>
+          <w:lang w:val="en-US"/>
+        </w:rPr>
+      </w:pPr>
+    </w:p>
+    <w:p>
+      <w:pPr>
+        <w:pStyle w:val="Heading2"/>
+        <w:rPr>
           <w:noProof/>
           <w:lang w:val="en-US"/>
         </w:rPr>
       </w:pPr>
-      <w:bookmarkStart w:id="21" w:name="_Toc218508605"/>
+      <w:bookmarkStart w:id="22" w:name="_Toc218508605"/>
       <w:r>
         <w:rPr>
           <w:noProof/>
@@ -7122,15 +7162,6 @@
         </w:rPr>
         <w:t>ion</w:t>
       </w:r>
-      <w:bookmarkEnd w:id="21"/>
-    </w:p>
-    <w:p>
-      <w:pPr>
-        <w:rPr>
-          <w:lang w:val="en-US"/>
-        </w:rPr>
-      </w:pPr>
-      <w:bookmarkStart w:id="22" w:name="BK_AD_Domain_Information_Table"/>
       <w:bookmarkEnd w:id="22"/>
     </w:p>
     <w:p>
@@ -7139,21 +7170,7 @@
           <w:lang w:val="en-US"/>
         </w:rPr>
       </w:pPr>
-    </w:p>
-    <w:p>
-      <w:pPr>
-        <w:rPr>
-          <w:lang w:val="en-US"/>
-        </w:rPr>
-      </w:pPr>
-    </w:p>
-    <w:p>
-      <w:pPr>
-        <w:rPr>
-          <w:lang w:val="en-US"/>
-        </w:rPr>
-      </w:pPr>
-      <w:bookmarkStart w:id="23" w:name="BK_Domain_Discovery_Table"/>
+      <w:bookmarkStart w:id="23" w:name="BK_AD_Domain_Information_Table"/>
       <w:bookmarkEnd w:id="23"/>
     </w:p>
     <w:p>
@@ -7165,19 +7182,42 @@
     </w:p>
     <w:p>
       <w:pPr>
+        <w:rPr>
+          <w:lang w:val="en-US"/>
+        </w:rPr>
+      </w:pPr>
+    </w:p>
+    <w:p>
+      <w:pPr>
+        <w:rPr>
+          <w:lang w:val="en-US"/>
+        </w:rPr>
+      </w:pPr>
+      <w:bookmarkStart w:id="24" w:name="BK_Domain_Discovery_Table"/>
+      <w:bookmarkEnd w:id="24"/>
+    </w:p>
+    <w:p>
+      <w:pPr>
+        <w:rPr>
+          <w:lang w:val="en-US"/>
+        </w:rPr>
+      </w:pPr>
+    </w:p>
+    <w:p>
+      <w:pPr>
         <w:pStyle w:val="Heading2"/>
         <w:rPr>
           <w:noProof/>
         </w:rPr>
       </w:pPr>
-      <w:bookmarkStart w:id="24" w:name="_Toc218508606"/>
+      <w:bookmarkStart w:id="25" w:name="_Toc218508606"/>
       <w:r>
         <w:rPr>
           <w:noProof/>
         </w:rPr>
         <w:t>Sites, Subnets and Sitelinks</w:t>
       </w:r>
-      <w:bookmarkEnd w:id="24"/>
+      <w:bookmarkEnd w:id="25"/>
     </w:p>
     <w:p>
       <w:pPr>
@@ -7217,8 +7257,8 @@
           <w:lang w:val="en-US"/>
         </w:rPr>
       </w:pPr>
-      <w:bookmarkStart w:id="25" w:name="BK_AD_Sites_Table"/>
-      <w:bookmarkEnd w:id="25"/>
+      <w:bookmarkStart w:id="26" w:name="BK_AD_Sites_Table"/>
+      <w:bookmarkEnd w:id="26"/>
     </w:p>
     <w:p>
       <w:pPr>
@@ -7246,8 +7286,8 @@
           <w:lang w:val="en-US"/>
         </w:rPr>
       </w:pPr>
-      <w:bookmarkStart w:id="26" w:name="BK_AD_Subnets_Table"/>
-      <w:bookmarkEnd w:id="26"/>
+      <w:bookmarkStart w:id="27" w:name="BK_AD_Subnets_Table"/>
+      <w:bookmarkEnd w:id="27"/>
     </w:p>
     <w:p>
       <w:pPr>
@@ -7281,8 +7321,8 @@
           <w:lang w:val="en-US"/>
         </w:rPr>
       </w:pPr>
-      <w:bookmarkStart w:id="27" w:name="BK_AD_Sitelinks_Table"/>
-      <w:bookmarkEnd w:id="27"/>
+      <w:bookmarkStart w:id="28" w:name="BK_AD_Sitelinks_Table"/>
+      <w:bookmarkEnd w:id="28"/>
     </w:p>
     <w:p>
       <w:pPr>
@@ -7300,39 +7340,39 @@
           <w:noProof/>
         </w:rPr>
       </w:pPr>
-      <w:bookmarkStart w:id="28" w:name="_Toc218508607"/>
+      <w:bookmarkStart w:id="29" w:name="_Toc218508607"/>
       <w:r>
         <w:rPr>
           <w:noProof/>
         </w:rPr>
         <w:t>Trust Relationships</w:t>
       </w:r>
-      <w:bookmarkEnd w:id="28"/>
-    </w:p>
-    <w:p>
-      <w:pPr>
-        <w:rPr>
-          <w:lang w:val="en-US"/>
-        </w:rPr>
-      </w:pPr>
-      <w:bookmarkStart w:id="29" w:name="BK_Trusts_Table"/>
       <w:bookmarkEnd w:id="29"/>
     </w:p>
     <w:p>
       <w:pPr>
+        <w:rPr>
+          <w:lang w:val="en-US"/>
+        </w:rPr>
+      </w:pPr>
+      <w:bookmarkStart w:id="30" w:name="BK_Trusts_Table"/>
+      <w:bookmarkEnd w:id="30"/>
+    </w:p>
+    <w:p>
+      <w:pPr>
         <w:pStyle w:val="Heading2"/>
         <w:rPr>
           <w:noProof/>
         </w:rPr>
       </w:pPr>
-      <w:bookmarkStart w:id="30" w:name="_Toc218508608"/>
+      <w:bookmarkStart w:id="31" w:name="_Toc218508608"/>
       <w:r>
         <w:rPr>
           <w:noProof/>
         </w:rPr>
         <w:t>Domain Controllers</w:t>
       </w:r>
-      <w:bookmarkEnd w:id="30"/>
+      <w:bookmarkEnd w:id="31"/>
     </w:p>
     <w:p>
       <w:pPr>
@@ -7365,8 +7405,8 @@
           <w:lang w:val="en-US"/>
         </w:rPr>
       </w:pPr>
-      <w:bookmarkStart w:id="31" w:name="BK_Domain_Controllers_Table"/>
-      <w:bookmarkEnd w:id="31"/>
+      <w:bookmarkStart w:id="32" w:name="BK_Domain_Controllers_Table"/>
+      <w:bookmarkEnd w:id="32"/>
     </w:p>
     <w:p>
       <w:pPr>
@@ -7375,14 +7415,14 @@
           <w:noProof/>
         </w:rPr>
       </w:pPr>
-      <w:bookmarkStart w:id="32" w:name="_Toc218508609"/>
+      <w:bookmarkStart w:id="33" w:name="_Toc218508609"/>
       <w:r>
         <w:rPr>
           <w:noProof/>
         </w:rPr>
         <w:t>Password Never Expires</w:t>
       </w:r>
-      <w:bookmarkEnd w:id="32"/>
+      <w:bookmarkEnd w:id="33"/>
     </w:p>
     <w:p>
       <w:r>
@@ -7408,6 +7448,7 @@
         </w:rPr>
       </w:pPr>
       <w:r>
+        <w:lastRenderedPageBreak/>
         <w:t xml:space="preserve">The table below shows the </w:t>
       </w:r>
       <w:r>
@@ -7429,8 +7470,8 @@
           <w:lang w:val="en-US"/>
         </w:rPr>
       </w:pPr>
-      <w:bookmarkStart w:id="33" w:name="BK_nonexpiring_passwords_Table"/>
-      <w:bookmarkEnd w:id="33"/>
+      <w:bookmarkStart w:id="34" w:name="BK_nonexpiring_passwords_Table"/>
+      <w:bookmarkEnd w:id="34"/>
       <w:r>
         <w:t xml:space="preserve">  </w:t>
       </w:r>
@@ -7442,22 +7483,13 @@
           <w:noProof/>
         </w:rPr>
       </w:pPr>
-      <w:bookmarkStart w:id="34" w:name="_Toc218508610"/>
+      <w:bookmarkStart w:id="35" w:name="_Toc218508610"/>
       <w:r>
         <w:rPr>
           <w:noProof/>
         </w:rPr>
         <w:t>Password Policies</w:t>
       </w:r>
-      <w:bookmarkEnd w:id="34"/>
-    </w:p>
-    <w:p>
-      <w:pPr>
-        <w:rPr>
-          <w:lang w:val="en-US"/>
-        </w:rPr>
-      </w:pPr>
-      <w:bookmarkStart w:id="35" w:name="BK_Password_Policies_Table"/>
       <w:bookmarkEnd w:id="35"/>
     </w:p>
     <w:p>
@@ -7466,17 +7498,26 @@
           <w:lang w:val="en-US"/>
         </w:rPr>
       </w:pPr>
-    </w:p>
-    <w:p>
-      <w:pPr>
-        <w:rPr>
-          <w:lang w:val="en-US"/>
-        </w:rPr>
-      </w:pPr>
-    </w:p>
-    <w:p>
-      <w:bookmarkStart w:id="36" w:name="BK_FGPP_Table"/>
+      <w:bookmarkStart w:id="36" w:name="BK_Password_Policies_Table"/>
       <w:bookmarkEnd w:id="36"/>
+    </w:p>
+    <w:p>
+      <w:pPr>
+        <w:rPr>
+          <w:lang w:val="en-US"/>
+        </w:rPr>
+      </w:pPr>
+    </w:p>
+    <w:p>
+      <w:pPr>
+        <w:rPr>
+          <w:lang w:val="en-US"/>
+        </w:rPr>
+      </w:pPr>
+    </w:p>
+    <w:p>
+      <w:bookmarkStart w:id="37" w:name="BK_FGPP_Table"/>
+      <w:bookmarkEnd w:id="37"/>
       <w:r>
         <w:t xml:space="preserve">  </w:t>
       </w:r>
@@ -7488,14 +7529,14 @@
           <w:noProof/>
         </w:rPr>
       </w:pPr>
-      <w:bookmarkStart w:id="37" w:name="_Toc218508611"/>
+      <w:bookmarkStart w:id="38" w:name="_Toc218508611"/>
       <w:r>
         <w:rPr>
           <w:noProof/>
         </w:rPr>
         <w:t>AD Recycle Bin</w:t>
       </w:r>
-      <w:bookmarkEnd w:id="37"/>
+      <w:bookmarkEnd w:id="38"/>
     </w:p>
     <w:p>
       <w:r>
@@ -7510,8 +7551,8 @@
       </w:pPr>
     </w:p>
     <w:p>
-      <w:bookmarkStart w:id="38" w:name="BK_AD_RecycleBin"/>
-      <w:bookmarkEnd w:id="38"/>
+      <w:bookmarkStart w:id="39" w:name="BK_AD_RecycleBin"/>
+      <w:bookmarkEnd w:id="39"/>
       <w:r>
         <w:t xml:space="preserve">        </w:t>
       </w:r>
@@ -7523,14 +7564,14 @@
           <w:noProof/>
         </w:rPr>
       </w:pPr>
-      <w:bookmarkStart w:id="39" w:name="_Toc218508612"/>
+      <w:bookmarkStart w:id="40" w:name="_Toc218508612"/>
       <w:r>
         <w:rPr>
           <w:noProof/>
         </w:rPr>
         <w:t>Group Policy</w:t>
       </w:r>
-      <w:bookmarkEnd w:id="39"/>
+      <w:bookmarkEnd w:id="40"/>
     </w:p>
     <w:p>
       <w:pPr>
@@ -7560,8 +7601,8 @@
           <w:lang w:val="en-US"/>
         </w:rPr>
       </w:pPr>
-      <w:bookmarkStart w:id="40" w:name="BK_Group_Policy_Table"/>
-      <w:bookmarkEnd w:id="40"/>
+      <w:bookmarkStart w:id="41" w:name="BK_Group_Policy_Table"/>
+      <w:bookmarkEnd w:id="41"/>
     </w:p>
     <w:p>
       <w:pPr>
@@ -7570,23 +7611,23 @@
           <w:noProof/>
         </w:rPr>
       </w:pPr>
-      <w:bookmarkStart w:id="41" w:name="_Toc218508613"/>
+      <w:bookmarkStart w:id="42" w:name="_Toc218508613"/>
       <w:r>
         <w:rPr>
           <w:noProof/>
         </w:rPr>
         <w:t>Login Scripts</w:t>
       </w:r>
-      <w:bookmarkEnd w:id="41"/>
-    </w:p>
-    <w:p>
-      <w:pPr>
-        <w:rPr>
-          <w:lang w:val="en-US"/>
-        </w:rPr>
-      </w:pPr>
-      <w:bookmarkStart w:id="42" w:name="BK_Login_Scripts_Table"/>
       <w:bookmarkEnd w:id="42"/>
+    </w:p>
+    <w:p>
+      <w:pPr>
+        <w:rPr>
+          <w:lang w:val="en-US"/>
+        </w:rPr>
+      </w:pPr>
+      <w:bookmarkStart w:id="43" w:name="BK_Login_Scripts_Table"/>
+      <w:bookmarkEnd w:id="43"/>
     </w:p>
     <w:p>
       <w:pPr>
@@ -7598,14 +7639,14 @@
           <w14:ligatures w14:val="standardContextual"/>
         </w:rPr>
       </w:pPr>
-      <w:bookmarkStart w:id="43" w:name="_Toc218508614"/>
+      <w:bookmarkStart w:id="44" w:name="_Toc218508614"/>
       <w:r>
         <w:rPr>
           <w:noProof/>
         </w:rPr>
         <w:t>AD Objects</w:t>
       </w:r>
-      <w:bookmarkEnd w:id="43"/>
+      <w:bookmarkEnd w:id="44"/>
     </w:p>
     <w:p>
       <w:pPr>
@@ -7614,14 +7655,14 @@
           <w:noProof/>
         </w:rPr>
       </w:pPr>
-      <w:bookmarkStart w:id="44" w:name="_Toc218508615"/>
+      <w:bookmarkStart w:id="45" w:name="_Toc218508615"/>
       <w:r>
         <w:rPr>
           <w:noProof/>
         </w:rPr>
         <w:t>Users</w:t>
       </w:r>
-      <w:bookmarkEnd w:id="44"/>
+      <w:bookmarkEnd w:id="45"/>
     </w:p>
     <w:p>
       <w:pPr>
@@ -7667,8 +7708,8 @@
           <w:lang w:val="en-US"/>
         </w:rPr>
       </w:pPr>
-      <w:bookmarkStart w:id="45" w:name="BK_AD_User_Statistics"/>
-      <w:bookmarkEnd w:id="45"/>
+      <w:bookmarkStart w:id="46" w:name="BK_AD_User_Statistics"/>
+      <w:bookmarkEnd w:id="46"/>
     </w:p>
     <w:p>
       <w:pPr>
@@ -7703,14 +7744,14 @@
           <w:noProof/>
         </w:rPr>
       </w:pPr>
-      <w:bookmarkStart w:id="46" w:name="_Toc218508616"/>
+      <w:bookmarkStart w:id="47" w:name="_Toc218508616"/>
       <w:r>
         <w:rPr>
           <w:noProof/>
         </w:rPr>
         <w:t>Groups</w:t>
       </w:r>
-      <w:bookmarkEnd w:id="46"/>
+      <w:bookmarkEnd w:id="47"/>
     </w:p>
     <w:p>
       <w:pPr>
@@ -7740,23 +7781,7 @@
           <w:lang w:val="en-US"/>
         </w:rPr>
       </w:pPr>
-      <w:bookmarkStart w:id="47" w:name="BK_AD_Groups_Table"/>
-      <w:bookmarkEnd w:id="47"/>
-    </w:p>
-    <w:p>
-      <w:pPr>
-        <w:rPr>
-          <w:lang w:val="en-US"/>
-        </w:rPr>
-      </w:pPr>
-    </w:p>
-    <w:p>
-      <w:pPr>
-        <w:rPr>
-          <w:lang w:val="en-US"/>
-        </w:rPr>
-      </w:pPr>
-      <w:bookmarkStart w:id="48" w:name="BK_AD_Empty_Groups_Table"/>
+      <w:bookmarkStart w:id="48" w:name="BK_AD_Groups_Table"/>
       <w:bookmarkEnd w:id="48"/>
     </w:p>
     <w:p>
@@ -7772,6 +7797,22 @@
           <w:lang w:val="en-US"/>
         </w:rPr>
       </w:pPr>
+      <w:bookmarkStart w:id="49" w:name="BK_AD_Empty_Groups_Table"/>
+      <w:bookmarkEnd w:id="49"/>
+    </w:p>
+    <w:p>
+      <w:pPr>
+        <w:rPr>
+          <w:lang w:val="en-US"/>
+        </w:rPr>
+      </w:pPr>
+    </w:p>
+    <w:p>
+      <w:pPr>
+        <w:rPr>
+          <w:lang w:val="en-US"/>
+        </w:rPr>
+      </w:pPr>
     </w:p>
     <w:p>
       <w:pPr>
@@ -7780,7 +7821,7 @@
           <w:noProof/>
         </w:rPr>
       </w:pPr>
-      <w:bookmarkStart w:id="49" w:name="_Toc218508617"/>
+      <w:bookmarkStart w:id="50" w:name="_Toc218508617"/>
       <w:r>
         <w:rPr>
           <w:noProof/>
@@ -7788,7 +7829,7 @@
         </w:rPr>
         <w:t>Devices</w:t>
       </w:r>
-      <w:bookmarkEnd w:id="49"/>
+      <w:bookmarkEnd w:id="50"/>
     </w:p>
     <w:p>
       <w:pPr>
@@ -7830,8 +7871,8 @@
           <w:lang w:val="en-US"/>
         </w:rPr>
       </w:pPr>
-      <w:bookmarkStart w:id="50" w:name="BK_AD_Devices_Table"/>
-      <w:bookmarkEnd w:id="50"/>
+      <w:bookmarkStart w:id="51" w:name="BK_AD_Devices_Table"/>
+      <w:bookmarkEnd w:id="51"/>
     </w:p>
     <w:p>
       <w:pPr>
@@ -7840,14 +7881,14 @@
           <w:noProof/>
         </w:rPr>
       </w:pPr>
-      <w:bookmarkStart w:id="51" w:name="_Toc218508618"/>
+      <w:bookmarkStart w:id="52" w:name="_Toc218508618"/>
       <w:r>
         <w:rPr>
           <w:noProof/>
         </w:rPr>
         <w:t>Contacts</w:t>
       </w:r>
-      <w:bookmarkEnd w:id="51"/>
+      <w:bookmarkEnd w:id="52"/>
     </w:p>
     <w:p>
       <w:pPr>
@@ -7871,8 +7912,8 @@
           <w:lang w:val="en-US"/>
         </w:rPr>
       </w:pPr>
-      <w:bookmarkStart w:id="52" w:name="BK_AD_Contacts_Table"/>
-      <w:bookmarkEnd w:id="52"/>
+      <w:bookmarkStart w:id="53" w:name="BK_AD_Contacts_Table"/>
+      <w:bookmarkEnd w:id="53"/>
     </w:p>
     <w:p>
       <w:pPr>
@@ -7881,14 +7922,14 @@
           <w:noProof/>
         </w:rPr>
       </w:pPr>
-      <w:bookmarkStart w:id="53" w:name="_Toc218508619"/>
+      <w:bookmarkStart w:id="54" w:name="_Toc218508619"/>
       <w:r>
         <w:rPr>
           <w:noProof/>
         </w:rPr>
         <w:t>Printers</w:t>
       </w:r>
-      <w:bookmarkEnd w:id="53"/>
+      <w:bookmarkEnd w:id="54"/>
     </w:p>
     <w:p>
       <w:pPr>
@@ -7918,8 +7959,8 @@
           <w:lang w:val="en-US"/>
         </w:rPr>
       </w:pPr>
-      <w:bookmarkStart w:id="54" w:name="BK_AD_Printers_Table"/>
-      <w:bookmarkEnd w:id="54"/>
+      <w:bookmarkStart w:id="55" w:name="BK_AD_Printers_Table"/>
+      <w:bookmarkEnd w:id="55"/>
     </w:p>
     <w:p>
       <w:pPr>
@@ -7928,15 +7969,14 @@
           <w:noProof/>
         </w:rPr>
       </w:pPr>
-      <w:bookmarkStart w:id="55" w:name="_Toc218508620"/>
+      <w:bookmarkStart w:id="56" w:name="_Toc218508620"/>
       <w:r>
         <w:rPr>
           <w:noProof/>
         </w:rPr>
-        <w:lastRenderedPageBreak/>
         <w:t>OU Structure</w:t>
       </w:r>
-      <w:bookmarkEnd w:id="55"/>
+      <w:bookmarkEnd w:id="56"/>
     </w:p>
     <w:p>
       <w:pPr>
@@ -7999,24 +8039,24 @@
           <w:lang w:val="en-US"/>
         </w:rPr>
       </w:pPr>
-      <w:bookmarkStart w:id="56" w:name="BK_AD_OU_Summary_Table"/>
-      <w:bookmarkEnd w:id="56"/>
-    </w:p>
-    <w:p>
-      <w:pPr>
-        <w:rPr>
-          <w:lang w:val="en-US"/>
-        </w:rPr>
-      </w:pPr>
-    </w:p>
-    <w:p>
-      <w:pPr>
-        <w:rPr>
-          <w:lang w:val="en-US"/>
-        </w:rPr>
-      </w:pPr>
-      <w:bookmarkStart w:id="57" w:name="BK_AD_OU_Depth_Table"/>
+      <w:bookmarkStart w:id="57" w:name="BK_AD_OU_Summary_Table"/>
       <w:bookmarkEnd w:id="57"/>
+    </w:p>
+    <w:p>
+      <w:pPr>
+        <w:rPr>
+          <w:lang w:val="en-US"/>
+        </w:rPr>
+      </w:pPr>
+    </w:p>
+    <w:p>
+      <w:pPr>
+        <w:rPr>
+          <w:lang w:val="en-US"/>
+        </w:rPr>
+      </w:pPr>
+      <w:bookmarkStart w:id="58" w:name="BK_AD_OU_Depth_Table"/>
+      <w:bookmarkEnd w:id="58"/>
     </w:p>
     <w:p>
       <w:pPr>
@@ -8031,7 +8071,7 @@
           <w:lang w:val="en-US"/>
         </w:rPr>
       </w:pPr>
-      <w:bookmarkStart w:id="58" w:name="_Toc218508622"/>
+      <w:bookmarkStart w:id="59" w:name="_Toc218508622"/>
       <w:r>
         <w:rPr>
           <w:rStyle w:val="Heading2Char"/>
@@ -8057,126 +8097,126 @@
           <w:lang w:val="en-US"/>
         </w:rPr>
       </w:pPr>
-      <w:bookmarkStart w:id="59" w:name="BK_Service_Accounts_Table"/>
+      <w:bookmarkStart w:id="60" w:name="BK_Service_Accounts_Table"/>
+      <w:bookmarkEnd w:id="60"/>
+    </w:p>
+    <w:p>
+      <w:pPr>
+        <w:rPr>
+          <w:lang w:val="en-US"/>
+        </w:rPr>
+      </w:pPr>
+    </w:p>
+    <w:p>
+      <w:pPr>
+        <w:pStyle w:val="Heading3"/>
+        <w:rPr>
+          <w:lang w:val="en-US"/>
+        </w:rPr>
+      </w:pPr>
+      <w:r>
+        <w:rPr>
+          <w:lang w:val="en-US"/>
+        </w:rPr>
+        <w:t>SPNs</w:t>
+      </w:r>
+    </w:p>
+    <w:p>
+      <w:pPr>
+        <w:rPr>
+          <w:lang w:val="en-US"/>
+        </w:rPr>
+      </w:pPr>
+    </w:p>
+    <w:p>
+      <w:pPr>
+        <w:rPr>
+          <w:lang w:val="en-US"/>
+        </w:rPr>
+      </w:pPr>
+      <w:bookmarkStart w:id="61" w:name="BK_AD_SPNs_Table"/>
+      <w:bookmarkEnd w:id="61"/>
+    </w:p>
+    <w:p>
+      <w:pPr>
+        <w:rPr>
+          <w:lang w:val="en-US"/>
+        </w:rPr>
+      </w:pPr>
+    </w:p>
+    <w:p>
+      <w:pPr>
+        <w:pStyle w:val="Heading3"/>
+        <w:rPr>
+          <w:lang w:val="en-US"/>
+        </w:rPr>
+      </w:pPr>
+      <w:r>
+        <w:t>Privileged Accounts</w:t>
+      </w:r>
+    </w:p>
+    <w:p>
+      <w:pPr>
+        <w:rPr>
+          <w:lang w:val="en-US"/>
+        </w:rPr>
+      </w:pPr>
+    </w:p>
+    <w:p>
+      <w:pPr>
+        <w:rPr>
+          <w:lang w:val="en-US"/>
+        </w:rPr>
+      </w:pPr>
+      <w:bookmarkStart w:id="62" w:name="BK_Privileged_Accounts_Table"/>
+      <w:bookmarkEnd w:id="62"/>
+    </w:p>
+    <w:p>
+      <w:pPr>
+        <w:pStyle w:val="Heading2"/>
+        <w:rPr>
+          <w:rStyle w:val="Heading2Char"/>
+          <w:lang w:val="en-US"/>
+        </w:rPr>
+      </w:pPr>
+      <w:r>
+        <w:rPr>
+          <w:rStyle w:val="Heading2Char"/>
+          <w:lang w:val="en-US"/>
+        </w:rPr>
+        <w:t>AD Schema</w:t>
+      </w:r>
+    </w:p>
+    <w:p>
+      <w:bookmarkStart w:id="63" w:name="BK_AD_Schema_Table"/>
+      <w:bookmarkEnd w:id="63"/>
+    </w:p>
+    <w:p>
+      <w:pPr>
+        <w:pStyle w:val="Heading2"/>
+        <w:rPr>
+          <w:rStyle w:val="Heading2Char"/>
+        </w:rPr>
+      </w:pPr>
+      <w:r>
+        <w:rPr>
+          <w:rStyle w:val="Heading2Char"/>
+        </w:rPr>
+        <w:t xml:space="preserve">AD to </w:t>
+      </w:r>
+      <w:r>
+        <w:rPr>
+          <w:rStyle w:val="Heading2Char"/>
+        </w:rPr>
+        <w:t>Entra</w:t>
+      </w:r>
+      <w:r>
+        <w:rPr>
+          <w:rStyle w:val="Heading2Char"/>
+        </w:rPr>
+        <w:t xml:space="preserve"> Sync and Considerations</w:t>
+      </w:r>
       <w:bookmarkEnd w:id="59"/>
-    </w:p>
-    <w:p>
-      <w:pPr>
-        <w:rPr>
-          <w:lang w:val="en-US"/>
-        </w:rPr>
-      </w:pPr>
-    </w:p>
-    <w:p>
-      <w:pPr>
-        <w:pStyle w:val="Heading3"/>
-        <w:rPr>
-          <w:lang w:val="en-US"/>
-        </w:rPr>
-      </w:pPr>
-      <w:r>
-        <w:rPr>
-          <w:lang w:val="en-US"/>
-        </w:rPr>
-        <w:t>SPNs</w:t>
-      </w:r>
-    </w:p>
-    <w:p>
-      <w:pPr>
-        <w:rPr>
-          <w:lang w:val="en-US"/>
-        </w:rPr>
-      </w:pPr>
-    </w:p>
-    <w:p>
-      <w:pPr>
-        <w:rPr>
-          <w:lang w:val="en-US"/>
-        </w:rPr>
-      </w:pPr>
-      <w:bookmarkStart w:id="60" w:name="BK_AD_SPNs_Table"/>
-      <w:bookmarkEnd w:id="60"/>
-    </w:p>
-    <w:p>
-      <w:pPr>
-        <w:rPr>
-          <w:lang w:val="en-US"/>
-        </w:rPr>
-      </w:pPr>
-    </w:p>
-    <w:p>
-      <w:pPr>
-        <w:pStyle w:val="Heading3"/>
-        <w:rPr>
-          <w:lang w:val="en-US"/>
-        </w:rPr>
-      </w:pPr>
-      <w:r>
-        <w:t>Privileged Accounts</w:t>
-      </w:r>
-    </w:p>
-    <w:p>
-      <w:pPr>
-        <w:rPr>
-          <w:lang w:val="en-US"/>
-        </w:rPr>
-      </w:pPr>
-    </w:p>
-    <w:p>
-      <w:pPr>
-        <w:rPr>
-          <w:lang w:val="en-US"/>
-        </w:rPr>
-      </w:pPr>
-      <w:bookmarkStart w:id="61" w:name="BK_Privileged_Accounts_Table"/>
-      <w:bookmarkEnd w:id="61"/>
-    </w:p>
-    <w:p>
-      <w:pPr>
-        <w:pStyle w:val="Heading2"/>
-        <w:rPr>
-          <w:rStyle w:val="Heading2Char"/>
-          <w:lang w:val="en-US"/>
-        </w:rPr>
-      </w:pPr>
-      <w:r>
-        <w:rPr>
-          <w:rStyle w:val="Heading2Char"/>
-          <w:lang w:val="en-US"/>
-        </w:rPr>
-        <w:t>AD Schema</w:t>
-      </w:r>
-    </w:p>
-    <w:p>
-      <w:bookmarkStart w:id="62" w:name="BK_AD_Schema_Table"/>
-      <w:bookmarkEnd w:id="62"/>
-    </w:p>
-    <w:p>
-      <w:pPr>
-        <w:pStyle w:val="Heading2"/>
-        <w:rPr>
-          <w:rStyle w:val="Heading2Char"/>
-        </w:rPr>
-      </w:pPr>
-      <w:r>
-        <w:rPr>
-          <w:rStyle w:val="Heading2Char"/>
-        </w:rPr>
-        <w:t xml:space="preserve">AD to </w:t>
-      </w:r>
-      <w:r>
-        <w:rPr>
-          <w:rStyle w:val="Heading2Char"/>
-        </w:rPr>
-        <w:t>Entra</w:t>
-      </w:r>
-      <w:r>
-        <w:rPr>
-          <w:rStyle w:val="Heading2Char"/>
-        </w:rPr>
-        <w:t xml:space="preserve"> Sync and Considerations</w:t>
-      </w:r>
-      <w:bookmarkEnd w:id="58"/>
     </w:p>
     <w:p>
       <w:r>
@@ -8213,7 +8253,7 @@
           <w:rFonts w:eastAsiaTheme="minorEastAsia"/>
         </w:rPr>
       </w:pPr>
-      <w:bookmarkStart w:id="63" w:name="_Toc218508623"/>
+      <w:bookmarkStart w:id="64" w:name="_Toc218508623"/>
       <w:r>
         <w:rPr>
           <w:rStyle w:val="Heading1Char"/>
@@ -8226,7 +8266,7 @@
         </w:rPr>
         <w:t xml:space="preserve"> AD Assessment</w:t>
       </w:r>
-      <w:bookmarkEnd w:id="63"/>
+      <w:bookmarkEnd w:id="64"/>
     </w:p>
     <w:p>
       <w:pPr>
@@ -8236,7 +8276,7 @@
           <w:lang w:val="en-US"/>
         </w:rPr>
       </w:pPr>
-      <w:bookmarkStart w:id="64" w:name="_Toc218508624"/>
+      <w:bookmarkStart w:id="65" w:name="_Toc218508624"/>
       <w:r>
         <w:rPr>
           <w:noProof/>
@@ -8249,16 +8289,16 @@
         </w:rPr>
         <w:t xml:space="preserve"> User Accounts</w:t>
       </w:r>
-      <w:bookmarkEnd w:id="64"/>
-    </w:p>
-    <w:p>
-      <w:pPr>
-        <w:rPr>
-          <w:lang w:val="en-US"/>
-        </w:rPr>
-      </w:pPr>
-      <w:bookmarkStart w:id="65" w:name="BK_Entra_Users_Table"/>
       <w:bookmarkEnd w:id="65"/>
+    </w:p>
+    <w:p>
+      <w:pPr>
+        <w:rPr>
+          <w:lang w:val="en-US"/>
+        </w:rPr>
+      </w:pPr>
+      <w:bookmarkStart w:id="66" w:name="BK_Entra_Users_Table"/>
+      <w:bookmarkEnd w:id="66"/>
     </w:p>
     <w:p>
       <w:pPr>
@@ -8346,12 +8386,13 @@
           <w:noProof/>
         </w:rPr>
       </w:pPr>
-      <w:bookmarkStart w:id="66" w:name="_Toc218508625"/>
+      <w:bookmarkStart w:id="67" w:name="_Toc218508625"/>
       <w:r>
         <w:rPr>
           <w:noProof/>
           <w:lang w:val="en-US"/>
         </w:rPr>
+        <w:lastRenderedPageBreak/>
         <w:t>Entra</w:t>
       </w:r>
       <w:r>
@@ -8360,7 +8401,7 @@
         </w:rPr>
         <w:t xml:space="preserve"> Guest Accounts</w:t>
       </w:r>
-      <w:bookmarkEnd w:id="66"/>
+      <w:bookmarkEnd w:id="67"/>
     </w:p>
     <w:p>
       <w:pPr>
@@ -8412,8 +8453,8 @@
           <w:lang w:val="en-US"/>
         </w:rPr>
       </w:pPr>
-      <w:bookmarkStart w:id="67" w:name="BK_Entra_Guest_Accounts_Table"/>
-      <w:bookmarkEnd w:id="67"/>
+      <w:bookmarkStart w:id="68" w:name="BK_Entra_Guest_Accounts_Table"/>
+      <w:bookmarkEnd w:id="68"/>
     </w:p>
     <w:p>
       <w:pPr>
@@ -8476,7 +8517,6 @@
           <w:b/>
           <w:bCs/>
         </w:rPr>
-        <w:lastRenderedPageBreak/>
         <w:t>Recommendations</w:t>
       </w:r>
       <w:r>
@@ -8509,14 +8549,14 @@
         </w:rPr>
         <w:t xml:space="preserve"> migrated or recreated </w:t>
       </w:r>
-      <w:bookmarkStart w:id="68" w:name="_Int_EY87SdSf"/>
+      <w:bookmarkStart w:id="69" w:name="_Int_EY87SdSf"/>
       <w:r>
         <w:rPr>
           <w:rFonts w:cs="Arial"/>
         </w:rPr>
         <w:t>in</w:t>
       </w:r>
-      <w:bookmarkEnd w:id="68"/>
+      <w:bookmarkEnd w:id="69"/>
       <w:r>
         <w:rPr>
           <w:rFonts w:cs="Arial"/>
@@ -8543,7 +8583,7 @@
           <w:noProof/>
         </w:rPr>
       </w:pPr>
-      <w:bookmarkStart w:id="69" w:name="_Toc218508626"/>
+      <w:bookmarkStart w:id="70" w:name="_Toc218508626"/>
       <w:r>
         <w:rPr>
           <w:noProof/>
@@ -8557,7 +8597,7 @@
         </w:rPr>
         <w:t xml:space="preserve"> Devices</w:t>
       </w:r>
-      <w:bookmarkEnd w:id="69"/>
+      <w:bookmarkEnd w:id="70"/>
     </w:p>
     <w:p>
       <w:pPr>
@@ -8712,8 +8752,8 @@
           <w:rFonts w:cs="Arial"/>
         </w:rPr>
       </w:pPr>
-      <w:bookmarkStart w:id="70" w:name="BK_Entra_Devices_Table"/>
-      <w:bookmarkEnd w:id="70"/>
+      <w:bookmarkStart w:id="71" w:name="BK_Entra_Devices_Table"/>
+      <w:bookmarkEnd w:id="71"/>
       <w:r>
         <w:rPr>
           <w:rFonts w:cs="Arial"/>
@@ -8738,7 +8778,7 @@
           <w:szCs w:val="36"/>
         </w:rPr>
       </w:pPr>
-      <w:bookmarkStart w:id="71" w:name="_Toc218508627"/>
+      <w:bookmarkStart w:id="72" w:name="_Toc218508627"/>
       <w:r>
         <w:rPr>
           <w:noProof/>
@@ -8746,7 +8786,7 @@
         </w:rPr>
         <w:t>Exchange – On prem Assessment</w:t>
       </w:r>
-      <w:bookmarkEnd w:id="71"/>
+      <w:bookmarkEnd w:id="72"/>
     </w:p>
     <w:p>
       <w:r>
@@ -8762,7 +8802,7 @@
           <w:szCs w:val="36"/>
         </w:rPr>
       </w:pPr>
-      <w:bookmarkStart w:id="72" w:name="_Toc218508628"/>
+      <w:bookmarkStart w:id="73" w:name="_Toc218508628"/>
       <w:r>
         <w:rPr>
           <w:noProof/>
@@ -8770,7 +8810,7 @@
         </w:rPr>
         <w:t>Exchange – Online Assessment</w:t>
       </w:r>
-      <w:bookmarkEnd w:id="72"/>
+      <w:bookmarkEnd w:id="73"/>
     </w:p>
     <w:p>
       <w:pPr>
@@ -8780,7 +8820,7 @@
           <w:lang w:val="en-US"/>
         </w:rPr>
       </w:pPr>
-      <w:bookmarkStart w:id="73" w:name="_Toc218508629"/>
+      <w:bookmarkStart w:id="74" w:name="_Toc218508629"/>
       <w:r>
         <w:rPr>
           <w:noProof/>
@@ -8801,7 +8841,7 @@
         </w:rPr>
         <w:t>Summary</w:t>
       </w:r>
-      <w:bookmarkEnd w:id="73"/>
+      <w:bookmarkEnd w:id="74"/>
     </w:p>
     <w:p>
       <w:pPr>
@@ -8893,8 +8933,8 @@
           <w:rFonts w:cs="Arial"/>
         </w:rPr>
       </w:pPr>
-      <w:bookmarkStart w:id="74" w:name="BK_EXO_Mailboxes_Table"/>
-      <w:bookmarkEnd w:id="74"/>
+      <w:bookmarkStart w:id="75" w:name="BK_EXO_Mailboxes_Table"/>
+      <w:bookmarkEnd w:id="75"/>
       <w:r>
         <w:rPr>
           <w:rFonts w:cs="Arial"/>
@@ -9008,11 +9048,12 @@
           <w:noProof/>
         </w:rPr>
       </w:pPr>
-      <w:bookmarkStart w:id="75" w:name="_Toc218508630"/>
+      <w:bookmarkStart w:id="76" w:name="_Toc218508630"/>
       <w:r>
         <w:rPr>
           <w:noProof/>
         </w:rPr>
+        <w:lastRenderedPageBreak/>
         <w:t xml:space="preserve">Mailboxes </w:t>
       </w:r>
       <w:r>
@@ -9051,7 +9092,7 @@
         </w:rPr>
         <w:t>old</w:t>
       </w:r>
-      <w:bookmarkEnd w:id="75"/>
+      <w:bookmarkEnd w:id="76"/>
     </w:p>
     <w:p>
       <w:pPr>
@@ -9093,7 +9134,6 @@
           <w:b/>
           <w:bCs/>
         </w:rPr>
-        <w:lastRenderedPageBreak/>
         <w:t xml:space="preserve">Findings: </w:t>
       </w:r>
     </w:p>
@@ -9104,8 +9144,8 @@
           <w:lang w:val="en-US"/>
         </w:rPr>
       </w:pPr>
-      <w:bookmarkStart w:id="76" w:name="BK_EXO_Lithold_Mailboxes_Table"/>
-      <w:bookmarkEnd w:id="76"/>
+      <w:bookmarkStart w:id="77" w:name="BK_EXO_Lithold_Mailboxes_Table"/>
+      <w:bookmarkEnd w:id="77"/>
     </w:p>
     <w:p>
       <w:pPr>
@@ -9168,7 +9208,7 @@
           <w:lang w:val="fr-FR"/>
         </w:rPr>
       </w:pPr>
-      <w:bookmarkStart w:id="77" w:name="_Toc218508631"/>
+      <w:bookmarkStart w:id="78" w:name="_Toc218508631"/>
       <w:r>
         <w:rPr>
           <w:noProof/>
@@ -9176,7 +9216,7 @@
         </w:rPr>
         <w:t>Mailbox quotas</w:t>
       </w:r>
-      <w:bookmarkEnd w:id="77"/>
+      <w:bookmarkEnd w:id="78"/>
     </w:p>
     <w:p>
       <w:pPr>
@@ -9212,8 +9252,8 @@
           <w:lang w:val="en-US"/>
         </w:rPr>
       </w:pPr>
-      <w:bookmarkStart w:id="78" w:name="BK_EXO_Mailbox_Quotas_Table"/>
-      <w:bookmarkEnd w:id="78"/>
+      <w:bookmarkStart w:id="79" w:name="BK_EXO_Mailbox_Quotas_Table"/>
+      <w:bookmarkEnd w:id="79"/>
     </w:p>
     <w:p>
       <w:pPr>
@@ -9239,7 +9279,7 @@
           <w:lang w:val="fr-FR"/>
         </w:rPr>
       </w:pPr>
-      <w:bookmarkStart w:id="79" w:name="_Toc218508632"/>
+      <w:bookmarkStart w:id="80" w:name="_Toc218508632"/>
       <w:r>
         <w:rPr>
           <w:noProof/>
@@ -9247,7 +9287,7 @@
         </w:rPr>
         <w:t>Distribution lists</w:t>
       </w:r>
-      <w:bookmarkEnd w:id="79"/>
+      <w:bookmarkEnd w:id="80"/>
     </w:p>
     <w:p>
       <w:pPr>
@@ -9290,8 +9330,8 @@
           <w:rFonts w:cs="Arial"/>
         </w:rPr>
       </w:pPr>
-      <w:bookmarkStart w:id="80" w:name="BK_EXO_DLs_Table"/>
-      <w:bookmarkEnd w:id="80"/>
+      <w:bookmarkStart w:id="81" w:name="BK_EXO_DLs_Table"/>
+      <w:bookmarkEnd w:id="81"/>
       <w:r>
         <w:rPr>
           <w:rFonts w:cs="Arial"/>
@@ -9385,14 +9425,14 @@
           <w:noProof/>
         </w:rPr>
       </w:pPr>
-      <w:bookmarkStart w:id="81" w:name="_Toc218508633"/>
+      <w:bookmarkStart w:id="82" w:name="_Toc218508633"/>
       <w:r>
         <w:rPr>
           <w:noProof/>
         </w:rPr>
         <w:t>Dynamic Distribution lists</w:t>
       </w:r>
-      <w:bookmarkEnd w:id="81"/>
+      <w:bookmarkEnd w:id="82"/>
     </w:p>
     <w:p>
       <w:pPr>
@@ -9440,8 +9480,8 @@
           <w:lang w:val="en-US"/>
         </w:rPr>
       </w:pPr>
-      <w:bookmarkStart w:id="82" w:name="BK_EXO_Dynamic_DLs_Table"/>
-      <w:bookmarkEnd w:id="82"/>
+      <w:bookmarkStart w:id="83" w:name="BK_EXO_Dynamic_DLs_Table"/>
+      <w:bookmarkEnd w:id="83"/>
     </w:p>
     <w:p>
       <w:pPr>
@@ -9450,14 +9490,14 @@
           <w:noProof/>
         </w:rPr>
       </w:pPr>
-      <w:bookmarkStart w:id="83" w:name="_Toc218508634"/>
+      <w:bookmarkStart w:id="84" w:name="_Toc218508634"/>
       <w:r>
         <w:rPr>
           <w:noProof/>
         </w:rPr>
         <w:t>Public Folders</w:t>
       </w:r>
-      <w:bookmarkEnd w:id="83"/>
+      <w:bookmarkEnd w:id="84"/>
     </w:p>
     <w:p>
       <w:r>
@@ -9474,14 +9514,14 @@
           <w:noProof/>
         </w:rPr>
       </w:pPr>
-      <w:bookmarkStart w:id="84" w:name="_Toc218508635"/>
+      <w:bookmarkStart w:id="85" w:name="_Toc218508635"/>
       <w:r>
         <w:rPr>
           <w:noProof/>
         </w:rPr>
         <w:t>Retention Policies</w:t>
       </w:r>
-      <w:bookmarkEnd w:id="84"/>
+      <w:bookmarkEnd w:id="85"/>
     </w:p>
     <w:p>
       <w:pPr>
@@ -9516,6 +9556,7 @@
           <w:b/>
           <w:bCs/>
         </w:rPr>
+        <w:lastRenderedPageBreak/>
         <w:t xml:space="preserve">Findings: </w:t>
       </w:r>
       <w:r>
@@ -9544,8 +9585,8 @@
           <w:lang w:val="en-US"/>
         </w:rPr>
       </w:pPr>
-      <w:bookmarkStart w:id="85" w:name="BK_EXO_Retention_Policies_Table"/>
-      <w:bookmarkEnd w:id="85"/>
+      <w:bookmarkStart w:id="86" w:name="BK_EXO_Retention_Policies_Table"/>
+      <w:bookmarkEnd w:id="86"/>
     </w:p>
     <w:p>
       <w:pPr>
@@ -9656,15 +9697,14 @@
           <w:noProof/>
         </w:rPr>
       </w:pPr>
-      <w:bookmarkStart w:id="86" w:name="_Toc218508636"/>
+      <w:bookmarkStart w:id="87" w:name="_Toc218508636"/>
       <w:r>
         <w:rPr>
           <w:noProof/>
         </w:rPr>
-        <w:lastRenderedPageBreak/>
         <w:t>Email Sanitization</w:t>
       </w:r>
-      <w:bookmarkEnd w:id="86"/>
+      <w:bookmarkEnd w:id="87"/>
     </w:p>
     <w:p>
       <w:pPr>
@@ -9783,7 +9823,7 @@
           <w:szCs w:val="36"/>
         </w:rPr>
       </w:pPr>
-      <w:bookmarkStart w:id="87" w:name="_Toc218508637"/>
+      <w:bookmarkStart w:id="88" w:name="_Toc218508637"/>
       <w:r>
         <w:rPr>
           <w:noProof/>
@@ -9791,7 +9831,7 @@
         </w:rPr>
         <w:t>OneDrive Assessment</w:t>
       </w:r>
-      <w:bookmarkEnd w:id="87"/>
+      <w:bookmarkEnd w:id="88"/>
     </w:p>
     <w:p>
       <w:pPr>
@@ -9801,7 +9841,7 @@
           <w:lang w:val="en-US"/>
         </w:rPr>
       </w:pPr>
-      <w:bookmarkStart w:id="88" w:name="_Toc218508638"/>
+      <w:bookmarkStart w:id="89" w:name="_Toc218508638"/>
       <w:r>
         <w:rPr>
           <w:noProof/>
@@ -9815,7 +9855,7 @@
         </w:rPr>
         <w:t>ummary</w:t>
       </w:r>
-      <w:bookmarkEnd w:id="88"/>
+      <w:bookmarkEnd w:id="89"/>
     </w:p>
     <w:p>
       <w:pPr>
@@ -9879,8 +9919,8 @@
           <w:lang w:val="en-US"/>
         </w:rPr>
       </w:pPr>
-      <w:bookmarkStart w:id="89" w:name="BK_ODfB_Sizes_Table"/>
-      <w:bookmarkEnd w:id="89"/>
+      <w:bookmarkStart w:id="90" w:name="BK_ODfB_Sizes_Table"/>
+      <w:bookmarkEnd w:id="90"/>
     </w:p>
     <w:p>
       <w:pPr>
@@ -9946,8 +9986,8 @@
           <w:rFonts w:cs="Arial"/>
         </w:rPr>
       </w:pPr>
-      <w:bookmarkStart w:id="90" w:name="BK_ODfB_Quotas_Table"/>
-      <w:bookmarkEnd w:id="90"/>
+      <w:bookmarkStart w:id="91" w:name="BK_ODfB_Quotas_Table"/>
+      <w:bookmarkEnd w:id="91"/>
       <w:r>
         <w:rPr>
           <w:rFonts w:cs="Arial"/>
@@ -10022,7 +10062,7 @@
           <w:noProof/>
         </w:rPr>
       </w:pPr>
-      <w:bookmarkStart w:id="91" w:name="_Toc218508639"/>
+      <w:bookmarkStart w:id="92" w:name="_Toc218508639"/>
       <w:r>
         <w:rPr>
           <w:rStyle w:val="Heading1Char"/>
@@ -10030,7 +10070,7 @@
         </w:rPr>
         <w:t>Teams Assessment</w:t>
       </w:r>
-      <w:bookmarkEnd w:id="91"/>
+      <w:bookmarkEnd w:id="92"/>
     </w:p>
     <w:p>
       <w:pPr>
@@ -10039,7 +10079,7 @@
           <w:noProof/>
         </w:rPr>
       </w:pPr>
-      <w:bookmarkStart w:id="92" w:name="_Toc218508640"/>
+      <w:bookmarkStart w:id="93" w:name="_Toc218508640"/>
       <w:r>
         <w:rPr>
           <w:noProof/>
@@ -10059,27 +10099,27 @@
         </w:rPr>
         <w:t xml:space="preserve"> Summary</w:t>
       </w:r>
-      <w:bookmarkEnd w:id="92"/>
-    </w:p>
-    <w:p>
-      <w:bookmarkStart w:id="93" w:name="BK_Teams_Summary_Table"/>
       <w:bookmarkEnd w:id="93"/>
     </w:p>
     <w:p>
+      <w:bookmarkStart w:id="94" w:name="BK_Teams_Summary_Table"/>
+      <w:bookmarkEnd w:id="94"/>
+    </w:p>
+    <w:p>
       <w:pPr>
         <w:pStyle w:val="Heading2"/>
         <w:rPr>
           <w:noProof/>
         </w:rPr>
       </w:pPr>
-      <w:bookmarkStart w:id="94" w:name="_Toc218508641"/>
+      <w:bookmarkStart w:id="95" w:name="_Toc218508641"/>
       <w:r>
         <w:rPr>
           <w:noProof/>
         </w:rPr>
         <w:t>Office 365 groups</w:t>
       </w:r>
-      <w:bookmarkEnd w:id="94"/>
+      <w:bookmarkEnd w:id="95"/>
     </w:p>
     <w:p>
       <w:pPr>
@@ -10123,8 +10163,8 @@
           <w:rFonts w:cs="Arial"/>
         </w:rPr>
       </w:pPr>
-      <w:bookmarkStart w:id="95" w:name="BK_Entra_M365_Groups_Table"/>
-      <w:bookmarkEnd w:id="95"/>
+      <w:bookmarkStart w:id="96" w:name="BK_Entra_M365_Groups_Table"/>
+      <w:bookmarkEnd w:id="96"/>
       <w:r>
         <w:rPr>
           <w:rFonts w:cs="Arial"/>
@@ -10192,7 +10232,14 @@
         <w:rPr>
           <w:rFonts w:cs="Arial"/>
         </w:rPr>
-        <w:t>Migration tool.  Note that if done in the migration tool there is no synchronization of membership removal over time.  If membership adds and removals are required, then there is a synchronization tool in the toolset for that purpose (part of the ODM AD tool set).</w:t>
+        <w:t xml:space="preserve">Migration tool.  Note that if done in the migration tool there is no </w:t>
+      </w:r>
+      <w:r>
+        <w:rPr>
+          <w:rFonts w:cs="Arial"/>
+        </w:rPr>
+        <w:lastRenderedPageBreak/>
+        <w:t>synchronization of membership removal over time.  If membership adds and removals are required, then there is a synchronization tool in the toolset for that purpose (part of the ODM AD tool set).</w:t>
       </w:r>
     </w:p>
     <w:p>
@@ -10203,16 +10250,15 @@
           <w:noProof/>
         </w:rPr>
       </w:pPr>
-      <w:bookmarkStart w:id="96" w:name="_Toc218508642"/>
+      <w:bookmarkStart w:id="97" w:name="_Toc218508642"/>
       <w:r>
         <w:rPr>
           <w:rStyle w:val="Heading1Char"/>
           <w:szCs w:val="36"/>
         </w:rPr>
-        <w:lastRenderedPageBreak/>
         <w:t>SharePoint Online Assessment</w:t>
       </w:r>
-      <w:bookmarkEnd w:id="96"/>
+      <w:bookmarkEnd w:id="97"/>
     </w:p>
     <w:p>
       <w:pPr>
@@ -10222,7 +10268,7 @@
           <w:lang w:val="en-US"/>
         </w:rPr>
       </w:pPr>
-      <w:bookmarkStart w:id="97" w:name="_Toc218508643"/>
+      <w:bookmarkStart w:id="98" w:name="_Toc218508643"/>
       <w:r>
         <w:rPr>
           <w:noProof/>
@@ -10236,7 +10282,7 @@
         </w:rPr>
         <w:t>ummary</w:t>
       </w:r>
-      <w:bookmarkEnd w:id="97"/>
+      <w:bookmarkEnd w:id="98"/>
     </w:p>
     <w:p>
       <w:pPr>
@@ -10285,8 +10331,8 @@
           <w:lang w:val="en-US"/>
         </w:rPr>
       </w:pPr>
-      <w:bookmarkStart w:id="98" w:name="BK_SPO_Summary_Table"/>
-      <w:bookmarkEnd w:id="98"/>
+      <w:bookmarkStart w:id="99" w:name="BK_SPO_Summary_Table"/>
+      <w:bookmarkEnd w:id="99"/>
     </w:p>
     <w:p>
       <w:pPr>
@@ -10418,14 +10464,14 @@
           <w:noProof/>
         </w:rPr>
       </w:pPr>
-      <w:bookmarkStart w:id="99" w:name="_Toc218508644"/>
+      <w:bookmarkStart w:id="100" w:name="_Toc218508644"/>
       <w:r>
         <w:rPr>
           <w:noProof/>
         </w:rPr>
         <w:t>SharePoint Global Configurations</w:t>
       </w:r>
-      <w:bookmarkEnd w:id="99"/>
+      <w:bookmarkEnd w:id="100"/>
     </w:p>
     <w:p>
       <w:pPr>
@@ -10471,8 +10517,8 @@
           <w:lang w:val="en-US"/>
         </w:rPr>
       </w:pPr>
-      <w:bookmarkStart w:id="100" w:name="BK_SPO_Config_Table"/>
-      <w:bookmarkEnd w:id="100"/>
+      <w:bookmarkStart w:id="101" w:name="BK_SPO_Config_Table"/>
+      <w:bookmarkEnd w:id="101"/>
     </w:p>
     <w:p>
       <w:pPr>
@@ -10582,7 +10628,7 @@
           <w:szCs w:val="36"/>
         </w:rPr>
       </w:pPr>
-      <w:bookmarkStart w:id="101" w:name="_Toc218508645"/>
+      <w:bookmarkStart w:id="102" w:name="_Toc218508645"/>
       <w:r>
         <w:rPr>
           <w:rStyle w:val="Heading1Char"/>
@@ -10590,18 +10636,18 @@
         </w:rPr>
         <w:t>Infrastructure Assessment</w:t>
       </w:r>
-      <w:bookmarkEnd w:id="101"/>
+      <w:bookmarkEnd w:id="102"/>
     </w:p>
     <w:p>
       <w:pPr>
         <w:pStyle w:val="Heading2"/>
       </w:pPr>
-      <w:bookmarkStart w:id="102" w:name="_Toc218508599"/>
-      <w:bookmarkStart w:id="103" w:name="_Toc218508646"/>
+      <w:bookmarkStart w:id="103" w:name="_Toc218508599"/>
+      <w:bookmarkStart w:id="104" w:name="_Toc218508646"/>
       <w:r>
         <w:t>Change Control</w:t>
       </w:r>
-      <w:bookmarkEnd w:id="102"/>
+      <w:bookmarkEnd w:id="103"/>
     </w:p>
     <w:p>
       <w:pPr>
@@ -10630,28 +10676,28 @@
         </w:rPr>
         <w:t xml:space="preserve"> Control is a process used to ensure that changes to a system are introduced in a controlled and coordinated manner.  </w:t>
       </w:r>
-      <w:bookmarkStart w:id="104" w:name="_Int_SD01zgNE"/>
+      <w:bookmarkStart w:id="105" w:name="_Int_SD01zgNE"/>
       <w:r>
         <w:rPr>
           <w:rFonts w:cs="Arial"/>
         </w:rPr>
         <w:t>IT</w:t>
       </w:r>
-      <w:bookmarkEnd w:id="104"/>
+      <w:bookmarkEnd w:id="105"/>
       <w:r>
         <w:rPr>
           <w:rFonts w:cs="Arial"/>
         </w:rPr>
         <w:t xml:space="preserve"> reduced the possibility that unnecessary changes would be introduced without </w:t>
       </w:r>
-      <w:bookmarkStart w:id="105" w:name="_Int_XPDXrifH"/>
+      <w:bookmarkStart w:id="106" w:name="_Int_XPDXrifH"/>
       <w:r>
         <w:rPr>
           <w:rFonts w:cs="Arial"/>
         </w:rPr>
         <w:t>forethought</w:t>
       </w:r>
-      <w:bookmarkEnd w:id="105"/>
+      <w:bookmarkEnd w:id="106"/>
       <w:r>
         <w:rPr>
           <w:rFonts w:cs="Arial"/>
@@ -10725,11 +10771,11 @@
       <w:pPr>
         <w:pStyle w:val="Heading2"/>
       </w:pPr>
-      <w:bookmarkStart w:id="106" w:name="_Toc218508600"/>
+      <w:bookmarkStart w:id="107" w:name="_Toc218508600"/>
       <w:r>
         <w:t>Blackout Periods</w:t>
       </w:r>
-      <w:bookmarkEnd w:id="106"/>
+      <w:bookmarkEnd w:id="107"/>
     </w:p>
     <w:p>
       <w:pPr>
@@ -10770,6 +10816,7 @@
           <w:b/>
           <w:bCs/>
         </w:rPr>
+        <w:lastRenderedPageBreak/>
         <w:t>Findings</w:t>
       </w:r>
       <w:r>
@@ -10792,7 +10839,6 @@
           <w:b/>
           <w:bCs/>
         </w:rPr>
-        <w:lastRenderedPageBreak/>
         <w:t>Recommendation</w:t>
       </w:r>
       <w:r>
@@ -10820,11 +10866,11 @@
       <w:pPr>
         <w:pStyle w:val="Heading2"/>
       </w:pPr>
-      <w:bookmarkStart w:id="107" w:name="_Toc218508601"/>
+      <w:bookmarkStart w:id="108" w:name="_Toc218508601"/>
       <w:r>
         <w:t>Remote Workers</w:t>
       </w:r>
-      <w:bookmarkEnd w:id="107"/>
+      <w:bookmarkEnd w:id="108"/>
     </w:p>
     <w:p>
       <w:pPr>
@@ -10886,7 +10932,7 @@
         </w:rPr>
         <w:t>pplication Deployment</w:t>
       </w:r>
-      <w:bookmarkEnd w:id="103"/>
+      <w:bookmarkEnd w:id="104"/>
     </w:p>
     <w:p>
       <w:pPr>
@@ -10937,14 +10983,14 @@
           <w:noProof/>
         </w:rPr>
       </w:pPr>
-      <w:bookmarkStart w:id="108" w:name="_Toc218508647"/>
+      <w:bookmarkStart w:id="109" w:name="_Toc218508647"/>
       <w:r>
         <w:rPr>
           <w:noProof/>
         </w:rPr>
         <w:t>Desktop Administration</w:t>
       </w:r>
-      <w:bookmarkEnd w:id="108"/>
+      <w:bookmarkEnd w:id="109"/>
     </w:p>
     <w:p>
       <w:pPr>
@@ -11045,14 +11091,14 @@
           <w:noProof/>
         </w:rPr>
       </w:pPr>
-      <w:bookmarkStart w:id="109" w:name="_Toc218508648"/>
+      <w:bookmarkStart w:id="110" w:name="_Toc218508648"/>
       <w:r>
         <w:rPr>
           <w:noProof/>
         </w:rPr>
         <w:t>Virtual Private Networking</w:t>
       </w:r>
-      <w:bookmarkEnd w:id="109"/>
+      <w:bookmarkEnd w:id="110"/>
     </w:p>
     <w:p>
       <w:pPr>
@@ -11197,14 +11243,14 @@
           <w:noProof/>
         </w:rPr>
       </w:pPr>
-      <w:bookmarkStart w:id="110" w:name="_Toc218508649"/>
+      <w:bookmarkStart w:id="111" w:name="_Toc218508649"/>
       <w:r>
         <w:rPr>
           <w:noProof/>
         </w:rPr>
         <w:t>Wireless</w:t>
       </w:r>
-      <w:bookmarkEnd w:id="110"/>
+      <w:bookmarkEnd w:id="111"/>
     </w:p>
     <w:p>
       <w:pPr>
@@ -11282,14 +11328,14 @@
         </w:rPr>
         <w:t xml:space="preserve">/M365 Wi-Fi should not be impacted.  Should </w:t>
       </w:r>
-      <w:bookmarkStart w:id="111" w:name="_Int_cQdpeWAB"/>
+      <w:bookmarkStart w:id="112" w:name="_Int_cQdpeWAB"/>
       <w:r>
         <w:rPr>
           <w:rFonts w:cs="Arial"/>
         </w:rPr>
         <w:t>an AD</w:t>
       </w:r>
-      <w:bookmarkEnd w:id="111"/>
+      <w:bookmarkEnd w:id="112"/>
       <w:r>
         <w:rPr>
           <w:rFonts w:cs="Arial"/>
@@ -11305,15 +11351,16 @@
           <w:lang w:val="fr-FR"/>
         </w:rPr>
       </w:pPr>
-      <w:bookmarkStart w:id="112" w:name="_Toc218508650"/>
+      <w:bookmarkStart w:id="113" w:name="_Toc218508650"/>
       <w:r>
         <w:rPr>
           <w:noProof/>
           <w:lang w:val="fr-FR"/>
         </w:rPr>
+        <w:lastRenderedPageBreak/>
         <w:t>Virtual Desktop (VDI, Citrix, etc.)</w:t>
       </w:r>
-      <w:bookmarkEnd w:id="112"/>
+      <w:bookmarkEnd w:id="113"/>
     </w:p>
     <w:p>
       <w:r>
@@ -11331,11 +11378,7 @@
         <w:t xml:space="preserve"> </w:t>
       </w:r>
       <w:r>
-        <w:t xml:space="preserve">A virtual desktop is a simulated desktop environment that is created and managed by software, typically on a server or cloud infrastructure. It allows users to access a desktop operating </w:t>
-      </w:r>
-      <w:r>
-        <w:lastRenderedPageBreak/>
-        <w:t>system and its applications remotely from any device, giving the experience of a traditional desktop computer without being tied to a specific physical machine.</w:t>
+        <w:t>A virtual desktop is a simulated desktop environment that is created and managed by software, typically on a server or cloud infrastructure. It allows users to access a desktop operating system and its applications remotely from any device, giving the experience of a traditional desktop computer without being tied to a specific physical machine.</w:t>
       </w:r>
     </w:p>
     <w:p>
@@ -11417,7 +11460,7 @@
           <w:noProof/>
         </w:rPr>
       </w:pPr>
-      <w:bookmarkStart w:id="113" w:name="_Toc218508651"/>
+      <w:bookmarkStart w:id="114" w:name="_Toc218508651"/>
       <w:r>
         <w:rPr>
           <w:noProof/>
@@ -11425,7 +11468,7 @@
         <w:lastRenderedPageBreak/>
         <w:t>Appendices</w:t>
       </w:r>
-      <w:bookmarkEnd w:id="113"/>
+      <w:bookmarkEnd w:id="114"/>
     </w:p>
     <w:p>
       <w:pPr>
@@ -11434,7 +11477,7 @@
           <w:u w:color="FFFFFF"/>
         </w:rPr>
       </w:pPr>
-      <w:bookmarkStart w:id="114" w:name="_Toc218508652"/>
+      <w:bookmarkStart w:id="115" w:name="_Toc218508652"/>
       <w:r>
         <w:rPr>
           <w:noProof/>
@@ -11472,36 +11515,36 @@
         </w:rPr>
         <w:t>Integration Questions/Answers</w:t>
       </w:r>
-      <w:bookmarkEnd w:id="114"/>
+      <w:bookmarkEnd w:id="115"/>
     </w:p>
     <w:p>
       <w:pPr>
         <w:pStyle w:val="Heading1"/>
       </w:pPr>
-      <w:bookmarkStart w:id="115" w:name="_Cleanup"/>
-      <w:bookmarkStart w:id="116" w:name="_Toc50122336"/>
-      <w:bookmarkStart w:id="117" w:name="_Toc218508653"/>
+      <w:bookmarkStart w:id="116" w:name="_Cleanup"/>
+      <w:bookmarkStart w:id="117" w:name="_Toc50122336"/>
+      <w:bookmarkStart w:id="118" w:name="_Toc218508653"/>
       <w:bookmarkEnd w:id="6"/>
       <w:bookmarkEnd w:id="7"/>
       <w:bookmarkEnd w:id="8"/>
       <w:bookmarkEnd w:id="9"/>
       <w:bookmarkEnd w:id="10"/>
       <w:bookmarkEnd w:id="11"/>
-      <w:bookmarkEnd w:id="115"/>
+      <w:bookmarkEnd w:id="116"/>
       <w:r>
         <w:t>About us</w:t>
       </w:r>
-      <w:bookmarkEnd w:id="116"/>
       <w:bookmarkEnd w:id="117"/>
+      <w:bookmarkEnd w:id="118"/>
     </w:p>
     <w:p>
       <w:pPr>
         <w:pStyle w:val="Heading2"/>
       </w:pPr>
-      <w:bookmarkStart w:id="118" w:name="_Toc50118496"/>
-      <w:bookmarkStart w:id="119" w:name="_Toc50118071"/>
-      <w:bookmarkStart w:id="120" w:name="_Toc50122337"/>
-      <w:bookmarkStart w:id="121" w:name="_Toc218508654"/>
+      <w:bookmarkStart w:id="119" w:name="_Toc50118496"/>
+      <w:bookmarkStart w:id="120" w:name="_Toc50118071"/>
+      <w:bookmarkStart w:id="121" w:name="_Toc50122337"/>
+      <w:bookmarkStart w:id="122" w:name="_Toc218508654"/>
       <w:r>
         <w:t xml:space="preserve">Where Next </w:t>
       </w:r>
@@ -11511,10 +11554,10 @@
       <w:r>
         <w:t xml:space="preserve"> Now</w:t>
       </w:r>
-      <w:bookmarkEnd w:id="118"/>
       <w:bookmarkEnd w:id="119"/>
       <w:bookmarkEnd w:id="120"/>
       <w:bookmarkEnd w:id="121"/>
+      <w:bookmarkEnd w:id="122"/>
     </w:p>
     <w:p>
       <w:r>
@@ -11545,17 +11588,17 @@
       <w:pPr>
         <w:pStyle w:val="Heading2"/>
       </w:pPr>
-      <w:bookmarkStart w:id="122" w:name="_Toc50118497"/>
-      <w:bookmarkStart w:id="123" w:name="_Toc50118072"/>
-      <w:bookmarkStart w:id="124" w:name="_Toc50122338"/>
-      <w:bookmarkStart w:id="125" w:name="_Toc218508655"/>
+      <w:bookmarkStart w:id="123" w:name="_Toc50118497"/>
+      <w:bookmarkStart w:id="124" w:name="_Toc50118072"/>
+      <w:bookmarkStart w:id="125" w:name="_Toc50122338"/>
+      <w:bookmarkStart w:id="126" w:name="_Toc218508655"/>
       <w:r>
         <w:t>Contacting Quest</w:t>
       </w:r>
-      <w:bookmarkEnd w:id="122"/>
       <w:bookmarkEnd w:id="123"/>
       <w:bookmarkEnd w:id="124"/>
       <w:bookmarkEnd w:id="125"/>
+      <w:bookmarkEnd w:id="126"/>
     </w:p>
     <w:p>
       <w:r>
@@ -11585,17 +11628,17 @@
       <w:pPr>
         <w:pStyle w:val="Heading2"/>
       </w:pPr>
-      <w:bookmarkStart w:id="126" w:name="_Toc50118498"/>
-      <w:bookmarkStart w:id="127" w:name="_Toc50118073"/>
-      <w:bookmarkStart w:id="128" w:name="_Toc50122339"/>
-      <w:bookmarkStart w:id="129" w:name="_Toc218508656"/>
+      <w:bookmarkStart w:id="127" w:name="_Toc50118498"/>
+      <w:bookmarkStart w:id="128" w:name="_Toc50118073"/>
+      <w:bookmarkStart w:id="129" w:name="_Toc50122339"/>
+      <w:bookmarkStart w:id="130" w:name="_Toc218508656"/>
       <w:r>
         <w:t>Technical support resources</w:t>
       </w:r>
-      <w:bookmarkEnd w:id="126"/>
       <w:bookmarkEnd w:id="127"/>
       <w:bookmarkEnd w:id="128"/>
       <w:bookmarkEnd w:id="129"/>
+      <w:bookmarkEnd w:id="130"/>
     </w:p>
     <w:p>
       <w:r>
@@ -20191,6 +20234,16 @@
 </file>
 
 <file path=customXml/item1.xml><?xml version="1.0" encoding="utf-8"?>
+<b:Sources xmlns:b="http://schemas.openxmlformats.org/officeDocument/2006/bibliography" xmlns="http://schemas.openxmlformats.org/officeDocument/2006/bibliography" SelectedStyle="/APA.XSL" StyleName="APA"/>
+</file>
+
+<file path=customXml/item2.xml><?xml version="1.0" encoding="utf-8"?>
+<p:properties xmlns:p="http://schemas.microsoft.com/office/2006/metadata/properties" xmlns:xsi="http://www.w3.org/2001/XMLSchema-instance" xmlns:pc="http://schemas.microsoft.com/office/infopath/2007/PartnerControls">
+  <documentManagement/>
+</p:properties>
+</file>
+
+<file path=customXml/item3.xml><?xml version="1.0" encoding="utf-8"?>
 <ct:contentTypeSchema xmlns:ct="http://schemas.microsoft.com/office/2006/metadata/contentType" xmlns:ma="http://schemas.microsoft.com/office/2006/metadata/properties/metaAttributes" ct:_="" ma:_="" ma:contentTypeName="Document" ma:contentTypeID="0x010100E8CB6F3EDD43474AA10481D50BB64020" ma:contentTypeVersion="4" ma:contentTypeDescription="Create a new document." ma:contentTypeScope="" ma:versionID="be0fb91248b2e97ea45459c2c5c0e22c">
   <xsd:schema xmlns:xsd="http://www.w3.org/2001/XMLSchema" xmlns:xs="http://www.w3.org/2001/XMLSchema" xmlns:p="http://schemas.microsoft.com/office/2006/metadata/properties" xmlns:ns2="564344db-7381-46cc-ad20-5587031b0ed9" targetNamespace="http://schemas.microsoft.com/office/2006/metadata/properties" ma:root="true" ma:fieldsID="9b3be8367740804d7b19f678bfda6a23" ns2:_="">
     <xsd:import namespace="564344db-7381-46cc-ad20-5587031b0ed9"/>
@@ -20334,16 +20387,6 @@
 </ct:contentTypeSchema>
 </file>
 
-<file path=customXml/item2.xml><?xml version="1.0" encoding="utf-8"?>
-<p:properties xmlns:p="http://schemas.microsoft.com/office/2006/metadata/properties" xmlns:xsi="http://www.w3.org/2001/XMLSchema-instance" xmlns:pc="http://schemas.microsoft.com/office/infopath/2007/PartnerControls">
-  <documentManagement/>
-</p:properties>
-</file>
-
-<file path=customXml/item3.xml><?xml version="1.0" encoding="utf-8"?>
-<b:Sources xmlns:b="http://schemas.openxmlformats.org/officeDocument/2006/bibliography" xmlns="http://schemas.openxmlformats.org/officeDocument/2006/bibliography" SelectedStyle="/APA.XSL" StyleName="APA"/>
-</file>
-
 <file path=customXml/item4.xml><?xml version="1.0" encoding="utf-8"?>
 <?mso-contentType ?>
 <FormTemplates xmlns="http://schemas.microsoft.com/sharepoint/v3/contenttype/forms">
@@ -20354,6 +20397,23 @@
 </file>
 
 <file path=customXml/itemProps1.xml><?xml version="1.0" encoding="utf-8"?>
+<ds:datastoreItem xmlns:ds="http://schemas.openxmlformats.org/officeDocument/2006/customXml" ds:itemID="{1F2F4FAC-1BAA-4C15-8BEC-869F6AC26C67}">
+  <ds:schemaRefs>
+    <ds:schemaRef ds:uri="http://schemas.openxmlformats.org/officeDocument/2006/bibliography"/>
+  </ds:schemaRefs>
+</ds:datastoreItem>
+</file>
+
+<file path=customXml/itemProps2.xml><?xml version="1.0" encoding="utf-8"?>
+<ds:datastoreItem xmlns:ds="http://schemas.openxmlformats.org/officeDocument/2006/customXml" ds:itemID="{EEF0FF5E-EC80-4EC7-816E-8FD3FB1F00C5}">
+  <ds:schemaRefs>
+    <ds:schemaRef ds:uri="http://schemas.microsoft.com/office/2006/metadata/properties"/>
+    <ds:schemaRef ds:uri="http://schemas.microsoft.com/office/infopath/2007/PartnerControls"/>
+  </ds:schemaRefs>
+</ds:datastoreItem>
+</file>
+
+<file path=customXml/itemProps3.xml><?xml version="1.0" encoding="utf-8"?>
 <ds:datastoreItem xmlns:ds="http://schemas.openxmlformats.org/officeDocument/2006/customXml" ds:itemID="{EC30F5FF-22C8-4A05-8DCE-BA118E3692D7}">
   <ds:schemaRefs>
     <ds:schemaRef ds:uri="http://schemas.microsoft.com/office/2006/metadata/contentType"/>
@@ -20371,23 +20431,6 @@
 </ds:datastoreItem>
 </file>
 
-<file path=customXml/itemProps2.xml><?xml version="1.0" encoding="utf-8"?>
-<ds:datastoreItem xmlns:ds="http://schemas.openxmlformats.org/officeDocument/2006/customXml" ds:itemID="{EEF0FF5E-EC80-4EC7-816E-8FD3FB1F00C5}">
-  <ds:schemaRefs>
-    <ds:schemaRef ds:uri="http://schemas.microsoft.com/office/2006/metadata/properties"/>
-    <ds:schemaRef ds:uri="http://schemas.microsoft.com/office/infopath/2007/PartnerControls"/>
-  </ds:schemaRefs>
-</ds:datastoreItem>
-</file>
-
-<file path=customXml/itemProps3.xml><?xml version="1.0" encoding="utf-8"?>
-<ds:datastoreItem xmlns:ds="http://schemas.openxmlformats.org/officeDocument/2006/customXml" ds:itemID="{1F2F4FAC-1BAA-4C15-8BEC-869F6AC26C67}">
-  <ds:schemaRefs>
-    <ds:schemaRef ds:uri="http://schemas.openxmlformats.org/officeDocument/2006/bibliography"/>
-  </ds:schemaRefs>
-</ds:datastoreItem>
-</file>
-
 <file path=customXml/itemProps4.xml><?xml version="1.0" encoding="utf-8"?>
 <ds:datastoreItem xmlns:ds="http://schemas.openxmlformats.org/officeDocument/2006/customXml" ds:itemID="{6830A3BC-7801-49DF-97A3-727FA35DA724}">
   <ds:schemaRefs>

</xml_diff>

<commit_message>
Updated Add-AdDomainInformation to calculate metrics from multiple CSV files and updated config to use folder-based data source
</commit_message>
<xml_diff>
--- a/src/Migration.Toolkit.Assessment/config/Template - Discovery and Assessment Findings Report V1.0 - Quest 2025 style.docx
+++ b/src/Migration.Toolkit.Assessment/config/Template - Discovery and Assessment Findings Report V1.0 - Quest 2025 style.docx
@@ -2,6 +2,8 @@
 <file path=word/document.xml><?xml version="1.0" encoding="utf-8"?>
 <w:document xmlns:wpc="http://schemas.microsoft.com/office/word/2010/wordprocessingCanvas" xmlns:cx="http://schemas.microsoft.com/office/drawing/2014/chartex" xmlns:cx1="http://schemas.microsoft.com/office/drawing/2015/9/8/chartex" xmlns:cx2="http://schemas.microsoft.com/office/drawing/2015/10/21/chartex" xmlns:cx3="http://schemas.microsoft.com/office/drawing/2016/5/9/chartex" xmlns:cx4="http://schemas.microsoft.com/office/drawing/2016/5/10/chartex" xmlns:cx5="http://schemas.microsoft.com/office/drawing/2016/5/11/chartex" xmlns:cx6="http://schemas.microsoft.com/office/drawing/2016/5/12/chartex" xmlns:cx7="http://schemas.microsoft.com/office/drawing/2016/5/13/chartex" xmlns:cx8="http://schemas.microsoft.com/office/drawing/2016/5/14/chartex" xmlns:mc="http://schemas.openxmlformats.org/markup-compatibility/2006" xmlns:aink="http://schemas.microsoft.com/office/drawing/2016/ink" xmlns:am3d="http://schemas.microsoft.com/office/drawing/2017/model3d" xmlns:o="urn:schemas-microsoft-com:office:office" xmlns:oel="http://schemas.microsoft.com/office/2019/extlst" xmlns:r="http://schemas.openxmlformats.org/officeDocument/2006/relationships" xmlns:m="http://schemas.openxmlformats.org/officeDocument/2006/math" xmlns:v="urn:schemas-microsoft-com:vml" xmlns:wp14="http://schemas.microsoft.com/office/word/2010/wordprocessingDrawing" xmlns:wp="http://schemas.openxmlformats.org/drawingml/2006/wordprocessingDrawing" xmlns:w10="urn:schemas-microsoft-com:office:word" xmlns:w="http://schemas.openxmlformats.org/wordprocessingml/2006/main" xmlns:w14="http://schemas.microsoft.com/office/word/2010/wordml" xmlns:w15="http://schemas.microsoft.com/office/word/2012/wordml" xmlns:w16cex="http://schemas.microsoft.com/office/word/2018/wordml/cex" xmlns:w16cid="http://schemas.microsoft.com/office/word/2016/wordml/cid" xmlns:w16="http://schemas.microsoft.com/office/word/2018/wordml" xmlns:w16du="http://schemas.microsoft.com/office/word/2023/wordml/word16du" xmlns:w16sdtdh="http://schemas.microsoft.com/office/word/2020/wordml/sdtdatahash" xmlns:w16sdtfl="http://schemas.microsoft.com/office/word/2024/wordml/sdtformatlock" xmlns:w16se="http://schemas.microsoft.com/office/word/2015/wordml/symex" xmlns:wpg="http://schemas.microsoft.com/office/word/2010/wordprocessingGroup" xmlns:wpi="http://schemas.microsoft.com/office/word/2010/wordprocessingInk" xmlns:wne="http://schemas.microsoft.com/office/word/2006/wordml" xmlns:wps="http://schemas.microsoft.com/office/word/2010/wordprocessingShape" mc:Ignorable="w14 w15 w16se w16cid w16 w16cex w16sdtdh w16sdtfl w16du wp14">
   <w:body>
+    <w:bookmarkStart w:id="0" w:name="_Toc442453119"/>
+    <w:bookmarkStart w:id="1" w:name="_Toc300077986"/>
     <w:p>
       <w:pPr>
         <w:tabs>
@@ -12,8 +14,6 @@
           <w:color w:val="0A0E20"/>
         </w:rPr>
       </w:pPr>
-      <w:bookmarkStart w:id="0" w:name="_Toc442453119"/>
-      <w:bookmarkStart w:id="1" w:name="_Toc300077986"/>
       <w:r>
         <w:rPr>
           <w:noProof/>
@@ -7871,24 +7871,61 @@
           <w:lang w:val="en-US"/>
         </w:rPr>
       </w:pPr>
-      <w:bookmarkStart w:id="51" w:name="BK_AD_Devices_Table"/>
+    </w:p>
+    <w:p>
+      <w:pPr>
+        <w:rPr>
+          <w:lang w:val="en-US"/>
+        </w:rPr>
+      </w:pPr>
+      <w:bookmarkStart w:id="51" w:name="BK_AD_Workstation_Summary_Table"/>
       <w:bookmarkEnd w:id="51"/>
     </w:p>
     <w:p>
       <w:pPr>
+        <w:rPr>
+          <w:lang w:val="en-US"/>
+        </w:rPr>
+      </w:pPr>
+    </w:p>
+    <w:p>
+      <w:pPr>
+        <w:rPr>
+          <w:lang w:val="en-US"/>
+        </w:rPr>
+      </w:pPr>
+    </w:p>
+    <w:p>
+      <w:pPr>
+        <w:rPr>
+          <w:lang w:val="en-US"/>
+        </w:rPr>
+      </w:pPr>
+      <w:bookmarkStart w:id="52" w:name="BK_AD_Server_Summary_Table"/>
+      <w:bookmarkEnd w:id="52"/>
+    </w:p>
+    <w:p>
+      <w:pPr>
+        <w:rPr>
+          <w:lang w:val="en-US"/>
+        </w:rPr>
+      </w:pPr>
+    </w:p>
+    <w:p>
+      <w:pPr>
         <w:pStyle w:val="Heading3"/>
         <w:rPr>
           <w:noProof/>
         </w:rPr>
       </w:pPr>
-      <w:bookmarkStart w:id="52" w:name="_Toc218508618"/>
+      <w:bookmarkStart w:id="53" w:name="_Toc218508618"/>
       <w:r>
         <w:rPr>
           <w:noProof/>
         </w:rPr>
         <w:t>Contacts</w:t>
       </w:r>
-      <w:bookmarkEnd w:id="52"/>
+      <w:bookmarkEnd w:id="53"/>
     </w:p>
     <w:p>
       <w:pPr>
@@ -7912,8 +7949,8 @@
           <w:lang w:val="en-US"/>
         </w:rPr>
       </w:pPr>
-      <w:bookmarkStart w:id="53" w:name="BK_AD_Contacts_Table"/>
-      <w:bookmarkEnd w:id="53"/>
+      <w:bookmarkStart w:id="54" w:name="BK_AD_Contacts_Table"/>
+      <w:bookmarkEnd w:id="54"/>
     </w:p>
     <w:p>
       <w:pPr>
@@ -7922,14 +7959,14 @@
           <w:noProof/>
         </w:rPr>
       </w:pPr>
-      <w:bookmarkStart w:id="54" w:name="_Toc218508619"/>
+      <w:bookmarkStart w:id="55" w:name="_Toc218508619"/>
       <w:r>
         <w:rPr>
           <w:noProof/>
         </w:rPr>
         <w:t>Printers</w:t>
       </w:r>
-      <w:bookmarkEnd w:id="54"/>
+      <w:bookmarkEnd w:id="55"/>
     </w:p>
     <w:p>
       <w:pPr>
@@ -7959,8 +7996,8 @@
           <w:lang w:val="en-US"/>
         </w:rPr>
       </w:pPr>
-      <w:bookmarkStart w:id="55" w:name="BK_AD_Printers_Table"/>
-      <w:bookmarkEnd w:id="55"/>
+      <w:bookmarkStart w:id="56" w:name="BK_AD_Printers_Table"/>
+      <w:bookmarkEnd w:id="56"/>
     </w:p>
     <w:p>
       <w:pPr>
@@ -7969,14 +8006,14 @@
           <w:noProof/>
         </w:rPr>
       </w:pPr>
-      <w:bookmarkStart w:id="56" w:name="_Toc218508620"/>
+      <w:bookmarkStart w:id="57" w:name="_Toc218508620"/>
       <w:r>
         <w:rPr>
           <w:noProof/>
         </w:rPr>
         <w:t>OU Structure</w:t>
       </w:r>
-      <w:bookmarkEnd w:id="56"/>
+      <w:bookmarkEnd w:id="57"/>
     </w:p>
     <w:p>
       <w:pPr>
@@ -8039,24 +8076,24 @@
           <w:lang w:val="en-US"/>
         </w:rPr>
       </w:pPr>
-      <w:bookmarkStart w:id="57" w:name="BK_AD_OU_Summary_Table"/>
-      <w:bookmarkEnd w:id="57"/>
-    </w:p>
-    <w:p>
-      <w:pPr>
-        <w:rPr>
-          <w:lang w:val="en-US"/>
-        </w:rPr>
-      </w:pPr>
-    </w:p>
-    <w:p>
-      <w:pPr>
-        <w:rPr>
-          <w:lang w:val="en-US"/>
-        </w:rPr>
-      </w:pPr>
-      <w:bookmarkStart w:id="58" w:name="BK_AD_OU_Depth_Table"/>
+      <w:bookmarkStart w:id="58" w:name="BK_AD_OU_Summary_Table"/>
       <w:bookmarkEnd w:id="58"/>
+    </w:p>
+    <w:p>
+      <w:pPr>
+        <w:rPr>
+          <w:lang w:val="en-US"/>
+        </w:rPr>
+      </w:pPr>
+    </w:p>
+    <w:p>
+      <w:pPr>
+        <w:rPr>
+          <w:lang w:val="en-US"/>
+        </w:rPr>
+      </w:pPr>
+      <w:bookmarkStart w:id="59" w:name="BK_AD_OU_Depth_Table"/>
+      <w:bookmarkEnd w:id="59"/>
     </w:p>
     <w:p>
       <w:pPr>
@@ -8071,7 +8108,7 @@
           <w:lang w:val="en-US"/>
         </w:rPr>
       </w:pPr>
-      <w:bookmarkStart w:id="59" w:name="_Toc218508622"/>
+      <w:bookmarkStart w:id="60" w:name="_Toc218508622"/>
       <w:r>
         <w:rPr>
           <w:rStyle w:val="Heading2Char"/>
@@ -8097,126 +8134,126 @@
           <w:lang w:val="en-US"/>
         </w:rPr>
       </w:pPr>
-      <w:bookmarkStart w:id="60" w:name="BK_Service_Accounts_Table"/>
+      <w:bookmarkStart w:id="61" w:name="BK_Service_Accounts_Table"/>
+      <w:bookmarkEnd w:id="61"/>
+    </w:p>
+    <w:p>
+      <w:pPr>
+        <w:rPr>
+          <w:lang w:val="en-US"/>
+        </w:rPr>
+      </w:pPr>
+    </w:p>
+    <w:p>
+      <w:pPr>
+        <w:pStyle w:val="Heading3"/>
+        <w:rPr>
+          <w:lang w:val="en-US"/>
+        </w:rPr>
+      </w:pPr>
+      <w:r>
+        <w:rPr>
+          <w:lang w:val="en-US"/>
+        </w:rPr>
+        <w:t>SPNs</w:t>
+      </w:r>
+    </w:p>
+    <w:p>
+      <w:pPr>
+        <w:rPr>
+          <w:lang w:val="en-US"/>
+        </w:rPr>
+      </w:pPr>
+    </w:p>
+    <w:p>
+      <w:pPr>
+        <w:rPr>
+          <w:lang w:val="en-US"/>
+        </w:rPr>
+      </w:pPr>
+      <w:bookmarkStart w:id="62" w:name="BK_AD_SPNs_Table"/>
+      <w:bookmarkEnd w:id="62"/>
+    </w:p>
+    <w:p>
+      <w:pPr>
+        <w:rPr>
+          <w:lang w:val="en-US"/>
+        </w:rPr>
+      </w:pPr>
+    </w:p>
+    <w:p>
+      <w:pPr>
+        <w:pStyle w:val="Heading3"/>
+        <w:rPr>
+          <w:lang w:val="en-US"/>
+        </w:rPr>
+      </w:pPr>
+      <w:r>
+        <w:t>Privileged Accounts</w:t>
+      </w:r>
+    </w:p>
+    <w:p>
+      <w:pPr>
+        <w:rPr>
+          <w:lang w:val="en-US"/>
+        </w:rPr>
+      </w:pPr>
+    </w:p>
+    <w:p>
+      <w:pPr>
+        <w:rPr>
+          <w:lang w:val="en-US"/>
+        </w:rPr>
+      </w:pPr>
+      <w:bookmarkStart w:id="63" w:name="BK_Privileged_Accounts_Table"/>
+      <w:bookmarkEnd w:id="63"/>
+    </w:p>
+    <w:p>
+      <w:pPr>
+        <w:pStyle w:val="Heading2"/>
+        <w:rPr>
+          <w:rStyle w:val="Heading2Char"/>
+          <w:lang w:val="en-US"/>
+        </w:rPr>
+      </w:pPr>
+      <w:r>
+        <w:rPr>
+          <w:rStyle w:val="Heading2Char"/>
+          <w:lang w:val="en-US"/>
+        </w:rPr>
+        <w:t>AD Schema</w:t>
+      </w:r>
+    </w:p>
+    <w:p>
+      <w:bookmarkStart w:id="64" w:name="BK_AD_Schema_Table"/>
+      <w:bookmarkEnd w:id="64"/>
+    </w:p>
+    <w:p>
+      <w:pPr>
+        <w:pStyle w:val="Heading2"/>
+        <w:rPr>
+          <w:rStyle w:val="Heading2Char"/>
+        </w:rPr>
+      </w:pPr>
+      <w:r>
+        <w:rPr>
+          <w:rStyle w:val="Heading2Char"/>
+        </w:rPr>
+        <w:t xml:space="preserve">AD to </w:t>
+      </w:r>
+      <w:r>
+        <w:rPr>
+          <w:rStyle w:val="Heading2Char"/>
+        </w:rPr>
+        <w:t>Entra</w:t>
+      </w:r>
+      <w:r>
+        <w:rPr>
+          <w:rStyle w:val="Heading2Char"/>
+        </w:rPr>
+        <w:t xml:space="preserve"> Sync and Considerations</w:t>
+      </w:r>
       <w:bookmarkEnd w:id="60"/>
-    </w:p>
-    <w:p>
-      <w:pPr>
-        <w:rPr>
-          <w:lang w:val="en-US"/>
-        </w:rPr>
-      </w:pPr>
-    </w:p>
-    <w:p>
-      <w:pPr>
-        <w:pStyle w:val="Heading3"/>
-        <w:rPr>
-          <w:lang w:val="en-US"/>
-        </w:rPr>
-      </w:pPr>
-      <w:r>
-        <w:rPr>
-          <w:lang w:val="en-US"/>
-        </w:rPr>
-        <w:t>SPNs</w:t>
-      </w:r>
-    </w:p>
-    <w:p>
-      <w:pPr>
-        <w:rPr>
-          <w:lang w:val="en-US"/>
-        </w:rPr>
-      </w:pPr>
-    </w:p>
-    <w:p>
-      <w:pPr>
-        <w:rPr>
-          <w:lang w:val="en-US"/>
-        </w:rPr>
-      </w:pPr>
-      <w:bookmarkStart w:id="61" w:name="BK_AD_SPNs_Table"/>
-      <w:bookmarkEnd w:id="61"/>
-    </w:p>
-    <w:p>
-      <w:pPr>
-        <w:rPr>
-          <w:lang w:val="en-US"/>
-        </w:rPr>
-      </w:pPr>
-    </w:p>
-    <w:p>
-      <w:pPr>
-        <w:pStyle w:val="Heading3"/>
-        <w:rPr>
-          <w:lang w:val="en-US"/>
-        </w:rPr>
-      </w:pPr>
-      <w:r>
-        <w:t>Privileged Accounts</w:t>
-      </w:r>
-    </w:p>
-    <w:p>
-      <w:pPr>
-        <w:rPr>
-          <w:lang w:val="en-US"/>
-        </w:rPr>
-      </w:pPr>
-    </w:p>
-    <w:p>
-      <w:pPr>
-        <w:rPr>
-          <w:lang w:val="en-US"/>
-        </w:rPr>
-      </w:pPr>
-      <w:bookmarkStart w:id="62" w:name="BK_Privileged_Accounts_Table"/>
-      <w:bookmarkEnd w:id="62"/>
-    </w:p>
-    <w:p>
-      <w:pPr>
-        <w:pStyle w:val="Heading2"/>
-        <w:rPr>
-          <w:rStyle w:val="Heading2Char"/>
-          <w:lang w:val="en-US"/>
-        </w:rPr>
-      </w:pPr>
-      <w:r>
-        <w:rPr>
-          <w:rStyle w:val="Heading2Char"/>
-          <w:lang w:val="en-US"/>
-        </w:rPr>
-        <w:t>AD Schema</w:t>
-      </w:r>
-    </w:p>
-    <w:p>
-      <w:bookmarkStart w:id="63" w:name="BK_AD_Schema_Table"/>
-      <w:bookmarkEnd w:id="63"/>
-    </w:p>
-    <w:p>
-      <w:pPr>
-        <w:pStyle w:val="Heading2"/>
-        <w:rPr>
-          <w:rStyle w:val="Heading2Char"/>
-        </w:rPr>
-      </w:pPr>
-      <w:r>
-        <w:rPr>
-          <w:rStyle w:val="Heading2Char"/>
-        </w:rPr>
-        <w:t xml:space="preserve">AD to </w:t>
-      </w:r>
-      <w:r>
-        <w:rPr>
-          <w:rStyle w:val="Heading2Char"/>
-        </w:rPr>
-        <w:t>Entra</w:t>
-      </w:r>
-      <w:r>
-        <w:rPr>
-          <w:rStyle w:val="Heading2Char"/>
-        </w:rPr>
-        <w:t xml:space="preserve"> Sync and Considerations</w:t>
-      </w:r>
-      <w:bookmarkEnd w:id="59"/>
     </w:p>
     <w:p>
       <w:r>
@@ -8253,7 +8290,7 @@
           <w:rFonts w:eastAsiaTheme="minorEastAsia"/>
         </w:rPr>
       </w:pPr>
-      <w:bookmarkStart w:id="64" w:name="_Toc218508623"/>
+      <w:bookmarkStart w:id="65" w:name="_Toc218508623"/>
       <w:r>
         <w:rPr>
           <w:rStyle w:val="Heading1Char"/>
@@ -8266,7 +8303,7 @@
         </w:rPr>
         <w:t xml:space="preserve"> AD Assessment</w:t>
       </w:r>
-      <w:bookmarkEnd w:id="64"/>
+      <w:bookmarkEnd w:id="65"/>
     </w:p>
     <w:p>
       <w:pPr>
@@ -8276,7 +8313,7 @@
           <w:lang w:val="en-US"/>
         </w:rPr>
       </w:pPr>
-      <w:bookmarkStart w:id="65" w:name="_Toc218508624"/>
+      <w:bookmarkStart w:id="66" w:name="_Toc218508624"/>
       <w:r>
         <w:rPr>
           <w:noProof/>
@@ -8289,16 +8326,16 @@
         </w:rPr>
         <w:t xml:space="preserve"> User Accounts</w:t>
       </w:r>
-      <w:bookmarkEnd w:id="65"/>
-    </w:p>
-    <w:p>
-      <w:pPr>
-        <w:rPr>
-          <w:lang w:val="en-US"/>
-        </w:rPr>
-      </w:pPr>
-      <w:bookmarkStart w:id="66" w:name="BK_Entra_Users_Table"/>
       <w:bookmarkEnd w:id="66"/>
+    </w:p>
+    <w:p>
+      <w:pPr>
+        <w:rPr>
+          <w:lang w:val="en-US"/>
+        </w:rPr>
+      </w:pPr>
+      <w:bookmarkStart w:id="67" w:name="BK_Entra_Users_Table"/>
+      <w:bookmarkEnd w:id="67"/>
     </w:p>
     <w:p>
       <w:pPr>
@@ -8345,6 +8382,7 @@
         <w:rPr>
           <w:rFonts w:cs="Arial"/>
         </w:rPr>
+        <w:lastRenderedPageBreak/>
         <w:t>These user accounts should be reviewed for migration scope.  Chances are a number of these are tied to Stale Accounts.  Stale IDs should be removed to lower the migration scope where possible.</w:t>
       </w:r>
     </w:p>
@@ -8386,13 +8424,12 @@
           <w:noProof/>
         </w:rPr>
       </w:pPr>
-      <w:bookmarkStart w:id="67" w:name="_Toc218508625"/>
+      <w:bookmarkStart w:id="68" w:name="_Toc218508625"/>
       <w:r>
         <w:rPr>
           <w:noProof/>
           <w:lang w:val="en-US"/>
         </w:rPr>
-        <w:lastRenderedPageBreak/>
         <w:t>Entra</w:t>
       </w:r>
       <w:r>
@@ -8401,7 +8438,7 @@
         </w:rPr>
         <w:t xml:space="preserve"> Guest Accounts</w:t>
       </w:r>
-      <w:bookmarkEnd w:id="67"/>
+      <w:bookmarkEnd w:id="68"/>
     </w:p>
     <w:p>
       <w:pPr>
@@ -8453,8 +8490,8 @@
           <w:lang w:val="en-US"/>
         </w:rPr>
       </w:pPr>
-      <w:bookmarkStart w:id="68" w:name="BK_Entra_Guest_Accounts_Table"/>
-      <w:bookmarkEnd w:id="68"/>
+      <w:bookmarkStart w:id="69" w:name="BK_Entra_Guest_Accounts_Table"/>
+      <w:bookmarkEnd w:id="69"/>
     </w:p>
     <w:p>
       <w:pPr>
@@ -8549,14 +8586,14 @@
         </w:rPr>
         <w:t xml:space="preserve"> migrated or recreated </w:t>
       </w:r>
-      <w:bookmarkStart w:id="69" w:name="_Int_EY87SdSf"/>
+      <w:bookmarkStart w:id="70" w:name="_Int_EY87SdSf"/>
       <w:r>
         <w:rPr>
           <w:rFonts w:cs="Arial"/>
         </w:rPr>
         <w:t>in</w:t>
       </w:r>
-      <w:bookmarkEnd w:id="69"/>
+      <w:bookmarkEnd w:id="70"/>
       <w:r>
         <w:rPr>
           <w:rFonts w:cs="Arial"/>
@@ -8583,7 +8620,7 @@
           <w:noProof/>
         </w:rPr>
       </w:pPr>
-      <w:bookmarkStart w:id="70" w:name="_Toc218508626"/>
+      <w:bookmarkStart w:id="71" w:name="_Toc218508626"/>
       <w:r>
         <w:rPr>
           <w:noProof/>
@@ -8597,7 +8634,7 @@
         </w:rPr>
         <w:t xml:space="preserve"> Devices</w:t>
       </w:r>
-      <w:bookmarkEnd w:id="70"/>
+      <w:bookmarkEnd w:id="71"/>
     </w:p>
     <w:p>
       <w:pPr>
@@ -8752,8 +8789,8 @@
           <w:rFonts w:cs="Arial"/>
         </w:rPr>
       </w:pPr>
-      <w:bookmarkStart w:id="71" w:name="BK_Entra_Devices_Table"/>
-      <w:bookmarkEnd w:id="71"/>
+      <w:bookmarkStart w:id="72" w:name="BK_Entra_Devices_Table"/>
+      <w:bookmarkEnd w:id="72"/>
       <w:r>
         <w:rPr>
           <w:rFonts w:cs="Arial"/>
@@ -8778,7 +8815,7 @@
           <w:szCs w:val="36"/>
         </w:rPr>
       </w:pPr>
-      <w:bookmarkStart w:id="72" w:name="_Toc218508627"/>
+      <w:bookmarkStart w:id="73" w:name="_Toc218508627"/>
       <w:r>
         <w:rPr>
           <w:noProof/>
@@ -8786,7 +8823,7 @@
         </w:rPr>
         <w:t>Exchange – On prem Assessment</w:t>
       </w:r>
-      <w:bookmarkEnd w:id="72"/>
+      <w:bookmarkEnd w:id="73"/>
     </w:p>
     <w:p>
       <w:r>
@@ -8802,7 +8839,7 @@
           <w:szCs w:val="36"/>
         </w:rPr>
       </w:pPr>
-      <w:bookmarkStart w:id="73" w:name="_Toc218508628"/>
+      <w:bookmarkStart w:id="74" w:name="_Toc218508628"/>
       <w:r>
         <w:rPr>
           <w:noProof/>
@@ -8810,7 +8847,7 @@
         </w:rPr>
         <w:t>Exchange – Online Assessment</w:t>
       </w:r>
-      <w:bookmarkEnd w:id="73"/>
+      <w:bookmarkEnd w:id="74"/>
     </w:p>
     <w:p>
       <w:pPr>
@@ -8820,7 +8857,7 @@
           <w:lang w:val="en-US"/>
         </w:rPr>
       </w:pPr>
-      <w:bookmarkStart w:id="74" w:name="_Toc218508629"/>
+      <w:bookmarkStart w:id="75" w:name="_Toc218508629"/>
       <w:r>
         <w:rPr>
           <w:noProof/>
@@ -8841,7 +8878,7 @@
         </w:rPr>
         <w:t>Summary</w:t>
       </w:r>
-      <w:bookmarkEnd w:id="74"/>
+      <w:bookmarkEnd w:id="75"/>
     </w:p>
     <w:p>
       <w:pPr>
@@ -8933,8 +8970,8 @@
           <w:rFonts w:cs="Arial"/>
         </w:rPr>
       </w:pPr>
-      <w:bookmarkStart w:id="75" w:name="BK_EXO_Mailboxes_Table"/>
-      <w:bookmarkEnd w:id="75"/>
+      <w:bookmarkStart w:id="76" w:name="BK_EXO_Mailboxes_Table"/>
+      <w:bookmarkEnd w:id="76"/>
       <w:r>
         <w:rPr>
           <w:rFonts w:cs="Arial"/>
@@ -8965,6 +9002,7 @@
           <w:b/>
           <w:bCs/>
         </w:rPr>
+        <w:lastRenderedPageBreak/>
         <w:t>Recommendations</w:t>
       </w:r>
       <w:r>
@@ -9048,12 +9086,11 @@
           <w:noProof/>
         </w:rPr>
       </w:pPr>
-      <w:bookmarkStart w:id="76" w:name="_Toc218508630"/>
+      <w:bookmarkStart w:id="77" w:name="_Toc218508630"/>
       <w:r>
         <w:rPr>
           <w:noProof/>
         </w:rPr>
-        <w:lastRenderedPageBreak/>
         <w:t xml:space="preserve">Mailboxes </w:t>
       </w:r>
       <w:r>
@@ -9092,7 +9129,7 @@
         </w:rPr>
         <w:t>old</w:t>
       </w:r>
-      <w:bookmarkEnd w:id="76"/>
+      <w:bookmarkEnd w:id="77"/>
     </w:p>
     <w:p>
       <w:pPr>
@@ -9144,8 +9181,8 @@
           <w:lang w:val="en-US"/>
         </w:rPr>
       </w:pPr>
-      <w:bookmarkStart w:id="77" w:name="BK_EXO_Lithold_Mailboxes_Table"/>
-      <w:bookmarkEnd w:id="77"/>
+      <w:bookmarkStart w:id="78" w:name="BK_EXO_Lithold_Mailboxes_Table"/>
+      <w:bookmarkEnd w:id="78"/>
     </w:p>
     <w:p>
       <w:pPr>
@@ -9208,7 +9245,7 @@
           <w:lang w:val="fr-FR"/>
         </w:rPr>
       </w:pPr>
-      <w:bookmarkStart w:id="78" w:name="_Toc218508631"/>
+      <w:bookmarkStart w:id="79" w:name="_Toc218508631"/>
       <w:r>
         <w:rPr>
           <w:noProof/>
@@ -9216,7 +9253,7 @@
         </w:rPr>
         <w:t>Mailbox quotas</w:t>
       </w:r>
-      <w:bookmarkEnd w:id="78"/>
+      <w:bookmarkEnd w:id="79"/>
     </w:p>
     <w:p>
       <w:pPr>
@@ -9252,8 +9289,8 @@
           <w:lang w:val="en-US"/>
         </w:rPr>
       </w:pPr>
-      <w:bookmarkStart w:id="79" w:name="BK_EXO_Mailbox_Quotas_Table"/>
-      <w:bookmarkEnd w:id="79"/>
+      <w:bookmarkStart w:id="80" w:name="BK_EXO_Mailbox_Quotas_Table"/>
+      <w:bookmarkEnd w:id="80"/>
     </w:p>
     <w:p>
       <w:pPr>
@@ -9279,7 +9316,7 @@
           <w:lang w:val="fr-FR"/>
         </w:rPr>
       </w:pPr>
-      <w:bookmarkStart w:id="80" w:name="_Toc218508632"/>
+      <w:bookmarkStart w:id="81" w:name="_Toc218508632"/>
       <w:r>
         <w:rPr>
           <w:noProof/>
@@ -9287,7 +9324,7 @@
         </w:rPr>
         <w:t>Distribution lists</w:t>
       </w:r>
-      <w:bookmarkEnd w:id="80"/>
+      <w:bookmarkEnd w:id="81"/>
     </w:p>
     <w:p>
       <w:pPr>
@@ -9330,8 +9367,8 @@
           <w:rFonts w:cs="Arial"/>
         </w:rPr>
       </w:pPr>
-      <w:bookmarkStart w:id="81" w:name="BK_EXO_DLs_Table"/>
-      <w:bookmarkEnd w:id="81"/>
+      <w:bookmarkStart w:id="82" w:name="BK_EXO_DLs_Table"/>
+      <w:bookmarkEnd w:id="82"/>
       <w:r>
         <w:rPr>
           <w:rFonts w:cs="Arial"/>
@@ -9425,14 +9462,14 @@
           <w:noProof/>
         </w:rPr>
       </w:pPr>
-      <w:bookmarkStart w:id="82" w:name="_Toc218508633"/>
+      <w:bookmarkStart w:id="83" w:name="_Toc218508633"/>
       <w:r>
         <w:rPr>
           <w:noProof/>
         </w:rPr>
         <w:t>Dynamic Distribution lists</w:t>
       </w:r>
-      <w:bookmarkEnd w:id="82"/>
+      <w:bookmarkEnd w:id="83"/>
     </w:p>
     <w:p>
       <w:pPr>
@@ -9480,8 +9517,8 @@
           <w:lang w:val="en-US"/>
         </w:rPr>
       </w:pPr>
-      <w:bookmarkStart w:id="83" w:name="BK_EXO_Dynamic_DLs_Table"/>
-      <w:bookmarkEnd w:id="83"/>
+      <w:bookmarkStart w:id="84" w:name="BK_EXO_Dynamic_DLs_Table"/>
+      <w:bookmarkEnd w:id="84"/>
     </w:p>
     <w:p>
       <w:pPr>
@@ -9490,14 +9527,15 @@
           <w:noProof/>
         </w:rPr>
       </w:pPr>
-      <w:bookmarkStart w:id="84" w:name="_Toc218508634"/>
+      <w:bookmarkStart w:id="85" w:name="_Toc218508634"/>
       <w:r>
         <w:rPr>
           <w:noProof/>
         </w:rPr>
+        <w:lastRenderedPageBreak/>
         <w:t>Public Folders</w:t>
       </w:r>
-      <w:bookmarkEnd w:id="84"/>
+      <w:bookmarkEnd w:id="85"/>
     </w:p>
     <w:p>
       <w:r>
@@ -9514,14 +9552,14 @@
           <w:noProof/>
         </w:rPr>
       </w:pPr>
-      <w:bookmarkStart w:id="85" w:name="_Toc218508635"/>
+      <w:bookmarkStart w:id="86" w:name="_Toc218508635"/>
       <w:r>
         <w:rPr>
           <w:noProof/>
         </w:rPr>
         <w:t>Retention Policies</w:t>
       </w:r>
-      <w:bookmarkEnd w:id="85"/>
+      <w:bookmarkEnd w:id="86"/>
     </w:p>
     <w:p>
       <w:pPr>
@@ -9556,7 +9594,6 @@
           <w:b/>
           <w:bCs/>
         </w:rPr>
-        <w:lastRenderedPageBreak/>
         <w:t xml:space="preserve">Findings: </w:t>
       </w:r>
       <w:r>
@@ -9585,8 +9622,8 @@
           <w:lang w:val="en-US"/>
         </w:rPr>
       </w:pPr>
-      <w:bookmarkStart w:id="86" w:name="BK_EXO_Retention_Policies_Table"/>
-      <w:bookmarkEnd w:id="86"/>
+      <w:bookmarkStart w:id="87" w:name="BK_EXO_Retention_Policies_Table"/>
+      <w:bookmarkEnd w:id="87"/>
     </w:p>
     <w:p>
       <w:pPr>
@@ -9697,14 +9734,14 @@
           <w:noProof/>
         </w:rPr>
       </w:pPr>
-      <w:bookmarkStart w:id="87" w:name="_Toc218508636"/>
+      <w:bookmarkStart w:id="88" w:name="_Toc218508636"/>
       <w:r>
         <w:rPr>
           <w:noProof/>
         </w:rPr>
         <w:t>Email Sanitization</w:t>
       </w:r>
-      <w:bookmarkEnd w:id="87"/>
+      <w:bookmarkEnd w:id="88"/>
     </w:p>
     <w:p>
       <w:pPr>
@@ -9823,7 +9860,7 @@
           <w:szCs w:val="36"/>
         </w:rPr>
       </w:pPr>
-      <w:bookmarkStart w:id="88" w:name="_Toc218508637"/>
+      <w:bookmarkStart w:id="89" w:name="_Toc218508637"/>
       <w:r>
         <w:rPr>
           <w:noProof/>
@@ -9831,7 +9868,7 @@
         </w:rPr>
         <w:t>OneDrive Assessment</w:t>
       </w:r>
-      <w:bookmarkEnd w:id="88"/>
+      <w:bookmarkEnd w:id="89"/>
     </w:p>
     <w:p>
       <w:pPr>
@@ -9841,7 +9878,7 @@
           <w:lang w:val="en-US"/>
         </w:rPr>
       </w:pPr>
-      <w:bookmarkStart w:id="89" w:name="_Toc218508638"/>
+      <w:bookmarkStart w:id="90" w:name="_Toc218508638"/>
       <w:r>
         <w:rPr>
           <w:noProof/>
@@ -9855,7 +9892,7 @@
         </w:rPr>
         <w:t>ummary</w:t>
       </w:r>
-      <w:bookmarkEnd w:id="89"/>
+      <w:bookmarkEnd w:id="90"/>
     </w:p>
     <w:p>
       <w:pPr>
@@ -9919,8 +9956,8 @@
           <w:lang w:val="en-US"/>
         </w:rPr>
       </w:pPr>
-      <w:bookmarkStart w:id="90" w:name="BK_ODfB_Sizes_Table"/>
-      <w:bookmarkEnd w:id="90"/>
+      <w:bookmarkStart w:id="91" w:name="BK_ODfB_Sizes_Table"/>
+      <w:bookmarkEnd w:id="91"/>
     </w:p>
     <w:p>
       <w:pPr>
@@ -9986,8 +10023,8 @@
           <w:rFonts w:cs="Arial"/>
         </w:rPr>
       </w:pPr>
-      <w:bookmarkStart w:id="91" w:name="BK_ODfB_Quotas_Table"/>
-      <w:bookmarkEnd w:id="91"/>
+      <w:bookmarkStart w:id="92" w:name="BK_ODfB_Quotas_Table"/>
+      <w:bookmarkEnd w:id="92"/>
       <w:r>
         <w:rPr>
           <w:rFonts w:cs="Arial"/>
@@ -10062,7 +10099,7 @@
           <w:noProof/>
         </w:rPr>
       </w:pPr>
-      <w:bookmarkStart w:id="92" w:name="_Toc218508639"/>
+      <w:bookmarkStart w:id="93" w:name="_Toc218508639"/>
       <w:r>
         <w:rPr>
           <w:rStyle w:val="Heading1Char"/>
@@ -10070,7 +10107,7 @@
         </w:rPr>
         <w:t>Teams Assessment</w:t>
       </w:r>
-      <w:bookmarkEnd w:id="92"/>
+      <w:bookmarkEnd w:id="93"/>
     </w:p>
     <w:p>
       <w:pPr>
@@ -10079,7 +10116,7 @@
           <w:noProof/>
         </w:rPr>
       </w:pPr>
-      <w:bookmarkStart w:id="93" w:name="_Toc218508640"/>
+      <w:bookmarkStart w:id="94" w:name="_Toc218508640"/>
       <w:r>
         <w:rPr>
           <w:noProof/>
@@ -10099,27 +10136,28 @@
         </w:rPr>
         <w:t xml:space="preserve"> Summary</w:t>
       </w:r>
-      <w:bookmarkEnd w:id="93"/>
-    </w:p>
-    <w:p>
-      <w:bookmarkStart w:id="94" w:name="BK_Teams_Summary_Table"/>
       <w:bookmarkEnd w:id="94"/>
     </w:p>
     <w:p>
+      <w:bookmarkStart w:id="95" w:name="BK_Teams_Summary_Table"/>
+      <w:bookmarkEnd w:id="95"/>
+    </w:p>
+    <w:p>
       <w:pPr>
         <w:pStyle w:val="Heading2"/>
         <w:rPr>
           <w:noProof/>
         </w:rPr>
       </w:pPr>
-      <w:bookmarkStart w:id="95" w:name="_Toc218508641"/>
+      <w:bookmarkStart w:id="96" w:name="_Toc218508641"/>
       <w:r>
         <w:rPr>
           <w:noProof/>
         </w:rPr>
+        <w:lastRenderedPageBreak/>
         <w:t>Office 365 groups</w:t>
       </w:r>
-      <w:bookmarkEnd w:id="95"/>
+      <w:bookmarkEnd w:id="96"/>
     </w:p>
     <w:p>
       <w:pPr>
@@ -10163,8 +10201,8 @@
           <w:rFonts w:cs="Arial"/>
         </w:rPr>
       </w:pPr>
-      <w:bookmarkStart w:id="96" w:name="BK_Entra_M365_Groups_Table"/>
-      <w:bookmarkEnd w:id="96"/>
+      <w:bookmarkStart w:id="97" w:name="BK_Entra_M365_Groups_Table"/>
+      <w:bookmarkEnd w:id="97"/>
       <w:r>
         <w:rPr>
           <w:rFonts w:cs="Arial"/>
@@ -10232,14 +10270,7 @@
         <w:rPr>
           <w:rFonts w:cs="Arial"/>
         </w:rPr>
-        <w:t xml:space="preserve">Migration tool.  Note that if done in the migration tool there is no </w:t>
-      </w:r>
-      <w:r>
-        <w:rPr>
-          <w:rFonts w:cs="Arial"/>
-        </w:rPr>
-        <w:lastRenderedPageBreak/>
-        <w:t>synchronization of membership removal over time.  If membership adds and removals are required, then there is a synchronization tool in the toolset for that purpose (part of the ODM AD tool set).</w:t>
+        <w:t>Migration tool.  Note that if done in the migration tool there is no synchronization of membership removal over time.  If membership adds and removals are required, then there is a synchronization tool in the toolset for that purpose (part of the ODM AD tool set).</w:t>
       </w:r>
     </w:p>
     <w:p>
@@ -10250,7 +10281,7 @@
           <w:noProof/>
         </w:rPr>
       </w:pPr>
-      <w:bookmarkStart w:id="97" w:name="_Toc218508642"/>
+      <w:bookmarkStart w:id="98" w:name="_Toc218508642"/>
       <w:r>
         <w:rPr>
           <w:rStyle w:val="Heading1Char"/>
@@ -10258,7 +10289,7 @@
         </w:rPr>
         <w:t>SharePoint Online Assessment</w:t>
       </w:r>
-      <w:bookmarkEnd w:id="97"/>
+      <w:bookmarkEnd w:id="98"/>
     </w:p>
     <w:p>
       <w:pPr>
@@ -10268,7 +10299,7 @@
           <w:lang w:val="en-US"/>
         </w:rPr>
       </w:pPr>
-      <w:bookmarkStart w:id="98" w:name="_Toc218508643"/>
+      <w:bookmarkStart w:id="99" w:name="_Toc218508643"/>
       <w:r>
         <w:rPr>
           <w:noProof/>
@@ -10282,7 +10313,7 @@
         </w:rPr>
         <w:t>ummary</w:t>
       </w:r>
-      <w:bookmarkEnd w:id="98"/>
+      <w:bookmarkEnd w:id="99"/>
     </w:p>
     <w:p>
       <w:pPr>
@@ -10331,8 +10362,8 @@
           <w:lang w:val="en-US"/>
         </w:rPr>
       </w:pPr>
-      <w:bookmarkStart w:id="99" w:name="BK_SPO_Summary_Table"/>
-      <w:bookmarkEnd w:id="99"/>
+      <w:bookmarkStart w:id="100" w:name="BK_SPO_Summary_Table"/>
+      <w:bookmarkEnd w:id="100"/>
     </w:p>
     <w:p>
       <w:pPr>
@@ -10464,14 +10495,14 @@
           <w:noProof/>
         </w:rPr>
       </w:pPr>
-      <w:bookmarkStart w:id="100" w:name="_Toc218508644"/>
+      <w:bookmarkStart w:id="101" w:name="_Toc218508644"/>
       <w:r>
         <w:rPr>
           <w:noProof/>
         </w:rPr>
         <w:t>SharePoint Global Configurations</w:t>
       </w:r>
-      <w:bookmarkEnd w:id="100"/>
+      <w:bookmarkEnd w:id="101"/>
     </w:p>
     <w:p>
       <w:pPr>
@@ -10517,8 +10548,8 @@
           <w:lang w:val="en-US"/>
         </w:rPr>
       </w:pPr>
-      <w:bookmarkStart w:id="101" w:name="BK_SPO_Config_Table"/>
-      <w:bookmarkEnd w:id="101"/>
+      <w:bookmarkStart w:id="102" w:name="BK_SPO_Config_Table"/>
+      <w:bookmarkEnd w:id="102"/>
     </w:p>
     <w:p>
       <w:pPr>
@@ -10628,7 +10659,7 @@
           <w:szCs w:val="36"/>
         </w:rPr>
       </w:pPr>
-      <w:bookmarkStart w:id="102" w:name="_Toc218508645"/>
+      <w:bookmarkStart w:id="103" w:name="_Toc218508645"/>
       <w:r>
         <w:rPr>
           <w:rStyle w:val="Heading1Char"/>
@@ -10636,18 +10667,18 @@
         </w:rPr>
         <w:t>Infrastructure Assessment</w:t>
       </w:r>
-      <w:bookmarkEnd w:id="102"/>
+      <w:bookmarkEnd w:id="103"/>
     </w:p>
     <w:p>
       <w:pPr>
         <w:pStyle w:val="Heading2"/>
       </w:pPr>
-      <w:bookmarkStart w:id="103" w:name="_Toc218508599"/>
-      <w:bookmarkStart w:id="104" w:name="_Toc218508646"/>
+      <w:bookmarkStart w:id="104" w:name="_Toc218508599"/>
+      <w:bookmarkStart w:id="105" w:name="_Toc218508646"/>
       <w:r>
         <w:t>Change Control</w:t>
       </w:r>
-      <w:bookmarkEnd w:id="103"/>
+      <w:bookmarkEnd w:id="104"/>
     </w:p>
     <w:p>
       <w:pPr>
@@ -10676,28 +10707,28 @@
         </w:rPr>
         <w:t xml:space="preserve"> Control is a process used to ensure that changes to a system are introduced in a controlled and coordinated manner.  </w:t>
       </w:r>
-      <w:bookmarkStart w:id="105" w:name="_Int_SD01zgNE"/>
+      <w:bookmarkStart w:id="106" w:name="_Int_SD01zgNE"/>
       <w:r>
         <w:rPr>
           <w:rFonts w:cs="Arial"/>
         </w:rPr>
         <w:t>IT</w:t>
       </w:r>
-      <w:bookmarkEnd w:id="105"/>
+      <w:bookmarkEnd w:id="106"/>
       <w:r>
         <w:rPr>
           <w:rFonts w:cs="Arial"/>
         </w:rPr>
         <w:t xml:space="preserve"> reduced the possibility that unnecessary changes would be introduced without </w:t>
       </w:r>
-      <w:bookmarkStart w:id="106" w:name="_Int_XPDXrifH"/>
+      <w:bookmarkStart w:id="107" w:name="_Int_XPDXrifH"/>
       <w:r>
         <w:rPr>
           <w:rFonts w:cs="Arial"/>
         </w:rPr>
         <w:t>forethought</w:t>
       </w:r>
-      <w:bookmarkEnd w:id="106"/>
+      <w:bookmarkEnd w:id="107"/>
       <w:r>
         <w:rPr>
           <w:rFonts w:cs="Arial"/>
@@ -10717,6 +10748,7 @@
           <w:rFonts w:cs="Arial"/>
           <w:b/>
         </w:rPr>
+        <w:lastRenderedPageBreak/>
         <w:t>Findings</w:t>
       </w:r>
       <w:r>
@@ -10771,11 +10803,11 @@
       <w:pPr>
         <w:pStyle w:val="Heading2"/>
       </w:pPr>
-      <w:bookmarkStart w:id="107" w:name="_Toc218508600"/>
+      <w:bookmarkStart w:id="108" w:name="_Toc218508600"/>
       <w:r>
         <w:t>Blackout Periods</w:t>
       </w:r>
-      <w:bookmarkEnd w:id="107"/>
+      <w:bookmarkEnd w:id="108"/>
     </w:p>
     <w:p>
       <w:pPr>
@@ -10816,7 +10848,6 @@
           <w:b/>
           <w:bCs/>
         </w:rPr>
-        <w:lastRenderedPageBreak/>
         <w:t>Findings</w:t>
       </w:r>
       <w:r>
@@ -10866,11 +10897,11 @@
       <w:pPr>
         <w:pStyle w:val="Heading2"/>
       </w:pPr>
-      <w:bookmarkStart w:id="108" w:name="_Toc218508601"/>
+      <w:bookmarkStart w:id="109" w:name="_Toc218508601"/>
       <w:r>
         <w:t>Remote Workers</w:t>
       </w:r>
-      <w:bookmarkEnd w:id="108"/>
+      <w:bookmarkEnd w:id="109"/>
     </w:p>
     <w:p>
       <w:pPr>
@@ -10932,7 +10963,7 @@
         </w:rPr>
         <w:t>pplication Deployment</w:t>
       </w:r>
-      <w:bookmarkEnd w:id="104"/>
+      <w:bookmarkEnd w:id="105"/>
     </w:p>
     <w:p>
       <w:pPr>
@@ -10983,14 +11014,14 @@
           <w:noProof/>
         </w:rPr>
       </w:pPr>
-      <w:bookmarkStart w:id="109" w:name="_Toc218508647"/>
+      <w:bookmarkStart w:id="110" w:name="_Toc218508647"/>
       <w:r>
         <w:rPr>
           <w:noProof/>
         </w:rPr>
         <w:t>Desktop Administration</w:t>
       </w:r>
-      <w:bookmarkEnd w:id="109"/>
+      <w:bookmarkEnd w:id="110"/>
     </w:p>
     <w:p>
       <w:pPr>
@@ -11091,14 +11122,14 @@
           <w:noProof/>
         </w:rPr>
       </w:pPr>
-      <w:bookmarkStart w:id="110" w:name="_Toc218508648"/>
+      <w:bookmarkStart w:id="111" w:name="_Toc218508648"/>
       <w:r>
         <w:rPr>
           <w:noProof/>
         </w:rPr>
         <w:t>Virtual Private Networking</w:t>
       </w:r>
-      <w:bookmarkEnd w:id="110"/>
+      <w:bookmarkEnd w:id="111"/>
     </w:p>
     <w:p>
       <w:pPr>
@@ -11243,14 +11274,14 @@
           <w:noProof/>
         </w:rPr>
       </w:pPr>
-      <w:bookmarkStart w:id="111" w:name="_Toc218508649"/>
+      <w:bookmarkStart w:id="112" w:name="_Toc218508649"/>
       <w:r>
         <w:rPr>
           <w:noProof/>
         </w:rPr>
         <w:t>Wireless</w:t>
       </w:r>
-      <w:bookmarkEnd w:id="111"/>
+      <w:bookmarkEnd w:id="112"/>
     </w:p>
     <w:p>
       <w:pPr>
@@ -11270,7 +11301,14 @@
         <w:rPr>
           <w:rFonts w:cs="Arial"/>
         </w:rPr>
-        <w:t>Wi-Fi connectivity can be initiated in multiple ways.  The typical approaches are: Automatically connect (either at logon or just after), Authenticated after logon, and validated via certificate.  In the first case of automatically connected, the Wi-Fi can be treated the same as a Wired connection.  In either of the other two cases a device on Wi-Fi can require additional effort during a migration event.</w:t>
+        <w:t xml:space="preserve">Wi-Fi connectivity can be initiated in multiple ways.  The typical approaches are: Automatically connect (either at logon or just after), Authenticated after logon, and validated via certificate.  In the first case of automatically connected, the Wi-Fi can be treated the same as a Wired </w:t>
+      </w:r>
+      <w:r>
+        <w:rPr>
+          <w:rFonts w:cs="Arial"/>
+        </w:rPr>
+        <w:lastRenderedPageBreak/>
+        <w:t>connection.  In either of the other two cases a device on Wi-Fi can require additional effort during a migration event.</w:t>
       </w:r>
     </w:p>
     <w:p>
@@ -11328,14 +11366,14 @@
         </w:rPr>
         <w:t xml:space="preserve">/M365 Wi-Fi should not be impacted.  Should </w:t>
       </w:r>
-      <w:bookmarkStart w:id="112" w:name="_Int_cQdpeWAB"/>
+      <w:bookmarkStart w:id="113" w:name="_Int_cQdpeWAB"/>
       <w:r>
         <w:rPr>
           <w:rFonts w:cs="Arial"/>
         </w:rPr>
         <w:t>an AD</w:t>
       </w:r>
-      <w:bookmarkEnd w:id="112"/>
+      <w:bookmarkEnd w:id="113"/>
       <w:r>
         <w:rPr>
           <w:rFonts w:cs="Arial"/>
@@ -11351,16 +11389,15 @@
           <w:lang w:val="fr-FR"/>
         </w:rPr>
       </w:pPr>
-      <w:bookmarkStart w:id="113" w:name="_Toc218508650"/>
+      <w:bookmarkStart w:id="114" w:name="_Toc218508650"/>
       <w:r>
         <w:rPr>
           <w:noProof/>
           <w:lang w:val="fr-FR"/>
         </w:rPr>
-        <w:lastRenderedPageBreak/>
         <w:t>Virtual Desktop (VDI, Citrix, etc.)</w:t>
       </w:r>
-      <w:bookmarkEnd w:id="113"/>
+      <w:bookmarkEnd w:id="114"/>
     </w:p>
     <w:p>
       <w:r>
@@ -11460,7 +11497,7 @@
           <w:noProof/>
         </w:rPr>
       </w:pPr>
-      <w:bookmarkStart w:id="114" w:name="_Toc218508651"/>
+      <w:bookmarkStart w:id="115" w:name="_Toc218508651"/>
       <w:r>
         <w:rPr>
           <w:noProof/>
@@ -11468,7 +11505,7 @@
         <w:lastRenderedPageBreak/>
         <w:t>Appendices</w:t>
       </w:r>
-      <w:bookmarkEnd w:id="114"/>
+      <w:bookmarkEnd w:id="115"/>
     </w:p>
     <w:p>
       <w:pPr>
@@ -11477,7 +11514,7 @@
           <w:u w:color="FFFFFF"/>
         </w:rPr>
       </w:pPr>
-      <w:bookmarkStart w:id="115" w:name="_Toc218508652"/>
+      <w:bookmarkStart w:id="116" w:name="_Toc218508652"/>
       <w:r>
         <w:rPr>
           <w:noProof/>
@@ -11515,36 +11552,36 @@
         </w:rPr>
         <w:t>Integration Questions/Answers</w:t>
       </w:r>
-      <w:bookmarkEnd w:id="115"/>
+      <w:bookmarkEnd w:id="116"/>
     </w:p>
     <w:p>
       <w:pPr>
         <w:pStyle w:val="Heading1"/>
       </w:pPr>
-      <w:bookmarkStart w:id="116" w:name="_Cleanup"/>
-      <w:bookmarkStart w:id="117" w:name="_Toc50122336"/>
-      <w:bookmarkStart w:id="118" w:name="_Toc218508653"/>
+      <w:bookmarkStart w:id="117" w:name="_Cleanup"/>
+      <w:bookmarkStart w:id="118" w:name="_Toc50122336"/>
+      <w:bookmarkStart w:id="119" w:name="_Toc218508653"/>
       <w:bookmarkEnd w:id="6"/>
       <w:bookmarkEnd w:id="7"/>
       <w:bookmarkEnd w:id="8"/>
       <w:bookmarkEnd w:id="9"/>
       <w:bookmarkEnd w:id="10"/>
       <w:bookmarkEnd w:id="11"/>
-      <w:bookmarkEnd w:id="116"/>
+      <w:bookmarkEnd w:id="117"/>
       <w:r>
         <w:t>About us</w:t>
       </w:r>
-      <w:bookmarkEnd w:id="117"/>
       <w:bookmarkEnd w:id="118"/>
+      <w:bookmarkEnd w:id="119"/>
     </w:p>
     <w:p>
       <w:pPr>
         <w:pStyle w:val="Heading2"/>
       </w:pPr>
-      <w:bookmarkStart w:id="119" w:name="_Toc50118496"/>
-      <w:bookmarkStart w:id="120" w:name="_Toc50118071"/>
-      <w:bookmarkStart w:id="121" w:name="_Toc50122337"/>
-      <w:bookmarkStart w:id="122" w:name="_Toc218508654"/>
+      <w:bookmarkStart w:id="120" w:name="_Toc50118496"/>
+      <w:bookmarkStart w:id="121" w:name="_Toc50118071"/>
+      <w:bookmarkStart w:id="122" w:name="_Toc50122337"/>
+      <w:bookmarkStart w:id="123" w:name="_Toc218508654"/>
       <w:r>
         <w:t xml:space="preserve">Where Next </w:t>
       </w:r>
@@ -11554,10 +11591,10 @@
       <w:r>
         <w:t xml:space="preserve"> Now</w:t>
       </w:r>
-      <w:bookmarkEnd w:id="119"/>
       <w:bookmarkEnd w:id="120"/>
       <w:bookmarkEnd w:id="121"/>
       <w:bookmarkEnd w:id="122"/>
+      <w:bookmarkEnd w:id="123"/>
     </w:p>
     <w:p>
       <w:r>
@@ -11588,17 +11625,17 @@
       <w:pPr>
         <w:pStyle w:val="Heading2"/>
       </w:pPr>
-      <w:bookmarkStart w:id="123" w:name="_Toc50118497"/>
-      <w:bookmarkStart w:id="124" w:name="_Toc50118072"/>
-      <w:bookmarkStart w:id="125" w:name="_Toc50122338"/>
-      <w:bookmarkStart w:id="126" w:name="_Toc218508655"/>
+      <w:bookmarkStart w:id="124" w:name="_Toc50118497"/>
+      <w:bookmarkStart w:id="125" w:name="_Toc50118072"/>
+      <w:bookmarkStart w:id="126" w:name="_Toc50122338"/>
+      <w:bookmarkStart w:id="127" w:name="_Toc218508655"/>
       <w:r>
         <w:t>Contacting Quest</w:t>
       </w:r>
-      <w:bookmarkEnd w:id="123"/>
       <w:bookmarkEnd w:id="124"/>
       <w:bookmarkEnd w:id="125"/>
       <w:bookmarkEnd w:id="126"/>
+      <w:bookmarkEnd w:id="127"/>
     </w:p>
     <w:p>
       <w:r>
@@ -11628,17 +11665,17 @@
       <w:pPr>
         <w:pStyle w:val="Heading2"/>
       </w:pPr>
-      <w:bookmarkStart w:id="127" w:name="_Toc50118498"/>
-      <w:bookmarkStart w:id="128" w:name="_Toc50118073"/>
-      <w:bookmarkStart w:id="129" w:name="_Toc50122339"/>
-      <w:bookmarkStart w:id="130" w:name="_Toc218508656"/>
+      <w:bookmarkStart w:id="128" w:name="_Toc50118498"/>
+      <w:bookmarkStart w:id="129" w:name="_Toc50118073"/>
+      <w:bookmarkStart w:id="130" w:name="_Toc50122339"/>
+      <w:bookmarkStart w:id="131" w:name="_Toc218508656"/>
       <w:r>
         <w:t>Technical support resources</w:t>
       </w:r>
-      <w:bookmarkEnd w:id="127"/>
       <w:bookmarkEnd w:id="128"/>
       <w:bookmarkEnd w:id="129"/>
       <w:bookmarkEnd w:id="130"/>
+      <w:bookmarkEnd w:id="131"/>
     </w:p>
     <w:p>
       <w:r>
@@ -20234,16 +20271,6 @@
 </file>
 
 <file path=customXml/item1.xml><?xml version="1.0" encoding="utf-8"?>
-<b:Sources xmlns:b="http://schemas.openxmlformats.org/officeDocument/2006/bibliography" xmlns="http://schemas.openxmlformats.org/officeDocument/2006/bibliography" SelectedStyle="/APA.XSL" StyleName="APA"/>
-</file>
-
-<file path=customXml/item2.xml><?xml version="1.0" encoding="utf-8"?>
-<p:properties xmlns:p="http://schemas.microsoft.com/office/2006/metadata/properties" xmlns:xsi="http://www.w3.org/2001/XMLSchema-instance" xmlns:pc="http://schemas.microsoft.com/office/infopath/2007/PartnerControls">
-  <documentManagement/>
-</p:properties>
-</file>
-
-<file path=customXml/item3.xml><?xml version="1.0" encoding="utf-8"?>
 <ct:contentTypeSchema xmlns:ct="http://schemas.microsoft.com/office/2006/metadata/contentType" xmlns:ma="http://schemas.microsoft.com/office/2006/metadata/properties/metaAttributes" ct:_="" ma:_="" ma:contentTypeName="Document" ma:contentTypeID="0x010100E8CB6F3EDD43474AA10481D50BB64020" ma:contentTypeVersion="4" ma:contentTypeDescription="Create a new document." ma:contentTypeScope="" ma:versionID="be0fb91248b2e97ea45459c2c5c0e22c">
   <xsd:schema xmlns:xsd="http://www.w3.org/2001/XMLSchema" xmlns:xs="http://www.w3.org/2001/XMLSchema" xmlns:p="http://schemas.microsoft.com/office/2006/metadata/properties" xmlns:ns2="564344db-7381-46cc-ad20-5587031b0ed9" targetNamespace="http://schemas.microsoft.com/office/2006/metadata/properties" ma:root="true" ma:fieldsID="9b3be8367740804d7b19f678bfda6a23" ns2:_="">
     <xsd:import namespace="564344db-7381-46cc-ad20-5587031b0ed9"/>
@@ -20387,6 +20414,16 @@
 </ct:contentTypeSchema>
 </file>
 
+<file path=customXml/item2.xml><?xml version="1.0" encoding="utf-8"?>
+<p:properties xmlns:p="http://schemas.microsoft.com/office/2006/metadata/properties" xmlns:xsi="http://www.w3.org/2001/XMLSchema-instance" xmlns:pc="http://schemas.microsoft.com/office/infopath/2007/PartnerControls">
+  <documentManagement/>
+</p:properties>
+</file>
+
+<file path=customXml/item3.xml><?xml version="1.0" encoding="utf-8"?>
+<b:Sources xmlns:b="http://schemas.openxmlformats.org/officeDocument/2006/bibliography" xmlns="http://schemas.openxmlformats.org/officeDocument/2006/bibliography" SelectedStyle="/APA.XSL" StyleName="APA"/>
+</file>
+
 <file path=customXml/item4.xml><?xml version="1.0" encoding="utf-8"?>
 <?mso-contentType ?>
 <FormTemplates xmlns="http://schemas.microsoft.com/sharepoint/v3/contenttype/forms">
@@ -20397,23 +20434,6 @@
 </file>
 
 <file path=customXml/itemProps1.xml><?xml version="1.0" encoding="utf-8"?>
-<ds:datastoreItem xmlns:ds="http://schemas.openxmlformats.org/officeDocument/2006/customXml" ds:itemID="{1F2F4FAC-1BAA-4C15-8BEC-869F6AC26C67}">
-  <ds:schemaRefs>
-    <ds:schemaRef ds:uri="http://schemas.openxmlformats.org/officeDocument/2006/bibliography"/>
-  </ds:schemaRefs>
-</ds:datastoreItem>
-</file>
-
-<file path=customXml/itemProps2.xml><?xml version="1.0" encoding="utf-8"?>
-<ds:datastoreItem xmlns:ds="http://schemas.openxmlformats.org/officeDocument/2006/customXml" ds:itemID="{EEF0FF5E-EC80-4EC7-816E-8FD3FB1F00C5}">
-  <ds:schemaRefs>
-    <ds:schemaRef ds:uri="http://schemas.microsoft.com/office/2006/metadata/properties"/>
-    <ds:schemaRef ds:uri="http://schemas.microsoft.com/office/infopath/2007/PartnerControls"/>
-  </ds:schemaRefs>
-</ds:datastoreItem>
-</file>
-
-<file path=customXml/itemProps3.xml><?xml version="1.0" encoding="utf-8"?>
 <ds:datastoreItem xmlns:ds="http://schemas.openxmlformats.org/officeDocument/2006/customXml" ds:itemID="{EC30F5FF-22C8-4A05-8DCE-BA118E3692D7}">
   <ds:schemaRefs>
     <ds:schemaRef ds:uri="http://schemas.microsoft.com/office/2006/metadata/contentType"/>
@@ -20431,6 +20451,23 @@
 </ds:datastoreItem>
 </file>
 
+<file path=customXml/itemProps2.xml><?xml version="1.0" encoding="utf-8"?>
+<ds:datastoreItem xmlns:ds="http://schemas.openxmlformats.org/officeDocument/2006/customXml" ds:itemID="{EEF0FF5E-EC80-4EC7-816E-8FD3FB1F00C5}">
+  <ds:schemaRefs>
+    <ds:schemaRef ds:uri="http://schemas.microsoft.com/office/2006/metadata/properties"/>
+    <ds:schemaRef ds:uri="http://schemas.microsoft.com/office/infopath/2007/PartnerControls"/>
+  </ds:schemaRefs>
+</ds:datastoreItem>
+</file>
+
+<file path=customXml/itemProps3.xml><?xml version="1.0" encoding="utf-8"?>
+<ds:datastoreItem xmlns:ds="http://schemas.openxmlformats.org/officeDocument/2006/customXml" ds:itemID="{1F2F4FAC-1BAA-4C15-8BEC-869F6AC26C67}">
+  <ds:schemaRefs>
+    <ds:schemaRef ds:uri="http://schemas.openxmlformats.org/officeDocument/2006/bibliography"/>
+  </ds:schemaRefs>
+</ds:datastoreItem>
+</file>
+
 <file path=customXml/itemProps4.xml><?xml version="1.0" encoding="utf-8"?>
 <ds:datastoreItem xmlns:ds="http://schemas.openxmlformats.org/officeDocument/2006/customXml" ds:itemID="{6830A3BC-7801-49DF-97A3-727FA35DA724}">
   <ds:schemaRefs>

</xml_diff>

<commit_message>
Removed Forest_RiskFlags and Domain_RiskFlags sections - keeping only summary tables to avoid overly long detailed flag listings
</commit_message>
<xml_diff>
--- a/src/Migration.Toolkit.Assessment/config/Template - Discovery and Assessment Findings Report V1.0 - Quest 2025 style.docx
+++ b/src/Migration.Toolkit.Assessment/config/Template - Discovery and Assessment Findings Report V1.0 - Quest 2025 style.docx
@@ -7091,7 +7091,7 @@
     </w:p>
     <w:p>
       <w:pPr>
-        <w:pStyle w:val="Heading2"/>
+        <w:pStyle w:val="Heading3"/>
         <w:rPr>
           <w:lang w:val="en-US"/>
         </w:rPr>
@@ -7128,13 +7128,70 @@
     </w:p>
     <w:p>
       <w:pPr>
+        <w:pStyle w:val="Heading3"/>
+        <w:rPr>
+          <w:noProof/>
+          <w:lang w:val="en-US"/>
+        </w:rPr>
+      </w:pPr>
+      <w:bookmarkStart w:id="22" w:name="_Toc218508605"/>
+      <w:r>
+        <w:rPr>
+          <w:noProof/>
+          <w:lang w:val="en-US"/>
+        </w:rPr>
+        <w:t xml:space="preserve">Forest Migration Risk </w:t>
+      </w:r>
+      <w:r>
+        <w:rPr>
+          <w:noProof/>
+          <w:lang w:val="en-US"/>
+        </w:rPr>
+        <w:t>Summary</w:t>
+      </w:r>
+    </w:p>
+    <w:p>
+      <w:pPr>
+        <w:rPr>
+          <w:lang w:val="en-US"/>
+        </w:rPr>
+      </w:pPr>
+      <w:bookmarkStart w:id="23" w:name="BK_AD_Forest_Risk_Summary"/>
+      <w:bookmarkEnd w:id="23"/>
+    </w:p>
+    <w:p>
+      <w:pPr>
+        <w:pStyle w:val="Heading3"/>
+        <w:rPr>
+          <w:noProof/>
+          <w:lang w:val="en-US"/>
+        </w:rPr>
+      </w:pPr>
+      <w:r>
+        <w:rPr>
+          <w:noProof/>
+          <w:lang w:val="en-US"/>
+        </w:rPr>
+        <w:t>Forest Migration Risk Flags</w:t>
+      </w:r>
+    </w:p>
+    <w:p>
+      <w:pPr>
+        <w:rPr>
+          <w:lang w:val="en-US"/>
+        </w:rPr>
+      </w:pPr>
+      <w:bookmarkStart w:id="24" w:name="BK_AD_Forest_Risk_Flags"/>
+      <w:bookmarkEnd w:id="24"/>
+    </w:p>
+    <w:p>
+      <w:pPr>
         <w:pStyle w:val="Heading2"/>
         <w:rPr>
           <w:noProof/>
           <w:lang w:val="en-US"/>
         </w:rPr>
       </w:pPr>
-      <w:bookmarkStart w:id="22" w:name="_Toc218508605"/>
       <w:r>
         <w:rPr>
           <w:noProof/>
@@ -7170,38 +7227,91 @@
           <w:lang w:val="en-US"/>
         </w:rPr>
       </w:pPr>
-      <w:bookmarkStart w:id="23" w:name="BK_AD_Domain_Information_Table"/>
-      <w:bookmarkEnd w:id="23"/>
-    </w:p>
-    <w:p>
-      <w:pPr>
-        <w:rPr>
-          <w:lang w:val="en-US"/>
-        </w:rPr>
-      </w:pPr>
-    </w:p>
-    <w:p>
-      <w:pPr>
-        <w:rPr>
-          <w:lang w:val="en-US"/>
-        </w:rPr>
-      </w:pPr>
-    </w:p>
-    <w:p>
-      <w:pPr>
-        <w:rPr>
-          <w:lang w:val="en-US"/>
-        </w:rPr>
-      </w:pPr>
-      <w:bookmarkStart w:id="24" w:name="BK_Domain_Discovery_Table"/>
-      <w:bookmarkEnd w:id="24"/>
-    </w:p>
-    <w:p>
-      <w:pPr>
-        <w:rPr>
-          <w:lang w:val="en-US"/>
-        </w:rPr>
-      </w:pPr>
+      <w:bookmarkStart w:id="25" w:name="BK_AD_Domain_Information_Table"/>
+      <w:bookmarkEnd w:id="25"/>
+    </w:p>
+    <w:p>
+      <w:pPr>
+        <w:rPr>
+          <w:lang w:val="en-US"/>
+        </w:rPr>
+      </w:pPr>
+    </w:p>
+    <w:p>
+      <w:pPr>
+        <w:rPr>
+          <w:lang w:val="en-US"/>
+        </w:rPr>
+      </w:pPr>
+    </w:p>
+    <w:p>
+      <w:pPr>
+        <w:rPr>
+          <w:lang w:val="en-US"/>
+        </w:rPr>
+      </w:pPr>
+      <w:bookmarkStart w:id="26" w:name="BK_Domain_Discovery_Table"/>
+      <w:bookmarkEnd w:id="26"/>
+    </w:p>
+    <w:p>
+      <w:pPr>
+        <w:rPr>
+          <w:lang w:val="en-US"/>
+        </w:rPr>
+      </w:pPr>
+    </w:p>
+    <w:p>
+      <w:pPr>
+        <w:pStyle w:val="Heading3"/>
+        <w:rPr>
+          <w:lang w:val="en-US"/>
+        </w:rPr>
+      </w:pPr>
+      <w:r>
+        <w:rPr>
+          <w:lang w:val="en-US"/>
+        </w:rPr>
+        <w:t>Domain Migration Risk Summary</w:t>
+      </w:r>
+    </w:p>
+    <w:p>
+      <w:pPr>
+        <w:rPr>
+          <w:lang w:val="en-US"/>
+        </w:rPr>
+      </w:pPr>
+      <w:bookmarkStart w:id="27" w:name="BK_AD_Domain_Risk_Summary"/>
+      <w:bookmarkEnd w:id="27"/>
+    </w:p>
+    <w:p>
+      <w:pPr>
+        <w:rPr>
+          <w:lang w:val="en-US"/>
+        </w:rPr>
+      </w:pPr>
+    </w:p>
+    <w:p>
+      <w:pPr>
+        <w:pStyle w:val="Heading3"/>
+        <w:rPr>
+          <w:lang w:val="en-US"/>
+        </w:rPr>
+      </w:pPr>
+      <w:r>
+        <w:rPr>
+          <w:lang w:val="en-US"/>
+        </w:rPr>
+        <w:t>Domain Migration Risk Flags</w:t>
+      </w:r>
+    </w:p>
+    <w:p>
+      <w:pPr>
+        <w:rPr>
+          <w:lang w:val="en-US"/>
+        </w:rPr>
+      </w:pPr>
+      <w:bookmarkStart w:id="28" w:name="BK_AD_Domain_Risk_Flags"/>
+      <w:bookmarkEnd w:id="28"/>
     </w:p>
     <w:p>
       <w:pPr>
@@ -7210,14 +7320,14 @@
           <w:noProof/>
         </w:rPr>
       </w:pPr>
-      <w:bookmarkStart w:id="25" w:name="_Toc218508606"/>
+      <w:bookmarkStart w:id="29" w:name="_Toc218508606"/>
       <w:r>
         <w:rPr>
           <w:noProof/>
         </w:rPr>
         <w:t>Sites, Subnets and Sitelinks</w:t>
       </w:r>
-      <w:bookmarkEnd w:id="25"/>
+      <w:bookmarkEnd w:id="29"/>
     </w:p>
     <w:p>
       <w:pPr>
@@ -7257,8 +7367,8 @@
           <w:lang w:val="en-US"/>
         </w:rPr>
       </w:pPr>
-      <w:bookmarkStart w:id="26" w:name="BK_AD_Sites_Table"/>
-      <w:bookmarkEnd w:id="26"/>
+      <w:bookmarkStart w:id="30" w:name="BK_AD_Sites_Table"/>
+      <w:bookmarkEnd w:id="30"/>
     </w:p>
     <w:p>
       <w:pPr>
@@ -7286,8 +7396,8 @@
           <w:lang w:val="en-US"/>
         </w:rPr>
       </w:pPr>
-      <w:bookmarkStart w:id="27" w:name="BK_AD_Subnets_Table"/>
-      <w:bookmarkEnd w:id="27"/>
+      <w:bookmarkStart w:id="31" w:name="BK_AD_Subnets_Table"/>
+      <w:bookmarkEnd w:id="31"/>
     </w:p>
     <w:p>
       <w:pPr>
@@ -7321,8 +7431,8 @@
           <w:lang w:val="en-US"/>
         </w:rPr>
       </w:pPr>
-      <w:bookmarkStart w:id="28" w:name="BK_AD_Sitelinks_Table"/>
-      <w:bookmarkEnd w:id="28"/>
+      <w:bookmarkStart w:id="32" w:name="BK_AD_Sitelinks_Table"/>
+      <w:bookmarkEnd w:id="32"/>
     </w:p>
     <w:p>
       <w:pPr>
@@ -7340,23 +7450,23 @@
           <w:noProof/>
         </w:rPr>
       </w:pPr>
-      <w:bookmarkStart w:id="29" w:name="_Toc218508607"/>
+      <w:bookmarkStart w:id="33" w:name="_Toc218508607"/>
       <w:r>
         <w:rPr>
           <w:noProof/>
         </w:rPr>
         <w:t>Trust Relationships</w:t>
       </w:r>
-      <w:bookmarkEnd w:id="29"/>
-    </w:p>
-    <w:p>
-      <w:pPr>
-        <w:rPr>
-          <w:lang w:val="en-US"/>
-        </w:rPr>
-      </w:pPr>
-      <w:bookmarkStart w:id="30" w:name="BK_Trusts_Table"/>
-      <w:bookmarkEnd w:id="30"/>
+      <w:bookmarkEnd w:id="33"/>
+    </w:p>
+    <w:p>
+      <w:pPr>
+        <w:rPr>
+          <w:lang w:val="en-US"/>
+        </w:rPr>
+      </w:pPr>
+      <w:bookmarkStart w:id="34" w:name="BK_Trusts_Table"/>
+      <w:bookmarkEnd w:id="34"/>
     </w:p>
     <w:p>
       <w:pPr>
@@ -7365,14 +7475,14 @@
           <w:noProof/>
         </w:rPr>
       </w:pPr>
-      <w:bookmarkStart w:id="31" w:name="_Toc218508608"/>
+      <w:bookmarkStart w:id="35" w:name="_Toc218508608"/>
       <w:r>
         <w:rPr>
           <w:noProof/>
         </w:rPr>
         <w:t>Domain Controllers</w:t>
       </w:r>
-      <w:bookmarkEnd w:id="31"/>
+      <w:bookmarkEnd w:id="35"/>
     </w:p>
     <w:p>
       <w:pPr>
@@ -7405,8 +7515,8 @@
           <w:lang w:val="en-US"/>
         </w:rPr>
       </w:pPr>
-      <w:bookmarkStart w:id="32" w:name="BK_Domain_Controllers_Table"/>
-      <w:bookmarkEnd w:id="32"/>
+      <w:bookmarkStart w:id="36" w:name="BK_Domain_Controllers_Table"/>
+      <w:bookmarkEnd w:id="36"/>
     </w:p>
     <w:p>
       <w:pPr>
@@ -7415,14 +7525,14 @@
           <w:noProof/>
         </w:rPr>
       </w:pPr>
-      <w:bookmarkStart w:id="33" w:name="_Toc218508609"/>
+      <w:bookmarkStart w:id="37" w:name="_Toc218508609"/>
       <w:r>
         <w:rPr>
           <w:noProof/>
         </w:rPr>
         <w:t>Password Never Expires</w:t>
       </w:r>
-      <w:bookmarkEnd w:id="33"/>
+      <w:bookmarkEnd w:id="37"/>
     </w:p>
     <w:p>
       <w:r>
@@ -7448,7 +7558,6 @@
         </w:rPr>
       </w:pPr>
       <w:r>
-        <w:lastRenderedPageBreak/>
         <w:t xml:space="preserve">The table below shows the </w:t>
       </w:r>
       <w:r>
@@ -7470,8 +7579,8 @@
           <w:lang w:val="en-US"/>
         </w:rPr>
       </w:pPr>
-      <w:bookmarkStart w:id="34" w:name="BK_nonexpiring_passwords_Table"/>
-      <w:bookmarkEnd w:id="34"/>
+      <w:bookmarkStart w:id="38" w:name="BK_nonexpiring_passwords_Table"/>
+      <w:bookmarkEnd w:id="38"/>
       <w:r>
         <w:t xml:space="preserve">  </w:t>
       </w:r>
@@ -7483,41 +7592,41 @@
           <w:noProof/>
         </w:rPr>
       </w:pPr>
-      <w:bookmarkStart w:id="35" w:name="_Toc218508610"/>
+      <w:bookmarkStart w:id="39" w:name="_Toc218508610"/>
       <w:r>
         <w:rPr>
           <w:noProof/>
         </w:rPr>
         <w:t>Password Policies</w:t>
       </w:r>
-      <w:bookmarkEnd w:id="35"/>
-    </w:p>
-    <w:p>
-      <w:pPr>
-        <w:rPr>
-          <w:lang w:val="en-US"/>
-        </w:rPr>
-      </w:pPr>
-      <w:bookmarkStart w:id="36" w:name="BK_Password_Policies_Table"/>
-      <w:bookmarkEnd w:id="36"/>
-    </w:p>
-    <w:p>
-      <w:pPr>
-        <w:rPr>
-          <w:lang w:val="en-US"/>
-        </w:rPr>
-      </w:pPr>
-    </w:p>
-    <w:p>
-      <w:pPr>
-        <w:rPr>
-          <w:lang w:val="en-US"/>
-        </w:rPr>
-      </w:pPr>
-    </w:p>
-    <w:p>
-      <w:bookmarkStart w:id="37" w:name="BK_FGPP_Table"/>
-      <w:bookmarkEnd w:id="37"/>
+      <w:bookmarkEnd w:id="39"/>
+    </w:p>
+    <w:p>
+      <w:pPr>
+        <w:rPr>
+          <w:lang w:val="en-US"/>
+        </w:rPr>
+      </w:pPr>
+      <w:bookmarkStart w:id="40" w:name="BK_Password_Policies_Table"/>
+      <w:bookmarkEnd w:id="40"/>
+    </w:p>
+    <w:p>
+      <w:pPr>
+        <w:rPr>
+          <w:lang w:val="en-US"/>
+        </w:rPr>
+      </w:pPr>
+    </w:p>
+    <w:p>
+      <w:pPr>
+        <w:rPr>
+          <w:lang w:val="en-US"/>
+        </w:rPr>
+      </w:pPr>
+    </w:p>
+    <w:p>
+      <w:bookmarkStart w:id="41" w:name="BK_FGPP_Table"/>
+      <w:bookmarkEnd w:id="41"/>
       <w:r>
         <w:t xml:space="preserve">  </w:t>
       </w:r>
@@ -7529,14 +7638,14 @@
           <w:noProof/>
         </w:rPr>
       </w:pPr>
-      <w:bookmarkStart w:id="38" w:name="_Toc218508611"/>
+      <w:bookmarkStart w:id="42" w:name="_Toc218508611"/>
       <w:r>
         <w:rPr>
           <w:noProof/>
         </w:rPr>
         <w:t>AD Recycle Bin</w:t>
       </w:r>
-      <w:bookmarkEnd w:id="38"/>
+      <w:bookmarkEnd w:id="42"/>
     </w:p>
     <w:p>
       <w:r>
@@ -7551,8 +7660,8 @@
       </w:pPr>
     </w:p>
     <w:p>
-      <w:bookmarkStart w:id="39" w:name="BK_AD_RecycleBin"/>
-      <w:bookmarkEnd w:id="39"/>
+      <w:bookmarkStart w:id="43" w:name="BK_AD_RecycleBin"/>
+      <w:bookmarkEnd w:id="43"/>
       <w:r>
         <w:t xml:space="preserve">        </w:t>
       </w:r>
@@ -7564,14 +7673,14 @@
           <w:noProof/>
         </w:rPr>
       </w:pPr>
-      <w:bookmarkStart w:id="40" w:name="_Toc218508612"/>
+      <w:bookmarkStart w:id="44" w:name="_Toc218508612"/>
       <w:r>
         <w:rPr>
           <w:noProof/>
         </w:rPr>
         <w:t>Group Policy</w:t>
       </w:r>
-      <w:bookmarkEnd w:id="40"/>
+      <w:bookmarkEnd w:id="44"/>
     </w:p>
     <w:p>
       <w:pPr>
@@ -7601,8 +7710,8 @@
           <w:lang w:val="en-US"/>
         </w:rPr>
       </w:pPr>
-      <w:bookmarkStart w:id="41" w:name="BK_Group_Policy_Table"/>
-      <w:bookmarkEnd w:id="41"/>
+      <w:bookmarkStart w:id="45" w:name="BK_Group_Policy_Table"/>
+      <w:bookmarkEnd w:id="45"/>
     </w:p>
     <w:p>
       <w:pPr>
@@ -7611,23 +7720,23 @@
           <w:noProof/>
         </w:rPr>
       </w:pPr>
-      <w:bookmarkStart w:id="42" w:name="_Toc218508613"/>
+      <w:bookmarkStart w:id="46" w:name="_Toc218508613"/>
       <w:r>
         <w:rPr>
           <w:noProof/>
         </w:rPr>
         <w:t>Login Scripts</w:t>
       </w:r>
-      <w:bookmarkEnd w:id="42"/>
-    </w:p>
-    <w:p>
-      <w:pPr>
-        <w:rPr>
-          <w:lang w:val="en-US"/>
-        </w:rPr>
-      </w:pPr>
-      <w:bookmarkStart w:id="43" w:name="BK_Login_Scripts_Table"/>
-      <w:bookmarkEnd w:id="43"/>
+      <w:bookmarkEnd w:id="46"/>
+    </w:p>
+    <w:p>
+      <w:pPr>
+        <w:rPr>
+          <w:lang w:val="en-US"/>
+        </w:rPr>
+      </w:pPr>
+      <w:bookmarkStart w:id="47" w:name="BK_Login_Scripts_Table"/>
+      <w:bookmarkEnd w:id="47"/>
     </w:p>
     <w:p>
       <w:pPr>
@@ -7639,14 +7748,14 @@
           <w14:ligatures w14:val="standardContextual"/>
         </w:rPr>
       </w:pPr>
-      <w:bookmarkStart w:id="44" w:name="_Toc218508614"/>
+      <w:bookmarkStart w:id="48" w:name="_Toc218508614"/>
       <w:r>
         <w:rPr>
           <w:noProof/>
         </w:rPr>
         <w:t>AD Objects</w:t>
       </w:r>
-      <w:bookmarkEnd w:id="44"/>
+      <w:bookmarkEnd w:id="48"/>
     </w:p>
     <w:p>
       <w:pPr>
@@ -7655,14 +7764,14 @@
           <w:noProof/>
         </w:rPr>
       </w:pPr>
-      <w:bookmarkStart w:id="45" w:name="_Toc218508615"/>
+      <w:bookmarkStart w:id="49" w:name="_Toc218508615"/>
       <w:r>
         <w:rPr>
           <w:noProof/>
         </w:rPr>
         <w:t>Users</w:t>
       </w:r>
-      <w:bookmarkEnd w:id="45"/>
+      <w:bookmarkEnd w:id="49"/>
     </w:p>
     <w:p>
       <w:pPr>
@@ -7708,8 +7817,8 @@
           <w:lang w:val="en-US"/>
         </w:rPr>
       </w:pPr>
-      <w:bookmarkStart w:id="46" w:name="BK_AD_User_Statistics"/>
-      <w:bookmarkEnd w:id="46"/>
+      <w:bookmarkStart w:id="50" w:name="BK_AD_User_Statistics"/>
+      <w:bookmarkEnd w:id="50"/>
     </w:p>
     <w:p>
       <w:pPr>
@@ -7744,14 +7853,14 @@
           <w:noProof/>
         </w:rPr>
       </w:pPr>
-      <w:bookmarkStart w:id="47" w:name="_Toc218508616"/>
+      <w:bookmarkStart w:id="51" w:name="_Toc218508616"/>
       <w:r>
         <w:rPr>
           <w:noProof/>
         </w:rPr>
         <w:t>Groups</w:t>
       </w:r>
-      <w:bookmarkEnd w:id="47"/>
+      <w:bookmarkEnd w:id="51"/>
     </w:p>
     <w:p>
       <w:pPr>
@@ -7781,24 +7890,24 @@
           <w:lang w:val="en-US"/>
         </w:rPr>
       </w:pPr>
-      <w:bookmarkStart w:id="48" w:name="BK_AD_Groups_Table"/>
-      <w:bookmarkEnd w:id="48"/>
-    </w:p>
-    <w:p>
-      <w:pPr>
-        <w:rPr>
-          <w:lang w:val="en-US"/>
-        </w:rPr>
-      </w:pPr>
-    </w:p>
-    <w:p>
-      <w:pPr>
-        <w:rPr>
-          <w:lang w:val="en-US"/>
-        </w:rPr>
-      </w:pPr>
-      <w:bookmarkStart w:id="49" w:name="BK_AD_Empty_Groups_Table"/>
-      <w:bookmarkEnd w:id="49"/>
+      <w:bookmarkStart w:id="52" w:name="BK_AD_Groups_Table"/>
+      <w:bookmarkEnd w:id="52"/>
+    </w:p>
+    <w:p>
+      <w:pPr>
+        <w:rPr>
+          <w:lang w:val="en-US"/>
+        </w:rPr>
+      </w:pPr>
+    </w:p>
+    <w:p>
+      <w:pPr>
+        <w:rPr>
+          <w:lang w:val="en-US"/>
+        </w:rPr>
+      </w:pPr>
+      <w:bookmarkStart w:id="53" w:name="BK_AD_Empty_Groups_Table"/>
+      <w:bookmarkEnd w:id="53"/>
     </w:p>
     <w:p>
       <w:pPr>
@@ -7821,7 +7930,7 @@
           <w:noProof/>
         </w:rPr>
       </w:pPr>
-      <w:bookmarkStart w:id="50" w:name="_Toc218508617"/>
+      <w:bookmarkStart w:id="54" w:name="_Toc218508617"/>
       <w:r>
         <w:rPr>
           <w:noProof/>
@@ -7829,7 +7938,7 @@
         </w:rPr>
         <w:t>Devices</w:t>
       </w:r>
-      <w:bookmarkEnd w:id="50"/>
+      <w:bookmarkEnd w:id="54"/>
     </w:p>
     <w:p>
       <w:pPr>
@@ -7878,31 +7987,31 @@
           <w:lang w:val="en-US"/>
         </w:rPr>
       </w:pPr>
-      <w:bookmarkStart w:id="51" w:name="BK_AD_Workstation_Summary_Table"/>
-      <w:bookmarkEnd w:id="51"/>
-    </w:p>
-    <w:p>
-      <w:pPr>
-        <w:rPr>
-          <w:lang w:val="en-US"/>
-        </w:rPr>
-      </w:pPr>
-    </w:p>
-    <w:p>
-      <w:pPr>
-        <w:rPr>
-          <w:lang w:val="en-US"/>
-        </w:rPr>
-      </w:pPr>
-    </w:p>
-    <w:p>
-      <w:pPr>
-        <w:rPr>
-          <w:lang w:val="en-US"/>
-        </w:rPr>
-      </w:pPr>
-      <w:bookmarkStart w:id="52" w:name="BK_AD_Server_Summary_Table"/>
-      <w:bookmarkEnd w:id="52"/>
+      <w:bookmarkStart w:id="55" w:name="BK_AD_Workstation_Summary_Table"/>
+      <w:bookmarkEnd w:id="55"/>
+    </w:p>
+    <w:p>
+      <w:pPr>
+        <w:rPr>
+          <w:lang w:val="en-US"/>
+        </w:rPr>
+      </w:pPr>
+    </w:p>
+    <w:p>
+      <w:pPr>
+        <w:rPr>
+          <w:lang w:val="en-US"/>
+        </w:rPr>
+      </w:pPr>
+    </w:p>
+    <w:p>
+      <w:pPr>
+        <w:rPr>
+          <w:lang w:val="en-US"/>
+        </w:rPr>
+      </w:pPr>
+      <w:bookmarkStart w:id="56" w:name="BK_AD_Server_Summary_Table"/>
+      <w:bookmarkEnd w:id="56"/>
     </w:p>
     <w:p>
       <w:pPr>
@@ -7918,14 +8027,14 @@
           <w:noProof/>
         </w:rPr>
       </w:pPr>
-      <w:bookmarkStart w:id="53" w:name="_Toc218508618"/>
+      <w:bookmarkStart w:id="57" w:name="_Toc218508618"/>
       <w:r>
         <w:rPr>
           <w:noProof/>
         </w:rPr>
         <w:t>Contacts</w:t>
       </w:r>
-      <w:bookmarkEnd w:id="53"/>
+      <w:bookmarkEnd w:id="57"/>
     </w:p>
     <w:p>
       <w:pPr>
@@ -7949,8 +8058,8 @@
           <w:lang w:val="en-US"/>
         </w:rPr>
       </w:pPr>
-      <w:bookmarkStart w:id="54" w:name="BK_AD_Contacts_Table"/>
-      <w:bookmarkEnd w:id="54"/>
+      <w:bookmarkStart w:id="58" w:name="BK_AD_Contacts_Table"/>
+      <w:bookmarkEnd w:id="58"/>
     </w:p>
     <w:p>
       <w:pPr>
@@ -7959,14 +8068,14 @@
           <w:noProof/>
         </w:rPr>
       </w:pPr>
-      <w:bookmarkStart w:id="55" w:name="_Toc218508619"/>
+      <w:bookmarkStart w:id="59" w:name="_Toc218508619"/>
       <w:r>
         <w:rPr>
           <w:noProof/>
         </w:rPr>
         <w:t>Printers</w:t>
       </w:r>
-      <w:bookmarkEnd w:id="55"/>
+      <w:bookmarkEnd w:id="59"/>
     </w:p>
     <w:p>
       <w:pPr>
@@ -7996,8 +8105,8 @@
           <w:lang w:val="en-US"/>
         </w:rPr>
       </w:pPr>
-      <w:bookmarkStart w:id="56" w:name="BK_AD_Printers_Table"/>
-      <w:bookmarkEnd w:id="56"/>
+      <w:bookmarkStart w:id="60" w:name="BK_AD_Printers_Table"/>
+      <w:bookmarkEnd w:id="60"/>
     </w:p>
     <w:p>
       <w:pPr>
@@ -8006,14 +8115,14 @@
           <w:noProof/>
         </w:rPr>
       </w:pPr>
-      <w:bookmarkStart w:id="57" w:name="_Toc218508620"/>
+      <w:bookmarkStart w:id="61" w:name="_Toc218508620"/>
       <w:r>
         <w:rPr>
           <w:noProof/>
         </w:rPr>
         <w:t>OU Structure</w:t>
       </w:r>
-      <w:bookmarkEnd w:id="57"/>
+      <w:bookmarkEnd w:id="61"/>
     </w:p>
     <w:p>
       <w:pPr>
@@ -8076,24 +8185,24 @@
           <w:lang w:val="en-US"/>
         </w:rPr>
       </w:pPr>
-      <w:bookmarkStart w:id="58" w:name="BK_AD_OU_Summary_Table"/>
-      <w:bookmarkEnd w:id="58"/>
-    </w:p>
-    <w:p>
-      <w:pPr>
-        <w:rPr>
-          <w:lang w:val="en-US"/>
-        </w:rPr>
-      </w:pPr>
-    </w:p>
-    <w:p>
-      <w:pPr>
-        <w:rPr>
-          <w:lang w:val="en-US"/>
-        </w:rPr>
-      </w:pPr>
-      <w:bookmarkStart w:id="59" w:name="BK_AD_OU_Depth_Table"/>
-      <w:bookmarkEnd w:id="59"/>
+      <w:bookmarkStart w:id="62" w:name="BK_AD_OU_Summary_Table"/>
+      <w:bookmarkEnd w:id="62"/>
+    </w:p>
+    <w:p>
+      <w:pPr>
+        <w:rPr>
+          <w:lang w:val="en-US"/>
+        </w:rPr>
+      </w:pPr>
+    </w:p>
+    <w:p>
+      <w:pPr>
+        <w:rPr>
+          <w:lang w:val="en-US"/>
+        </w:rPr>
+      </w:pPr>
+      <w:bookmarkStart w:id="63" w:name="BK_AD_OU_Depth_Table"/>
+      <w:bookmarkEnd w:id="63"/>
     </w:p>
     <w:p>
       <w:pPr>
@@ -8108,7 +8217,7 @@
           <w:lang w:val="en-US"/>
         </w:rPr>
       </w:pPr>
-      <w:bookmarkStart w:id="60" w:name="_Toc218508622"/>
+      <w:bookmarkStart w:id="64" w:name="_Toc218508622"/>
       <w:r>
         <w:rPr>
           <w:rStyle w:val="Heading2Char"/>
@@ -8134,8 +8243,8 @@
           <w:lang w:val="en-US"/>
         </w:rPr>
       </w:pPr>
-      <w:bookmarkStart w:id="61" w:name="BK_Service_Accounts_Table"/>
-      <w:bookmarkEnd w:id="61"/>
+      <w:bookmarkStart w:id="65" w:name="BK_Service_Accounts_Table"/>
+      <w:bookmarkEnd w:id="65"/>
     </w:p>
     <w:p>
       <w:pPr>
@@ -8171,8 +8280,8 @@
           <w:lang w:val="en-US"/>
         </w:rPr>
       </w:pPr>
-      <w:bookmarkStart w:id="62" w:name="BK_AD_SPNs_Table"/>
-      <w:bookmarkEnd w:id="62"/>
+      <w:bookmarkStart w:id="66" w:name="BK_AD_SPNs_Table"/>
+      <w:bookmarkEnd w:id="66"/>
     </w:p>
     <w:p>
       <w:pPr>
@@ -8205,8 +8314,8 @@
           <w:lang w:val="en-US"/>
         </w:rPr>
       </w:pPr>
-      <w:bookmarkStart w:id="63" w:name="BK_Privileged_Accounts_Table"/>
-      <w:bookmarkEnd w:id="63"/>
+      <w:bookmarkStart w:id="67" w:name="BK_Privileged_Accounts_Table"/>
+      <w:bookmarkEnd w:id="67"/>
     </w:p>
     <w:p>
       <w:pPr>
@@ -8225,35 +8334,36 @@
       </w:r>
     </w:p>
     <w:p>
-      <w:bookmarkStart w:id="64" w:name="BK_AD_Schema_Table"/>
+      <w:bookmarkStart w:id="68" w:name="BK_AD_Schema_Table"/>
+      <w:bookmarkEnd w:id="68"/>
+    </w:p>
+    <w:p>
+      <w:pPr>
+        <w:pStyle w:val="Heading2"/>
+        <w:rPr>
+          <w:rStyle w:val="Heading2Char"/>
+        </w:rPr>
+      </w:pPr>
+      <w:r>
+        <w:rPr>
+          <w:rStyle w:val="Heading2Char"/>
+        </w:rPr>
+        <w:lastRenderedPageBreak/>
+        <w:t xml:space="preserve">AD to </w:t>
+      </w:r>
+      <w:r>
+        <w:rPr>
+          <w:rStyle w:val="Heading2Char"/>
+        </w:rPr>
+        <w:t>Entra</w:t>
+      </w:r>
+      <w:r>
+        <w:rPr>
+          <w:rStyle w:val="Heading2Char"/>
+        </w:rPr>
+        <w:t xml:space="preserve"> Sync and Considerations</w:t>
+      </w:r>
       <w:bookmarkEnd w:id="64"/>
-    </w:p>
-    <w:p>
-      <w:pPr>
-        <w:pStyle w:val="Heading2"/>
-        <w:rPr>
-          <w:rStyle w:val="Heading2Char"/>
-        </w:rPr>
-      </w:pPr>
-      <w:r>
-        <w:rPr>
-          <w:rStyle w:val="Heading2Char"/>
-        </w:rPr>
-        <w:t xml:space="preserve">AD to </w:t>
-      </w:r>
-      <w:r>
-        <w:rPr>
-          <w:rStyle w:val="Heading2Char"/>
-        </w:rPr>
-        <w:t>Entra</w:t>
-      </w:r>
-      <w:r>
-        <w:rPr>
-          <w:rStyle w:val="Heading2Char"/>
-        </w:rPr>
-        <w:t xml:space="preserve"> Sync and Considerations</w:t>
-      </w:r>
-      <w:bookmarkEnd w:id="60"/>
     </w:p>
     <w:p>
       <w:r>
@@ -8290,7 +8400,7 @@
           <w:rFonts w:eastAsiaTheme="minorEastAsia"/>
         </w:rPr>
       </w:pPr>
-      <w:bookmarkStart w:id="65" w:name="_Toc218508623"/>
+      <w:bookmarkStart w:id="69" w:name="_Toc218508623"/>
       <w:r>
         <w:rPr>
           <w:rStyle w:val="Heading1Char"/>
@@ -8303,7 +8413,7 @@
         </w:rPr>
         <w:t xml:space="preserve"> AD Assessment</w:t>
       </w:r>
-      <w:bookmarkEnd w:id="65"/>
+      <w:bookmarkEnd w:id="69"/>
     </w:p>
     <w:p>
       <w:pPr>
@@ -8313,7 +8423,7 @@
           <w:lang w:val="en-US"/>
         </w:rPr>
       </w:pPr>
-      <w:bookmarkStart w:id="66" w:name="_Toc218508624"/>
+      <w:bookmarkStart w:id="70" w:name="_Toc218508624"/>
       <w:r>
         <w:rPr>
           <w:noProof/>
@@ -8326,16 +8436,16 @@
         </w:rPr>
         <w:t xml:space="preserve"> User Accounts</w:t>
       </w:r>
-      <w:bookmarkEnd w:id="66"/>
-    </w:p>
-    <w:p>
-      <w:pPr>
-        <w:rPr>
-          <w:lang w:val="en-US"/>
-        </w:rPr>
-      </w:pPr>
-      <w:bookmarkStart w:id="67" w:name="BK_Entra_Users_Table"/>
-      <w:bookmarkEnd w:id="67"/>
+      <w:bookmarkEnd w:id="70"/>
+    </w:p>
+    <w:p>
+      <w:pPr>
+        <w:rPr>
+          <w:lang w:val="en-US"/>
+        </w:rPr>
+      </w:pPr>
+      <w:bookmarkStart w:id="71" w:name="BK_Entra_Users_Table"/>
+      <w:bookmarkEnd w:id="71"/>
     </w:p>
     <w:p>
       <w:pPr>
@@ -8382,7 +8492,6 @@
         <w:rPr>
           <w:rFonts w:cs="Arial"/>
         </w:rPr>
-        <w:lastRenderedPageBreak/>
         <w:t>These user accounts should be reviewed for migration scope.  Chances are a number of these are tied to Stale Accounts.  Stale IDs should be removed to lower the migration scope where possible.</w:t>
       </w:r>
     </w:p>
@@ -8424,7 +8533,7 @@
           <w:noProof/>
         </w:rPr>
       </w:pPr>
-      <w:bookmarkStart w:id="68" w:name="_Toc218508625"/>
+      <w:bookmarkStart w:id="72" w:name="_Toc218508625"/>
       <w:r>
         <w:rPr>
           <w:noProof/>
@@ -8438,7 +8547,7 @@
         </w:rPr>
         <w:t xml:space="preserve"> Guest Accounts</w:t>
       </w:r>
-      <w:bookmarkEnd w:id="68"/>
+      <w:bookmarkEnd w:id="72"/>
     </w:p>
     <w:p>
       <w:pPr>
@@ -8490,8 +8599,8 @@
           <w:lang w:val="en-US"/>
         </w:rPr>
       </w:pPr>
-      <w:bookmarkStart w:id="69" w:name="BK_Entra_Guest_Accounts_Table"/>
-      <w:bookmarkEnd w:id="69"/>
+      <w:bookmarkStart w:id="73" w:name="BK_Entra_Guest_Accounts_Table"/>
+      <w:bookmarkEnd w:id="73"/>
     </w:p>
     <w:p>
       <w:pPr>
@@ -8586,14 +8695,14 @@
         </w:rPr>
         <w:t xml:space="preserve"> migrated or recreated </w:t>
       </w:r>
-      <w:bookmarkStart w:id="70" w:name="_Int_EY87SdSf"/>
+      <w:bookmarkStart w:id="74" w:name="_Int_EY87SdSf"/>
       <w:r>
         <w:rPr>
           <w:rFonts w:cs="Arial"/>
         </w:rPr>
         <w:t>in</w:t>
       </w:r>
-      <w:bookmarkEnd w:id="70"/>
+      <w:bookmarkEnd w:id="74"/>
       <w:r>
         <w:rPr>
           <w:rFonts w:cs="Arial"/>
@@ -8620,7 +8729,7 @@
           <w:noProof/>
         </w:rPr>
       </w:pPr>
-      <w:bookmarkStart w:id="71" w:name="_Toc218508626"/>
+      <w:bookmarkStart w:id="75" w:name="_Toc218508626"/>
       <w:r>
         <w:rPr>
           <w:noProof/>
@@ -8634,7 +8743,7 @@
         </w:rPr>
         <w:t xml:space="preserve"> Devices</w:t>
       </w:r>
-      <w:bookmarkEnd w:id="71"/>
+      <w:bookmarkEnd w:id="75"/>
     </w:p>
     <w:p>
       <w:pPr>
@@ -8789,8 +8898,8 @@
           <w:rFonts w:cs="Arial"/>
         </w:rPr>
       </w:pPr>
-      <w:bookmarkStart w:id="72" w:name="BK_Entra_Devices_Table"/>
-      <w:bookmarkEnd w:id="72"/>
+      <w:bookmarkStart w:id="76" w:name="BK_Entra_Devices_Table"/>
+      <w:bookmarkEnd w:id="76"/>
       <w:r>
         <w:rPr>
           <w:rFonts w:cs="Arial"/>
@@ -8815,7 +8924,7 @@
           <w:szCs w:val="36"/>
         </w:rPr>
       </w:pPr>
-      <w:bookmarkStart w:id="73" w:name="_Toc218508627"/>
+      <w:bookmarkStart w:id="77" w:name="_Toc218508627"/>
       <w:r>
         <w:rPr>
           <w:noProof/>
@@ -8823,7 +8932,7 @@
         </w:rPr>
         <w:t>Exchange – On prem Assessment</w:t>
       </w:r>
-      <w:bookmarkEnd w:id="73"/>
+      <w:bookmarkEnd w:id="77"/>
     </w:p>
     <w:p>
       <w:r>
@@ -8839,15 +8948,16 @@
           <w:szCs w:val="36"/>
         </w:rPr>
       </w:pPr>
-      <w:bookmarkStart w:id="74" w:name="_Toc218508628"/>
+      <w:bookmarkStart w:id="78" w:name="_Toc218508628"/>
       <w:r>
         <w:rPr>
           <w:noProof/>
           <w:szCs w:val="36"/>
         </w:rPr>
+        <w:lastRenderedPageBreak/>
         <w:t>Exchange – Online Assessment</w:t>
       </w:r>
-      <w:bookmarkEnd w:id="74"/>
+      <w:bookmarkEnd w:id="78"/>
     </w:p>
     <w:p>
       <w:pPr>
@@ -8857,7 +8967,7 @@
           <w:lang w:val="en-US"/>
         </w:rPr>
       </w:pPr>
-      <w:bookmarkStart w:id="75" w:name="_Toc218508629"/>
+      <w:bookmarkStart w:id="79" w:name="_Toc218508629"/>
       <w:r>
         <w:rPr>
           <w:noProof/>
@@ -8878,7 +8988,7 @@
         </w:rPr>
         <w:t>Summary</w:t>
       </w:r>
-      <w:bookmarkEnd w:id="75"/>
+      <w:bookmarkEnd w:id="79"/>
     </w:p>
     <w:p>
       <w:pPr>
@@ -8970,8 +9080,8 @@
           <w:rFonts w:cs="Arial"/>
         </w:rPr>
       </w:pPr>
-      <w:bookmarkStart w:id="76" w:name="BK_EXO_Mailboxes_Table"/>
-      <w:bookmarkEnd w:id="76"/>
+      <w:bookmarkStart w:id="80" w:name="BK_EXO_Mailboxes_Table"/>
+      <w:bookmarkEnd w:id="80"/>
       <w:r>
         <w:rPr>
           <w:rFonts w:cs="Arial"/>
@@ -9002,7 +9112,6 @@
           <w:b/>
           <w:bCs/>
         </w:rPr>
-        <w:lastRenderedPageBreak/>
         <w:t>Recommendations</w:t>
       </w:r>
       <w:r>
@@ -9086,7 +9195,7 @@
           <w:noProof/>
         </w:rPr>
       </w:pPr>
-      <w:bookmarkStart w:id="77" w:name="_Toc218508630"/>
+      <w:bookmarkStart w:id="81" w:name="_Toc218508630"/>
       <w:r>
         <w:rPr>
           <w:noProof/>
@@ -9129,7 +9238,7 @@
         </w:rPr>
         <w:t>old</w:t>
       </w:r>
-      <w:bookmarkEnd w:id="77"/>
+      <w:bookmarkEnd w:id="81"/>
     </w:p>
     <w:p>
       <w:pPr>
@@ -9181,8 +9290,8 @@
           <w:lang w:val="en-US"/>
         </w:rPr>
       </w:pPr>
-      <w:bookmarkStart w:id="78" w:name="BK_EXO_Lithold_Mailboxes_Table"/>
-      <w:bookmarkEnd w:id="78"/>
+      <w:bookmarkStart w:id="82" w:name="BK_EXO_Lithold_Mailboxes_Table"/>
+      <w:bookmarkEnd w:id="82"/>
     </w:p>
     <w:p>
       <w:pPr>
@@ -9245,7 +9354,7 @@
           <w:lang w:val="fr-FR"/>
         </w:rPr>
       </w:pPr>
-      <w:bookmarkStart w:id="79" w:name="_Toc218508631"/>
+      <w:bookmarkStart w:id="83" w:name="_Toc218508631"/>
       <w:r>
         <w:rPr>
           <w:noProof/>
@@ -9253,7 +9362,7 @@
         </w:rPr>
         <w:t>Mailbox quotas</w:t>
       </w:r>
-      <w:bookmarkEnd w:id="79"/>
+      <w:bookmarkEnd w:id="83"/>
     </w:p>
     <w:p>
       <w:pPr>
@@ -9289,8 +9398,8 @@
           <w:lang w:val="en-US"/>
         </w:rPr>
       </w:pPr>
-      <w:bookmarkStart w:id="80" w:name="BK_EXO_Mailbox_Quotas_Table"/>
-      <w:bookmarkEnd w:id="80"/>
+      <w:bookmarkStart w:id="84" w:name="BK_EXO_Mailbox_Quotas_Table"/>
+      <w:bookmarkEnd w:id="84"/>
     </w:p>
     <w:p>
       <w:pPr>
@@ -9316,7 +9425,7 @@
           <w:lang w:val="fr-FR"/>
         </w:rPr>
       </w:pPr>
-      <w:bookmarkStart w:id="81" w:name="_Toc218508632"/>
+      <w:bookmarkStart w:id="85" w:name="_Toc218508632"/>
       <w:r>
         <w:rPr>
           <w:noProof/>
@@ -9324,7 +9433,7 @@
         </w:rPr>
         <w:t>Distribution lists</w:t>
       </w:r>
-      <w:bookmarkEnd w:id="81"/>
+      <w:bookmarkEnd w:id="85"/>
     </w:p>
     <w:p>
       <w:pPr>
@@ -9367,8 +9476,8 @@
           <w:rFonts w:cs="Arial"/>
         </w:rPr>
       </w:pPr>
-      <w:bookmarkStart w:id="82" w:name="BK_EXO_DLs_Table"/>
-      <w:bookmarkEnd w:id="82"/>
+      <w:bookmarkStart w:id="86" w:name="BK_EXO_DLs_Table"/>
+      <w:bookmarkEnd w:id="86"/>
       <w:r>
         <w:rPr>
           <w:rFonts w:cs="Arial"/>
@@ -9462,14 +9571,14 @@
           <w:noProof/>
         </w:rPr>
       </w:pPr>
-      <w:bookmarkStart w:id="83" w:name="_Toc218508633"/>
+      <w:bookmarkStart w:id="87" w:name="_Toc218508633"/>
       <w:r>
         <w:rPr>
           <w:noProof/>
         </w:rPr>
         <w:t>Dynamic Distribution lists</w:t>
       </w:r>
-      <w:bookmarkEnd w:id="83"/>
+      <w:bookmarkEnd w:id="87"/>
     </w:p>
     <w:p>
       <w:pPr>
@@ -9517,8 +9626,8 @@
           <w:lang w:val="en-US"/>
         </w:rPr>
       </w:pPr>
-      <w:bookmarkStart w:id="84" w:name="BK_EXO_Dynamic_DLs_Table"/>
-      <w:bookmarkEnd w:id="84"/>
+      <w:bookmarkStart w:id="88" w:name="BK_EXO_Dynamic_DLs_Table"/>
+      <w:bookmarkEnd w:id="88"/>
     </w:p>
     <w:p>
       <w:pPr>
@@ -9527,15 +9636,14 @@
           <w:noProof/>
         </w:rPr>
       </w:pPr>
-      <w:bookmarkStart w:id="85" w:name="_Toc218508634"/>
+      <w:bookmarkStart w:id="89" w:name="_Toc218508634"/>
       <w:r>
         <w:rPr>
           <w:noProof/>
         </w:rPr>
-        <w:lastRenderedPageBreak/>
         <w:t>Public Folders</w:t>
       </w:r>
-      <w:bookmarkEnd w:id="85"/>
+      <w:bookmarkEnd w:id="89"/>
     </w:p>
     <w:p>
       <w:r>
@@ -9552,14 +9660,14 @@
           <w:noProof/>
         </w:rPr>
       </w:pPr>
-      <w:bookmarkStart w:id="86" w:name="_Toc218508635"/>
+      <w:bookmarkStart w:id="90" w:name="_Toc218508635"/>
       <w:r>
         <w:rPr>
           <w:noProof/>
         </w:rPr>
         <w:t>Retention Policies</w:t>
       </w:r>
-      <w:bookmarkEnd w:id="86"/>
+      <w:bookmarkEnd w:id="90"/>
     </w:p>
     <w:p>
       <w:pPr>
@@ -9622,8 +9730,8 @@
           <w:lang w:val="en-US"/>
         </w:rPr>
       </w:pPr>
-      <w:bookmarkStart w:id="87" w:name="BK_EXO_Retention_Policies_Table"/>
-      <w:bookmarkEnd w:id="87"/>
+      <w:bookmarkStart w:id="91" w:name="BK_EXO_Retention_Policies_Table"/>
+      <w:bookmarkEnd w:id="91"/>
     </w:p>
     <w:p>
       <w:pPr>
@@ -9734,14 +9842,14 @@
           <w:noProof/>
         </w:rPr>
       </w:pPr>
-      <w:bookmarkStart w:id="88" w:name="_Toc218508636"/>
+      <w:bookmarkStart w:id="92" w:name="_Toc218508636"/>
       <w:r>
         <w:rPr>
           <w:noProof/>
         </w:rPr>
         <w:t>Email Sanitization</w:t>
       </w:r>
-      <w:bookmarkEnd w:id="88"/>
+      <w:bookmarkEnd w:id="92"/>
     </w:p>
     <w:p>
       <w:pPr>
@@ -9860,7 +9968,7 @@
           <w:szCs w:val="36"/>
         </w:rPr>
       </w:pPr>
-      <w:bookmarkStart w:id="89" w:name="_Toc218508637"/>
+      <w:bookmarkStart w:id="93" w:name="_Toc218508637"/>
       <w:r>
         <w:rPr>
           <w:noProof/>
@@ -9868,7 +9976,7 @@
         </w:rPr>
         <w:t>OneDrive Assessment</w:t>
       </w:r>
-      <w:bookmarkEnd w:id="89"/>
+      <w:bookmarkEnd w:id="93"/>
     </w:p>
     <w:p>
       <w:pPr>
@@ -9878,7 +9986,7 @@
           <w:lang w:val="en-US"/>
         </w:rPr>
       </w:pPr>
-      <w:bookmarkStart w:id="90" w:name="_Toc218508638"/>
+      <w:bookmarkStart w:id="94" w:name="_Toc218508638"/>
       <w:r>
         <w:rPr>
           <w:noProof/>
@@ -9892,7 +10000,7 @@
         </w:rPr>
         <w:t>ummary</w:t>
       </w:r>
-      <w:bookmarkEnd w:id="90"/>
+      <w:bookmarkEnd w:id="94"/>
     </w:p>
     <w:p>
       <w:pPr>
@@ -9934,6 +10042,7 @@
           <w:b/>
           <w:bCs/>
         </w:rPr>
+        <w:lastRenderedPageBreak/>
         <w:t xml:space="preserve">Findings: </w:t>
       </w:r>
       <w:r>
@@ -9956,8 +10065,8 @@
           <w:lang w:val="en-US"/>
         </w:rPr>
       </w:pPr>
-      <w:bookmarkStart w:id="91" w:name="BK_ODfB_Sizes_Table"/>
-      <w:bookmarkEnd w:id="91"/>
+      <w:bookmarkStart w:id="95" w:name="BK_ODfB_Sizes_Table"/>
+      <w:bookmarkEnd w:id="95"/>
     </w:p>
     <w:p>
       <w:pPr>
@@ -10023,8 +10132,8 @@
           <w:rFonts w:cs="Arial"/>
         </w:rPr>
       </w:pPr>
-      <w:bookmarkStart w:id="92" w:name="BK_ODfB_Quotas_Table"/>
-      <w:bookmarkEnd w:id="92"/>
+      <w:bookmarkStart w:id="96" w:name="BK_ODfB_Quotas_Table"/>
+      <w:bookmarkEnd w:id="96"/>
       <w:r>
         <w:rPr>
           <w:rFonts w:cs="Arial"/>
@@ -10099,7 +10208,7 @@
           <w:noProof/>
         </w:rPr>
       </w:pPr>
-      <w:bookmarkStart w:id="93" w:name="_Toc218508639"/>
+      <w:bookmarkStart w:id="97" w:name="_Toc218508639"/>
       <w:r>
         <w:rPr>
           <w:rStyle w:val="Heading1Char"/>
@@ -10107,7 +10216,7 @@
         </w:rPr>
         <w:t>Teams Assessment</w:t>
       </w:r>
-      <w:bookmarkEnd w:id="93"/>
+      <w:bookmarkEnd w:id="97"/>
     </w:p>
     <w:p>
       <w:pPr>
@@ -10116,7 +10225,7 @@
           <w:noProof/>
         </w:rPr>
       </w:pPr>
-      <w:bookmarkStart w:id="94" w:name="_Toc218508640"/>
+      <w:bookmarkStart w:id="98" w:name="_Toc218508640"/>
       <w:r>
         <w:rPr>
           <w:noProof/>
@@ -10136,11 +10245,11 @@
         </w:rPr>
         <w:t xml:space="preserve"> Summary</w:t>
       </w:r>
-      <w:bookmarkEnd w:id="94"/>
-    </w:p>
-    <w:p>
-      <w:bookmarkStart w:id="95" w:name="BK_Teams_Summary_Table"/>
-      <w:bookmarkEnd w:id="95"/>
+      <w:bookmarkEnd w:id="98"/>
+    </w:p>
+    <w:p>
+      <w:bookmarkStart w:id="99" w:name="BK_Teams_Summary_Table"/>
+      <w:bookmarkEnd w:id="99"/>
     </w:p>
     <w:p>
       <w:pPr>
@@ -10149,15 +10258,14 @@
           <w:noProof/>
         </w:rPr>
       </w:pPr>
-      <w:bookmarkStart w:id="96" w:name="_Toc218508641"/>
+      <w:bookmarkStart w:id="100" w:name="_Toc218508641"/>
       <w:r>
         <w:rPr>
           <w:noProof/>
         </w:rPr>
-        <w:lastRenderedPageBreak/>
         <w:t>Office 365 groups</w:t>
       </w:r>
-      <w:bookmarkEnd w:id="96"/>
+      <w:bookmarkEnd w:id="100"/>
     </w:p>
     <w:p>
       <w:pPr>
@@ -10201,8 +10309,8 @@
           <w:rFonts w:cs="Arial"/>
         </w:rPr>
       </w:pPr>
-      <w:bookmarkStart w:id="97" w:name="BK_Entra_M365_Groups_Table"/>
-      <w:bookmarkEnd w:id="97"/>
+      <w:bookmarkStart w:id="101" w:name="BK_Entra_M365_Groups_Table"/>
+      <w:bookmarkEnd w:id="101"/>
       <w:r>
         <w:rPr>
           <w:rFonts w:cs="Arial"/>
@@ -10281,7 +10389,7 @@
           <w:noProof/>
         </w:rPr>
       </w:pPr>
-      <w:bookmarkStart w:id="98" w:name="_Toc218508642"/>
+      <w:bookmarkStart w:id="102" w:name="_Toc218508642"/>
       <w:r>
         <w:rPr>
           <w:rStyle w:val="Heading1Char"/>
@@ -10289,7 +10397,7 @@
         </w:rPr>
         <w:t>SharePoint Online Assessment</w:t>
       </w:r>
-      <w:bookmarkEnd w:id="98"/>
+      <w:bookmarkEnd w:id="102"/>
     </w:p>
     <w:p>
       <w:pPr>
@@ -10299,7 +10407,7 @@
           <w:lang w:val="en-US"/>
         </w:rPr>
       </w:pPr>
-      <w:bookmarkStart w:id="99" w:name="_Toc218508643"/>
+      <w:bookmarkStart w:id="103" w:name="_Toc218508643"/>
       <w:r>
         <w:rPr>
           <w:noProof/>
@@ -10313,7 +10421,7 @@
         </w:rPr>
         <w:t>ummary</w:t>
       </w:r>
-      <w:bookmarkEnd w:id="99"/>
+      <w:bookmarkEnd w:id="103"/>
     </w:p>
     <w:p>
       <w:pPr>
@@ -10362,8 +10470,8 @@
           <w:lang w:val="en-US"/>
         </w:rPr>
       </w:pPr>
-      <w:bookmarkStart w:id="100" w:name="BK_SPO_Summary_Table"/>
-      <w:bookmarkEnd w:id="100"/>
+      <w:bookmarkStart w:id="104" w:name="BK_SPO_Summary_Table"/>
+      <w:bookmarkEnd w:id="104"/>
     </w:p>
     <w:p>
       <w:pPr>
@@ -10495,14 +10603,15 @@
           <w:noProof/>
         </w:rPr>
       </w:pPr>
-      <w:bookmarkStart w:id="101" w:name="_Toc218508644"/>
+      <w:bookmarkStart w:id="105" w:name="_Toc218508644"/>
       <w:r>
         <w:rPr>
           <w:noProof/>
         </w:rPr>
+        <w:lastRenderedPageBreak/>
         <w:t>SharePoint Global Configurations</w:t>
       </w:r>
-      <w:bookmarkEnd w:id="101"/>
+      <w:bookmarkEnd w:id="105"/>
     </w:p>
     <w:p>
       <w:pPr>
@@ -10548,8 +10657,8 @@
           <w:lang w:val="en-US"/>
         </w:rPr>
       </w:pPr>
-      <w:bookmarkStart w:id="102" w:name="BK_SPO_Config_Table"/>
-      <w:bookmarkEnd w:id="102"/>
+      <w:bookmarkStart w:id="106" w:name="BK_SPO_Config_Table"/>
+      <w:bookmarkEnd w:id="106"/>
     </w:p>
     <w:p>
       <w:pPr>
@@ -10659,7 +10768,7 @@
           <w:szCs w:val="36"/>
         </w:rPr>
       </w:pPr>
-      <w:bookmarkStart w:id="103" w:name="_Toc218508645"/>
+      <w:bookmarkStart w:id="107" w:name="_Toc218508645"/>
       <w:r>
         <w:rPr>
           <w:rStyle w:val="Heading1Char"/>
@@ -10667,18 +10776,18 @@
         </w:rPr>
         <w:t>Infrastructure Assessment</w:t>
       </w:r>
-      <w:bookmarkEnd w:id="103"/>
+      <w:bookmarkEnd w:id="107"/>
     </w:p>
     <w:p>
       <w:pPr>
         <w:pStyle w:val="Heading2"/>
       </w:pPr>
-      <w:bookmarkStart w:id="104" w:name="_Toc218508599"/>
-      <w:bookmarkStart w:id="105" w:name="_Toc218508646"/>
+      <w:bookmarkStart w:id="108" w:name="_Toc218508599"/>
+      <w:bookmarkStart w:id="109" w:name="_Toc218508646"/>
       <w:r>
         <w:t>Change Control</w:t>
       </w:r>
-      <w:bookmarkEnd w:id="104"/>
+      <w:bookmarkEnd w:id="108"/>
     </w:p>
     <w:p>
       <w:pPr>
@@ -10707,28 +10816,28 @@
         </w:rPr>
         <w:t xml:space="preserve"> Control is a process used to ensure that changes to a system are introduced in a controlled and coordinated manner.  </w:t>
       </w:r>
-      <w:bookmarkStart w:id="106" w:name="_Int_SD01zgNE"/>
+      <w:bookmarkStart w:id="110" w:name="_Int_SD01zgNE"/>
       <w:r>
         <w:rPr>
           <w:rFonts w:cs="Arial"/>
         </w:rPr>
         <w:t>IT</w:t>
       </w:r>
-      <w:bookmarkEnd w:id="106"/>
+      <w:bookmarkEnd w:id="110"/>
       <w:r>
         <w:rPr>
           <w:rFonts w:cs="Arial"/>
         </w:rPr>
         <w:t xml:space="preserve"> reduced the possibility that unnecessary changes would be introduced without </w:t>
       </w:r>
-      <w:bookmarkStart w:id="107" w:name="_Int_XPDXrifH"/>
+      <w:bookmarkStart w:id="111" w:name="_Int_XPDXrifH"/>
       <w:r>
         <w:rPr>
           <w:rFonts w:cs="Arial"/>
         </w:rPr>
         <w:t>forethought</w:t>
       </w:r>
-      <w:bookmarkEnd w:id="107"/>
+      <w:bookmarkEnd w:id="111"/>
       <w:r>
         <w:rPr>
           <w:rFonts w:cs="Arial"/>
@@ -10748,7 +10857,6 @@
           <w:rFonts w:cs="Arial"/>
           <w:b/>
         </w:rPr>
-        <w:lastRenderedPageBreak/>
         <w:t>Findings</w:t>
       </w:r>
       <w:r>
@@ -10803,11 +10911,11 @@
       <w:pPr>
         <w:pStyle w:val="Heading2"/>
       </w:pPr>
-      <w:bookmarkStart w:id="108" w:name="_Toc218508600"/>
+      <w:bookmarkStart w:id="112" w:name="_Toc218508600"/>
       <w:r>
         <w:t>Blackout Periods</w:t>
       </w:r>
-      <w:bookmarkEnd w:id="108"/>
+      <w:bookmarkEnd w:id="112"/>
     </w:p>
     <w:p>
       <w:pPr>
@@ -10897,11 +11005,11 @@
       <w:pPr>
         <w:pStyle w:val="Heading2"/>
       </w:pPr>
-      <w:bookmarkStart w:id="109" w:name="_Toc218508601"/>
+      <w:bookmarkStart w:id="113" w:name="_Toc218508601"/>
       <w:r>
         <w:t>Remote Workers</w:t>
       </w:r>
-      <w:bookmarkEnd w:id="109"/>
+      <w:bookmarkEnd w:id="113"/>
     </w:p>
     <w:p>
       <w:pPr>
@@ -10963,7 +11071,7 @@
         </w:rPr>
         <w:t>pplication Deployment</w:t>
       </w:r>
-      <w:bookmarkEnd w:id="105"/>
+      <w:bookmarkEnd w:id="109"/>
     </w:p>
     <w:p>
       <w:pPr>
@@ -11014,14 +11122,14 @@
           <w:noProof/>
         </w:rPr>
       </w:pPr>
-      <w:bookmarkStart w:id="110" w:name="_Toc218508647"/>
+      <w:bookmarkStart w:id="114" w:name="_Toc218508647"/>
       <w:r>
         <w:rPr>
           <w:noProof/>
         </w:rPr>
         <w:t>Desktop Administration</w:t>
       </w:r>
-      <w:bookmarkEnd w:id="110"/>
+      <w:bookmarkEnd w:id="114"/>
     </w:p>
     <w:p>
       <w:pPr>
@@ -11046,7 +11154,14 @@
         <w:rPr>
           <w:rFonts w:cs="Arial"/>
         </w:rPr>
-        <w:t>Desktop Administration refers to the management, maintenance, and support of desktop systems within an organization's IT infrastructure. It involves tasks related to configuring, securing, optimizing, and troubleshooting desktop computers, ensuring that they are functioning efficiently and securely for end-users.</w:t>
+        <w:t xml:space="preserve">Desktop Administration refers to the management, maintenance, and support of desktop systems within an organization's IT infrastructure. It involves tasks related to configuring, securing, </w:t>
+      </w:r>
+      <w:r>
+        <w:rPr>
+          <w:rFonts w:cs="Arial"/>
+        </w:rPr>
+        <w:lastRenderedPageBreak/>
+        <w:t>optimizing, and troubleshooting desktop computers, ensuring that they are functioning efficiently and securely for end-users.</w:t>
       </w:r>
     </w:p>
     <w:p>
@@ -11122,14 +11237,14 @@
           <w:noProof/>
         </w:rPr>
       </w:pPr>
-      <w:bookmarkStart w:id="111" w:name="_Toc218508648"/>
+      <w:bookmarkStart w:id="115" w:name="_Toc218508648"/>
       <w:r>
         <w:rPr>
           <w:noProof/>
         </w:rPr>
         <w:t>Virtual Private Networking</w:t>
       </w:r>
-      <w:bookmarkEnd w:id="111"/>
+      <w:bookmarkEnd w:id="115"/>
     </w:p>
     <w:p>
       <w:pPr>
@@ -11274,14 +11389,14 @@
           <w:noProof/>
         </w:rPr>
       </w:pPr>
-      <w:bookmarkStart w:id="112" w:name="_Toc218508649"/>
+      <w:bookmarkStart w:id="116" w:name="_Toc218508649"/>
       <w:r>
         <w:rPr>
           <w:noProof/>
         </w:rPr>
         <w:t>Wireless</w:t>
       </w:r>
-      <w:bookmarkEnd w:id="112"/>
+      <w:bookmarkEnd w:id="116"/>
     </w:p>
     <w:p>
       <w:pPr>
@@ -11301,14 +11416,7 @@
         <w:rPr>
           <w:rFonts w:cs="Arial"/>
         </w:rPr>
-        <w:t xml:space="preserve">Wi-Fi connectivity can be initiated in multiple ways.  The typical approaches are: Automatically connect (either at logon or just after), Authenticated after logon, and validated via certificate.  In the first case of automatically connected, the Wi-Fi can be treated the same as a Wired </w:t>
-      </w:r>
-      <w:r>
-        <w:rPr>
-          <w:rFonts w:cs="Arial"/>
-        </w:rPr>
-        <w:lastRenderedPageBreak/>
-        <w:t>connection.  In either of the other two cases a device on Wi-Fi can require additional effort during a migration event.</w:t>
+        <w:t>Wi-Fi connectivity can be initiated in multiple ways.  The typical approaches are: Automatically connect (either at logon or just after), Authenticated after logon, and validated via certificate.  In the first case of automatically connected, the Wi-Fi can be treated the same as a Wired connection.  In either of the other two cases a device on Wi-Fi can require additional effort during a migration event.</w:t>
       </w:r>
     </w:p>
     <w:p>
@@ -11366,14 +11474,14 @@
         </w:rPr>
         <w:t xml:space="preserve">/M365 Wi-Fi should not be impacted.  Should </w:t>
       </w:r>
-      <w:bookmarkStart w:id="113" w:name="_Int_cQdpeWAB"/>
+      <w:bookmarkStart w:id="117" w:name="_Int_cQdpeWAB"/>
       <w:r>
         <w:rPr>
           <w:rFonts w:cs="Arial"/>
         </w:rPr>
         <w:t>an AD</w:t>
       </w:r>
-      <w:bookmarkEnd w:id="113"/>
+      <w:bookmarkEnd w:id="117"/>
       <w:r>
         <w:rPr>
           <w:rFonts w:cs="Arial"/>
@@ -11389,7 +11497,7 @@
           <w:lang w:val="fr-FR"/>
         </w:rPr>
       </w:pPr>
-      <w:bookmarkStart w:id="114" w:name="_Toc218508650"/>
+      <w:bookmarkStart w:id="118" w:name="_Toc218508650"/>
       <w:r>
         <w:rPr>
           <w:noProof/>
@@ -11397,7 +11505,7 @@
         </w:rPr>
         <w:t>Virtual Desktop (VDI, Citrix, etc.)</w:t>
       </w:r>
-      <w:bookmarkEnd w:id="114"/>
+      <w:bookmarkEnd w:id="118"/>
     </w:p>
     <w:p>
       <w:r>
@@ -11497,7 +11605,7 @@
           <w:noProof/>
         </w:rPr>
       </w:pPr>
-      <w:bookmarkStart w:id="115" w:name="_Toc218508651"/>
+      <w:bookmarkStart w:id="119" w:name="_Toc218508651"/>
       <w:r>
         <w:rPr>
           <w:noProof/>
@@ -11505,7 +11613,7 @@
         <w:lastRenderedPageBreak/>
         <w:t>Appendices</w:t>
       </w:r>
-      <w:bookmarkEnd w:id="115"/>
+      <w:bookmarkEnd w:id="119"/>
     </w:p>
     <w:p>
       <w:pPr>
@@ -11514,7 +11622,7 @@
           <w:u w:color="FFFFFF"/>
         </w:rPr>
       </w:pPr>
-      <w:bookmarkStart w:id="116" w:name="_Toc218508652"/>
+      <w:bookmarkStart w:id="120" w:name="_Toc218508652"/>
       <w:r>
         <w:rPr>
           <w:noProof/>
@@ -11552,49 +11660,49 @@
         </w:rPr>
         <w:t>Integration Questions/Answers</w:t>
       </w:r>
-      <w:bookmarkEnd w:id="116"/>
+      <w:bookmarkEnd w:id="120"/>
     </w:p>
     <w:p>
       <w:pPr>
         <w:pStyle w:val="Heading1"/>
       </w:pPr>
-      <w:bookmarkStart w:id="117" w:name="_Cleanup"/>
-      <w:bookmarkStart w:id="118" w:name="_Toc50122336"/>
-      <w:bookmarkStart w:id="119" w:name="_Toc218508653"/>
+      <w:bookmarkStart w:id="121" w:name="_Cleanup"/>
+      <w:bookmarkStart w:id="122" w:name="_Toc50122336"/>
+      <w:bookmarkStart w:id="123" w:name="_Toc218508653"/>
       <w:bookmarkEnd w:id="6"/>
       <w:bookmarkEnd w:id="7"/>
       <w:bookmarkEnd w:id="8"/>
       <w:bookmarkEnd w:id="9"/>
       <w:bookmarkEnd w:id="10"/>
       <w:bookmarkEnd w:id="11"/>
-      <w:bookmarkEnd w:id="117"/>
+      <w:bookmarkEnd w:id="121"/>
       <w:r>
         <w:t>About us</w:t>
       </w:r>
-      <w:bookmarkEnd w:id="118"/>
-      <w:bookmarkEnd w:id="119"/>
-    </w:p>
-    <w:p>
-      <w:pPr>
-        <w:pStyle w:val="Heading2"/>
-      </w:pPr>
-      <w:bookmarkStart w:id="120" w:name="_Toc50118496"/>
-      <w:bookmarkStart w:id="121" w:name="_Toc50118071"/>
-      <w:bookmarkStart w:id="122" w:name="_Toc50122337"/>
-      <w:bookmarkStart w:id="123" w:name="_Toc218508654"/>
-      <w:r>
-        <w:t xml:space="preserve">Where Next </w:t>
-      </w:r>
-      <w:r>
-        <w:t>Meets</w:t>
-      </w:r>
-      <w:r>
-        <w:t xml:space="preserve"> Now</w:t>
-      </w:r>
-      <w:bookmarkEnd w:id="120"/>
-      <w:bookmarkEnd w:id="121"/>
       <w:bookmarkEnd w:id="122"/>
       <w:bookmarkEnd w:id="123"/>
+    </w:p>
+    <w:p>
+      <w:pPr>
+        <w:pStyle w:val="Heading2"/>
+      </w:pPr>
+      <w:bookmarkStart w:id="124" w:name="_Toc50118496"/>
+      <w:bookmarkStart w:id="125" w:name="_Toc50118071"/>
+      <w:bookmarkStart w:id="126" w:name="_Toc50122337"/>
+      <w:bookmarkStart w:id="127" w:name="_Toc218508654"/>
+      <w:r>
+        <w:t xml:space="preserve">Where Next </w:t>
+      </w:r>
+      <w:r>
+        <w:t>Meets</w:t>
+      </w:r>
+      <w:r>
+        <w:t xml:space="preserve"> Now</w:t>
+      </w:r>
+      <w:bookmarkEnd w:id="124"/>
+      <w:bookmarkEnd w:id="125"/>
+      <w:bookmarkEnd w:id="126"/>
+      <w:bookmarkEnd w:id="127"/>
     </w:p>
     <w:p>
       <w:r>
@@ -11625,57 +11733,57 @@
       <w:pPr>
         <w:pStyle w:val="Heading2"/>
       </w:pPr>
-      <w:bookmarkStart w:id="124" w:name="_Toc50118497"/>
-      <w:bookmarkStart w:id="125" w:name="_Toc50118072"/>
-      <w:bookmarkStart w:id="126" w:name="_Toc50122338"/>
-      <w:bookmarkStart w:id="127" w:name="_Toc218508655"/>
+      <w:bookmarkStart w:id="128" w:name="_Toc50118497"/>
+      <w:bookmarkStart w:id="129" w:name="_Toc50118072"/>
+      <w:bookmarkStart w:id="130" w:name="_Toc50122338"/>
+      <w:bookmarkStart w:id="131" w:name="_Toc218508655"/>
       <w:r>
         <w:t>Contacting Quest</w:t>
-      </w:r>
-      <w:bookmarkEnd w:id="124"/>
-      <w:bookmarkEnd w:id="125"/>
-      <w:bookmarkEnd w:id="126"/>
-      <w:bookmarkEnd w:id="127"/>
-    </w:p>
-    <w:p>
-      <w:r>
-        <w:rPr>
-          <w:color w:val="262626"/>
-        </w:rPr>
-        <w:t xml:space="preserve">For sales or other inquiries, visit  </w:t>
-      </w:r>
-      <w:hyperlink r:id="rId19" w:history="1">
-        <w:r>
-          <w:rPr>
-            <w:rStyle w:val="Hyperlink"/>
-            <w:rFonts w:eastAsiaTheme="majorEastAsia" w:cs="Arial"/>
-            <w:sz w:val="22"/>
-          </w:rPr>
-          <w:t>www.quest.com/company/contact-us.aspx</w:t>
-        </w:r>
-      </w:hyperlink>
-      <w:r>
-        <w:rPr>
-          <w:color w:val="262626"/>
-        </w:rPr>
-        <w:t>.</w:t>
-      </w:r>
-    </w:p>
-    <w:p>
-      <w:pPr>
-        <w:pStyle w:val="Heading2"/>
-      </w:pPr>
-      <w:bookmarkStart w:id="128" w:name="_Toc50118498"/>
-      <w:bookmarkStart w:id="129" w:name="_Toc50118073"/>
-      <w:bookmarkStart w:id="130" w:name="_Toc50122339"/>
-      <w:bookmarkStart w:id="131" w:name="_Toc218508656"/>
-      <w:r>
-        <w:t>Technical support resources</w:t>
       </w:r>
       <w:bookmarkEnd w:id="128"/>
       <w:bookmarkEnd w:id="129"/>
       <w:bookmarkEnd w:id="130"/>
       <w:bookmarkEnd w:id="131"/>
+    </w:p>
+    <w:p>
+      <w:r>
+        <w:rPr>
+          <w:color w:val="262626"/>
+        </w:rPr>
+        <w:t xml:space="preserve">For sales or other inquiries, visit  </w:t>
+      </w:r>
+      <w:hyperlink r:id="rId19" w:history="1">
+        <w:r>
+          <w:rPr>
+            <w:rStyle w:val="Hyperlink"/>
+            <w:rFonts w:eastAsiaTheme="majorEastAsia" w:cs="Arial"/>
+            <w:sz w:val="22"/>
+          </w:rPr>
+          <w:t>www.quest.com/company/contact-us.aspx</w:t>
+        </w:r>
+      </w:hyperlink>
+      <w:r>
+        <w:rPr>
+          <w:color w:val="262626"/>
+        </w:rPr>
+        <w:t>.</w:t>
+      </w:r>
+    </w:p>
+    <w:p>
+      <w:pPr>
+        <w:pStyle w:val="Heading2"/>
+      </w:pPr>
+      <w:bookmarkStart w:id="132" w:name="_Toc50118498"/>
+      <w:bookmarkStart w:id="133" w:name="_Toc50118073"/>
+      <w:bookmarkStart w:id="134" w:name="_Toc50122339"/>
+      <w:bookmarkStart w:id="135" w:name="_Toc218508656"/>
+      <w:r>
+        <w:t>Technical support resources</w:t>
+      </w:r>
+      <w:bookmarkEnd w:id="132"/>
+      <w:bookmarkEnd w:id="133"/>
+      <w:bookmarkEnd w:id="134"/>
+      <w:bookmarkEnd w:id="135"/>
     </w:p>
     <w:p>
       <w:r>
@@ -20271,6 +20379,12 @@
 </file>
 
 <file path=customXml/item1.xml><?xml version="1.0" encoding="utf-8"?>
+<p:properties xmlns:p="http://schemas.microsoft.com/office/2006/metadata/properties" xmlns:xsi="http://www.w3.org/2001/XMLSchema-instance" xmlns:pc="http://schemas.microsoft.com/office/infopath/2007/PartnerControls">
+  <documentManagement/>
+</p:properties>
+</file>
+
+<file path=customXml/item2.xml><?xml version="1.0" encoding="utf-8"?>
 <ct:contentTypeSchema xmlns:ct="http://schemas.microsoft.com/office/2006/metadata/contentType" xmlns:ma="http://schemas.microsoft.com/office/2006/metadata/properties/metaAttributes" ct:_="" ma:_="" ma:contentTypeName="Document" ma:contentTypeID="0x010100E8CB6F3EDD43474AA10481D50BB64020" ma:contentTypeVersion="4" ma:contentTypeDescription="Create a new document." ma:contentTypeScope="" ma:versionID="be0fb91248b2e97ea45459c2c5c0e22c">
   <xsd:schema xmlns:xsd="http://www.w3.org/2001/XMLSchema" xmlns:xs="http://www.w3.org/2001/XMLSchema" xmlns:p="http://schemas.microsoft.com/office/2006/metadata/properties" xmlns:ns2="564344db-7381-46cc-ad20-5587031b0ed9" targetNamespace="http://schemas.microsoft.com/office/2006/metadata/properties" ma:root="true" ma:fieldsID="9b3be8367740804d7b19f678bfda6a23" ns2:_="">
     <xsd:import namespace="564344db-7381-46cc-ad20-5587031b0ed9"/>
@@ -20414,17 +20528,7 @@
 </ct:contentTypeSchema>
 </file>
 
-<file path=customXml/item2.xml><?xml version="1.0" encoding="utf-8"?>
-<p:properties xmlns:p="http://schemas.microsoft.com/office/2006/metadata/properties" xmlns:xsi="http://www.w3.org/2001/XMLSchema-instance" xmlns:pc="http://schemas.microsoft.com/office/infopath/2007/PartnerControls">
-  <documentManagement/>
-</p:properties>
-</file>
-
 <file path=customXml/item3.xml><?xml version="1.0" encoding="utf-8"?>
-<b:Sources xmlns:b="http://schemas.openxmlformats.org/officeDocument/2006/bibliography" xmlns="http://schemas.openxmlformats.org/officeDocument/2006/bibliography" SelectedStyle="/APA.XSL" StyleName="APA"/>
-</file>
-
-<file path=customXml/item4.xml><?xml version="1.0" encoding="utf-8"?>
 <?mso-contentType ?>
 <FormTemplates xmlns="http://schemas.microsoft.com/sharepoint/v3/contenttype/forms">
   <Display>DocumentLibraryForm</Display>
@@ -20433,7 +20537,20 @@
 </FormTemplates>
 </file>
 
+<file path=customXml/item4.xml><?xml version="1.0" encoding="utf-8"?>
+<b:Sources xmlns:b="http://schemas.openxmlformats.org/officeDocument/2006/bibliography" xmlns="http://schemas.openxmlformats.org/officeDocument/2006/bibliography" SelectedStyle="/APA.XSL" StyleName="APA"/>
+</file>
+
 <file path=customXml/itemProps1.xml><?xml version="1.0" encoding="utf-8"?>
+<ds:datastoreItem xmlns:ds="http://schemas.openxmlformats.org/officeDocument/2006/customXml" ds:itemID="{EEF0FF5E-EC80-4EC7-816E-8FD3FB1F00C5}">
+  <ds:schemaRefs>
+    <ds:schemaRef ds:uri="http://schemas.microsoft.com/office/2006/metadata/properties"/>
+    <ds:schemaRef ds:uri="http://schemas.microsoft.com/office/infopath/2007/PartnerControls"/>
+  </ds:schemaRefs>
+</ds:datastoreItem>
+</file>
+
+<file path=customXml/itemProps2.xml><?xml version="1.0" encoding="utf-8"?>
 <ds:datastoreItem xmlns:ds="http://schemas.openxmlformats.org/officeDocument/2006/customXml" ds:itemID="{EC30F5FF-22C8-4A05-8DCE-BA118E3692D7}">
   <ds:schemaRefs>
     <ds:schemaRef ds:uri="http://schemas.microsoft.com/office/2006/metadata/contentType"/>
@@ -20451,27 +20568,18 @@
 </ds:datastoreItem>
 </file>
 
-<file path=customXml/itemProps2.xml><?xml version="1.0" encoding="utf-8"?>
-<ds:datastoreItem xmlns:ds="http://schemas.openxmlformats.org/officeDocument/2006/customXml" ds:itemID="{EEF0FF5E-EC80-4EC7-816E-8FD3FB1F00C5}">
+<file path=customXml/itemProps3.xml><?xml version="1.0" encoding="utf-8"?>
+<ds:datastoreItem xmlns:ds="http://schemas.openxmlformats.org/officeDocument/2006/customXml" ds:itemID="{6830A3BC-7801-49DF-97A3-727FA35DA724}">
   <ds:schemaRefs>
-    <ds:schemaRef ds:uri="http://schemas.microsoft.com/office/2006/metadata/properties"/>
-    <ds:schemaRef ds:uri="http://schemas.microsoft.com/office/infopath/2007/PartnerControls"/>
+    <ds:schemaRef ds:uri="http://schemas.microsoft.com/sharepoint/v3/contenttype/forms"/>
   </ds:schemaRefs>
 </ds:datastoreItem>
 </file>
 
-<file path=customXml/itemProps3.xml><?xml version="1.0" encoding="utf-8"?>
+<file path=customXml/itemProps4.xml><?xml version="1.0" encoding="utf-8"?>
 <ds:datastoreItem xmlns:ds="http://schemas.openxmlformats.org/officeDocument/2006/customXml" ds:itemID="{1F2F4FAC-1BAA-4C15-8BEC-869F6AC26C67}">
   <ds:schemaRefs>
     <ds:schemaRef ds:uri="http://schemas.openxmlformats.org/officeDocument/2006/bibliography"/>
   </ds:schemaRefs>
 </ds:datastoreItem>
-</file>
-
-<file path=customXml/itemProps4.xml><?xml version="1.0" encoding="utf-8"?>
-<ds:datastoreItem xmlns:ds="http://schemas.openxmlformats.org/officeDocument/2006/customXml" ds:itemID="{6830A3BC-7801-49DF-97A3-727FA35DA724}">
-  <ds:schemaRefs>
-    <ds:schemaRef ds:uri="http://schemas.microsoft.com/sharepoint/v3/contenttype/forms"/>
-  </ds:schemaRefs>
-</ds:datastoreItem>
 </file>
</xml_diff>

<commit_message>
Updated assessment and analysis
Updated assessment and analysis
</commit_message>
<xml_diff>
--- a/src/Migration.Toolkit.Assessment/config/Template - Discovery and Assessment Findings Report V1.0 - Quest 2025 style.docx
+++ b/src/Migration.Toolkit.Assessment/config/Template - Discovery and Assessment Findings Report V1.0 - Quest 2025 style.docx
@@ -23,16 +23,16 @@
         <mc:AlternateContent>
           <mc:Choice Requires="wps">
             <w:drawing>
-              <wp:anchor distT="0" distB="0" distL="114300" distR="114300" simplePos="0" relativeHeight="251658240" behindDoc="0" locked="0" layoutInCell="1" allowOverlap="1" wp14:anchorId="22668382" wp14:editId="29F7282F">
+              <wp:anchor distT="0" distB="0" distL="114300" distR="114300" simplePos="0" relativeHeight="251658240" behindDoc="0" locked="0" layoutInCell="1" allowOverlap="1" wp14:anchorId="22668382" wp14:editId="1798F6B8">
                 <wp:simplePos x="0" y="0"/>
                 <wp:positionH relativeFrom="margin">
-                  <wp:align>left</wp:align>
+                  <wp:posOffset>-11875</wp:posOffset>
                 </wp:positionH>
                 <wp:positionV relativeFrom="paragraph">
-                  <wp:posOffset>1204693</wp:posOffset>
+                  <wp:posOffset>11875</wp:posOffset>
                 </wp:positionV>
-                <wp:extent cx="5072743" cy="4659086"/>
-                <wp:effectExtent l="0" t="0" r="0" b="8255"/>
+                <wp:extent cx="5950445" cy="8205850"/>
+                <wp:effectExtent l="0" t="0" r="0" b="5080"/>
                 <wp:wrapNone/>
                 <wp:docPr id="1016791717" name="Rounded Rectangle 7"/>
                 <wp:cNvGraphicFramePr/>
@@ -43,7 +43,7 @@
                       <wps:spPr>
                         <a:xfrm>
                           <a:off x="0" y="0"/>
-                          <a:ext cx="5072743" cy="4659086"/>
+                          <a:ext cx="5950445" cy="8205850"/>
                         </a:xfrm>
                         <a:prstGeom prst="roundRect">
                           <a:avLst>
@@ -124,6 +124,7 @@
                               </w:rPr>
                               <w:t>N</w:t>
                             </w:r>
+                            <w:proofErr w:type="spellStart"/>
                             <w:r>
                               <w:rPr>
                                 <w:rFonts w:eastAsiaTheme="majorEastAsia" w:cstheme="majorBidi"/>
@@ -136,6 +137,7 @@
                               </w:rPr>
                               <w:t>ame</w:t>
                             </w:r>
+                            <w:proofErr w:type="spellEnd"/>
                             <w:r>
                               <w:rPr>
                                 <w:rFonts w:eastAsiaTheme="majorEastAsia" w:cstheme="majorBidi"/>
@@ -236,7 +238,7 @@
                                 <w:iCs/>
                                 <w:color w:val="FFFFFF" w:themeColor="background1"/>
                               </w:rPr>
-                              <w:t>Quest Professional Services Delivery Team</w:t>
+                              <w:t>Delivery Team</w:t>
                             </w:r>
                           </w:p>
                           <w:p>
@@ -251,7 +253,7 @@
                                 <w:rFonts w:cs="Arial"/>
                                 <w:color w:val="FFFFFF" w:themeColor="background1"/>
                               </w:rPr>
-                              <w:t>Project Manager: Joe Devenney</w:t>
+                              <w:t xml:space="preserve">Project Manager: </w:t>
                             </w:r>
                           </w:p>
                           <w:p>
@@ -329,7 +331,7 @@
           </mc:Choice>
           <mc:Fallback>
             <w:pict>
-              <v:roundrect w14:anchorId="22668382" id="Rounded Rectangle 7" o:spid="_x0000_s1026" style="position:absolute;margin-left:0;margin-top:94.85pt;width:399.45pt;height:366.85pt;z-index:251658240;visibility:visible;mso-wrap-style:square;mso-width-percent:0;mso-height-percent:0;mso-wrap-distance-left:9pt;mso-wrap-distance-top:0;mso-wrap-distance-right:9pt;mso-wrap-distance-bottom:0;mso-position-horizontal:left;mso-position-horizontal-relative:margin;mso-position-vertical:absolute;mso-position-vertical-relative:text;mso-width-percent:0;mso-height-percent:0;mso-width-relative:margin;mso-height-relative:margin;v-text-anchor:middle" arcsize="3908f" o:gfxdata="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" fillcolor="#0a8cbf" stroked="f" strokeweight="1pt">
+              <v:roundrect w14:anchorId="22668382" id="Rounded Rectangle 7" o:spid="_x0000_s1026" style="position:absolute;margin-left:-.95pt;margin-top:.95pt;width:468.55pt;height:646.15pt;z-index:251658240;visibility:visible;mso-wrap-style:square;mso-width-percent:0;mso-height-percent:0;mso-wrap-distance-left:9pt;mso-wrap-distance-top:0;mso-wrap-distance-right:9pt;mso-wrap-distance-bottom:0;mso-position-horizontal:absolute;mso-position-horizontal-relative:margin;mso-position-vertical:absolute;mso-position-vertical-relative:text;mso-width-percent:0;mso-height-percent:0;mso-width-relative:margin;mso-height-relative:margin;v-text-anchor:middle" arcsize="3908f" o:gfxdata="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" fillcolor="#0a8cbf" stroked="f" strokeweight="1pt">
                 <v:stroke joinstyle="miter"/>
                 <v:textbox inset="21.6pt,,21.6pt">
                   <w:txbxContent>
@@ -395,6 +397,7 @@
                         </w:rPr>
                         <w:t>N</w:t>
                       </w:r>
+                      <w:proofErr w:type="spellStart"/>
                       <w:r>
                         <w:rPr>
                           <w:rFonts w:eastAsiaTheme="majorEastAsia" w:cstheme="majorBidi"/>
@@ -407,6 +410,7 @@
                         </w:rPr>
                         <w:t>ame</w:t>
                       </w:r>
+                      <w:proofErr w:type="spellEnd"/>
                       <w:r>
                         <w:rPr>
                           <w:rFonts w:eastAsiaTheme="majorEastAsia" w:cstheme="majorBidi"/>
@@ -507,7 +511,7 @@
                           <w:iCs/>
                           <w:color w:val="FFFFFF" w:themeColor="background1"/>
                         </w:rPr>
-                        <w:t>Quest Professional Services Delivery Team</w:t>
+                        <w:t>Delivery Team</w:t>
                       </w:r>
                     </w:p>
                     <w:p>
@@ -522,7 +526,7 @@
                           <w:rFonts w:cs="Arial"/>
                           <w:color w:val="FFFFFF" w:themeColor="background1"/>
                         </w:rPr>
-                        <w:t>Project Manager: Joe Devenney</w:t>
+                        <w:t xml:space="preserve">Project Manager: </w:t>
                       </w:r>
                     </w:p>
                     <w:p>
@@ -585,68 +589,6 @@
             </w:pict>
           </mc:Fallback>
         </mc:AlternateContent>
-      </w:r>
-      <w:r>
-        <w:rPr>
-          <w:noProof/>
-          <w:color w:val="0A0E20"/>
-          <w14:ligatures w14:val="standardContextual"/>
-        </w:rPr>
-        <w:drawing>
-          <wp:anchor distT="0" distB="0" distL="114300" distR="114300" simplePos="0" relativeHeight="251658241" behindDoc="1" locked="0" layoutInCell="1" allowOverlap="1" wp14:anchorId="01254D13" wp14:editId="16A166A0">
-            <wp:simplePos x="0" y="0"/>
-            <wp:positionH relativeFrom="column">
-              <wp:posOffset>-903579</wp:posOffset>
-            </wp:positionH>
-            <wp:positionV relativeFrom="page">
-              <wp:posOffset>-42530</wp:posOffset>
-            </wp:positionV>
-            <wp:extent cx="7797424" cy="10090785"/>
-            <wp:effectExtent l="0" t="0" r="635" b="5715"/>
-            <wp:wrapNone/>
-            <wp:docPr id="466827391" name="Picture 2" descr="A blue and green spiraling lines&#10;&#10;AI-generated content may be incorrect."/>
-            <wp:cNvGraphicFramePr>
-              <a:graphicFrameLocks xmlns:a="http://schemas.openxmlformats.org/drawingml/2006/main" noChangeAspect="1"/>
-            </wp:cNvGraphicFramePr>
-            <a:graphic xmlns:a="http://schemas.openxmlformats.org/drawingml/2006/main">
-              <a:graphicData uri="http://schemas.openxmlformats.org/drawingml/2006/picture">
-                <pic:pic xmlns:pic="http://schemas.openxmlformats.org/drawingml/2006/picture">
-                  <pic:nvPicPr>
-                    <pic:cNvPr id="466827391" name="Picture 2" descr="A blue and green spiraling lines&#10;&#10;AI-generated content may be incorrect."/>
-                    <pic:cNvPicPr/>
-                  </pic:nvPicPr>
-                  <pic:blipFill>
-                    <a:blip r:embed="rId11">
-                      <a:extLst>
-                        <a:ext uri="{28A0092B-C50C-407E-A947-70E740481C1C}">
-                          <a14:useLocalDpi xmlns:a14="http://schemas.microsoft.com/office/drawing/2010/main" val="0"/>
-                        </a:ext>
-                      </a:extLst>
-                    </a:blip>
-                    <a:stretch>
-                      <a:fillRect/>
-                    </a:stretch>
-                  </pic:blipFill>
-                  <pic:spPr>
-                    <a:xfrm>
-                      <a:off x="0" y="0"/>
-                      <a:ext cx="7797424" cy="10090785"/>
-                    </a:xfrm>
-                    <a:prstGeom prst="rect">
-                      <a:avLst/>
-                    </a:prstGeom>
-                  </pic:spPr>
-                </pic:pic>
-              </a:graphicData>
-            </a:graphic>
-            <wp14:sizeRelH relativeFrom="page">
-              <wp14:pctWidth>0</wp14:pctWidth>
-            </wp14:sizeRelH>
-            <wp14:sizeRelV relativeFrom="page">
-              <wp14:pctHeight>0</wp14:pctHeight>
-            </wp14:sizeRelV>
-          </wp:anchor>
-        </w:drawing>
       </w:r>
       <w:r>
         <w:rPr>
@@ -1382,6 +1324,7 @@
               </w:rPr>
               <w:t>N</w:t>
             </w:r>
+            <w:proofErr w:type="spellStart"/>
             <w:r>
               <w:rPr>
                 <w:color w:val="4B4B4B" w:themeColor="accent6"/>
@@ -1389,6 +1332,7 @@
               </w:rPr>
               <w:t>ame</w:t>
             </w:r>
+            <w:proofErr w:type="spellEnd"/>
             <w:r>
               <w:rPr>
                 <w:color w:val="4B4B4B" w:themeColor="accent6"/>
@@ -7268,7 +7212,10 @@
         </w:rPr>
       </w:pPr>
       <w:r>
-        <w:t xml:space="preserve">Quest has conducted a discovery and assessment of </w:t>
+        <w:t>The delivery team</w:t>
+      </w:r>
+      <w:r>
+        <w:t xml:space="preserve"> has conducted a discovery and assessment of </w:t>
       </w:r>
       <w:r>
         <w:t>[Customer_Name]</w:t>
@@ -7367,7 +7314,7 @@
                     <pic:cNvPicPr/>
                   </pic:nvPicPr>
                   <pic:blipFill>
-                    <a:blip r:embed="rId12"/>
+                    <a:blip r:embed="rId11"/>
                     <a:stretch>
                       <a:fillRect/>
                     </a:stretch>
@@ -9092,11 +9039,11 @@
           <w:lang w:val="en-US"/>
         </w:rPr>
         <w:sectPr>
-          <w:headerReference w:type="default" r:id="rId13"/>
-          <w:footerReference w:type="even" r:id="rId14"/>
-          <w:footerReference w:type="default" r:id="rId15"/>
-          <w:headerReference w:type="first" r:id="rId16"/>
-          <w:footerReference w:type="first" r:id="rId17"/>
+          <w:headerReference w:type="default" r:id="rId12"/>
+          <w:footerReference w:type="even" r:id="rId13"/>
+          <w:footerReference w:type="default" r:id="rId14"/>
+          <w:headerReference w:type="first" r:id="rId15"/>
+          <w:footerReference w:type="first" r:id="rId16"/>
           <w:pgSz w:w="12240" w:h="15840"/>
           <w:pgMar w:top="1440" w:right="1440" w:bottom="1440" w:left="1440" w:header="720" w:footer="640" w:gutter="0"/>
           <w:cols w:space="720"/>
@@ -9182,7 +9129,19 @@
         <w:rPr>
           <w:rFonts w:cs="Arial"/>
         </w:rPr>
-        <w:t xml:space="preserve">  Quest recommends recreation for full use of the guest accounts as this can be timed with when the accounts go live and it sends the guest users a notification.</w:t>
+        <w:t xml:space="preserve">  </w:t>
+      </w:r>
+      <w:r>
+        <w:rPr>
+          <w:rFonts w:cs="Arial"/>
+        </w:rPr>
+        <w:t>The delivery team</w:t>
+      </w:r>
+      <w:r>
+        <w:rPr>
+          <w:rFonts w:cs="Arial"/>
+        </w:rPr>
+        <w:t xml:space="preserve"> recommends recreation for full use of the guest accounts as this can be timed with when the accounts go live and it sends the guest users a notification.</w:t>
       </w:r>
       <w:r>
         <w:rPr>
@@ -12044,6 +12003,12 @@
         <w:t xml:space="preserve"> None</w:t>
       </w:r>
     </w:p>
+    <w:bookmarkEnd w:id="6"/>
+    <w:bookmarkEnd w:id="7"/>
+    <w:bookmarkEnd w:id="8"/>
+    <w:bookmarkEnd w:id="9"/>
+    <w:bookmarkEnd w:id="10"/>
+    <w:bookmarkEnd w:id="11"/>
     <w:p>
       <w:pPr>
         <w:tabs>
@@ -12059,328 +12024,6 @@
           <w:szCs w:val="40"/>
           <w:lang w:val="en-US"/>
           <w14:ligatures w14:val="standardContextual"/>
-        </w:rPr>
-      </w:pPr>
-      <w:r>
-        <w:rPr>
-          <w:noProof/>
-        </w:rPr>
-        <w:br w:type="page"/>
-      </w:r>
-    </w:p>
-    <w:p>
-      <w:pPr>
-        <w:pStyle w:val="Heading1"/>
-        <w:rPr>
-          <w:noProof/>
-        </w:rPr>
-      </w:pPr>
-      <w:bookmarkStart w:id="124" w:name="_Toc220677178"/>
-      <w:r>
-        <w:rPr>
-          <w:noProof/>
-        </w:rPr>
-        <w:lastRenderedPageBreak/>
-        <w:t>Appendices</w:t>
-      </w:r>
-      <w:bookmarkEnd w:id="124"/>
-    </w:p>
-    <w:p>
-      <w:pPr>
-        <w:pStyle w:val="Heading2"/>
-        <w:rPr>
-          <w:u w:color="FFFFFF"/>
-        </w:rPr>
-      </w:pPr>
-      <w:bookmarkStart w:id="125" w:name="_Toc220677179"/>
-      <w:r>
-        <w:rPr>
-          <w:noProof/>
-        </w:rPr>
-        <w:t xml:space="preserve">Appendix </w:t>
-      </w:r>
-      <w:r>
-        <w:rPr>
-          <w:noProof/>
-        </w:rPr>
-        <w:t>A</w:t>
-      </w:r>
-      <w:r>
-        <w:rPr>
-          <w:noProof/>
-        </w:rPr>
-        <w:t xml:space="preserve"> – </w:t>
-      </w:r>
-      <w:r>
-        <w:rPr>
-          <w:noProof/>
-        </w:rPr>
-        <w:t>[Customer_Name]</w:t>
-      </w:r>
-      <w:r>
-        <w:rPr>
-          <w:noProof/>
-          <w:lang w:val="en-US"/>
-        </w:rPr>
-        <w:t xml:space="preserve"> </w:t>
-      </w:r>
-      <w:r>
-        <w:rPr>
-          <w:noProof/>
-        </w:rPr>
-        <w:t>Integration Questions/Answers</w:t>
-      </w:r>
-      <w:bookmarkEnd w:id="125"/>
-    </w:p>
-    <w:p>
-      <w:pPr>
-        <w:pStyle w:val="Heading1"/>
-      </w:pPr>
-      <w:bookmarkStart w:id="126" w:name="_Cleanup"/>
-      <w:bookmarkStart w:id="127" w:name="_Toc50122336"/>
-      <w:bookmarkStart w:id="128" w:name="_Toc220677180"/>
-      <w:bookmarkEnd w:id="6"/>
-      <w:bookmarkEnd w:id="7"/>
-      <w:bookmarkEnd w:id="8"/>
-      <w:bookmarkEnd w:id="9"/>
-      <w:bookmarkEnd w:id="10"/>
-      <w:bookmarkEnd w:id="11"/>
-      <w:bookmarkEnd w:id="126"/>
-      <w:r>
-        <w:t>About us</w:t>
-      </w:r>
-      <w:bookmarkEnd w:id="127"/>
-      <w:bookmarkEnd w:id="128"/>
-    </w:p>
-    <w:p>
-      <w:pPr>
-        <w:pStyle w:val="Heading2"/>
-      </w:pPr>
-      <w:bookmarkStart w:id="129" w:name="_Toc50118496"/>
-      <w:bookmarkStart w:id="130" w:name="_Toc50118071"/>
-      <w:bookmarkStart w:id="131" w:name="_Toc50122337"/>
-      <w:bookmarkStart w:id="132" w:name="_Toc220677181"/>
-      <w:r>
-        <w:t xml:space="preserve">Where Next </w:t>
-      </w:r>
-      <w:r>
-        <w:t>Meets</w:t>
-      </w:r>
-      <w:r>
-        <w:t xml:space="preserve"> Now</w:t>
-      </w:r>
-      <w:bookmarkEnd w:id="129"/>
-      <w:bookmarkEnd w:id="130"/>
-      <w:bookmarkEnd w:id="131"/>
-      <w:bookmarkEnd w:id="132"/>
-    </w:p>
-    <w:p>
-      <w:r>
-        <w:rPr>
-          <w:shd w:val="clear" w:color="auto" w:fill="FFFFFF"/>
-        </w:rPr>
-        <w:t xml:space="preserve">Quest provides software solutions for the rapidly changing world of enterprise IT. We help simplify the challenges caused by data explosion, cloud expansion, hybrid data centers, security threats and regulatory requirements. We’re a global provider to 130,000 companies across 100 countries, including 95% of the Fortune 500 and 90% of the Global 1000. Since 1987, we’ve built a portfolio of solutions which now includes database management, data protection, identity and access management, Microsoft platform management and unified endpoint management. With Quest, organizations spend less time on IT administration and more time on business innovation. For more information, visit </w:t>
-      </w:r>
-      <w:hyperlink r:id="rId18" w:history="1">
-        <w:r>
-          <w:rPr>
-            <w:rStyle w:val="Hyperlink"/>
-            <w:rFonts w:eastAsiaTheme="majorEastAsia" w:cs="Arial"/>
-            <w:sz w:val="22"/>
-            <w:shd w:val="clear" w:color="auto" w:fill="FFFFFF"/>
-          </w:rPr>
-          <w:t>www.quest.com</w:t>
-        </w:r>
-      </w:hyperlink>
-      <w:r>
-        <w:rPr>
-          <w:shd w:val="clear" w:color="auto" w:fill="FFFFFF"/>
-        </w:rPr>
-        <w:t>.</w:t>
-      </w:r>
-    </w:p>
-    <w:p>
-      <w:pPr>
-        <w:pStyle w:val="Heading2"/>
-      </w:pPr>
-      <w:bookmarkStart w:id="133" w:name="_Toc50118497"/>
-      <w:bookmarkStart w:id="134" w:name="_Toc50118072"/>
-      <w:bookmarkStart w:id="135" w:name="_Toc50122338"/>
-      <w:bookmarkStart w:id="136" w:name="_Toc220677182"/>
-      <w:r>
-        <w:t>Contacting Quest</w:t>
-      </w:r>
-      <w:bookmarkEnd w:id="133"/>
-      <w:bookmarkEnd w:id="134"/>
-      <w:bookmarkEnd w:id="135"/>
-      <w:bookmarkEnd w:id="136"/>
-    </w:p>
-    <w:p>
-      <w:r>
-        <w:rPr>
-          <w:color w:val="262626"/>
-        </w:rPr>
-        <w:t xml:space="preserve">For sales or other inquiries, visit  </w:t>
-      </w:r>
-      <w:hyperlink r:id="rId19" w:history="1">
-        <w:r>
-          <w:rPr>
-            <w:rStyle w:val="Hyperlink"/>
-            <w:rFonts w:eastAsiaTheme="majorEastAsia" w:cs="Arial"/>
-            <w:sz w:val="22"/>
-          </w:rPr>
-          <w:t>www.quest.com/company/contact-us.aspx</w:t>
-        </w:r>
-      </w:hyperlink>
-      <w:r>
-        <w:rPr>
-          <w:color w:val="262626"/>
-        </w:rPr>
-        <w:t>.</w:t>
-      </w:r>
-    </w:p>
-    <w:p>
-      <w:pPr>
-        <w:pStyle w:val="Heading2"/>
-      </w:pPr>
-      <w:bookmarkStart w:id="137" w:name="_Toc50118498"/>
-      <w:bookmarkStart w:id="138" w:name="_Toc50118073"/>
-      <w:bookmarkStart w:id="139" w:name="_Toc50122339"/>
-      <w:bookmarkStart w:id="140" w:name="_Toc220677183"/>
-      <w:r>
-        <w:t>Technical support resources</w:t>
-      </w:r>
-      <w:bookmarkEnd w:id="137"/>
-      <w:bookmarkEnd w:id="138"/>
-      <w:bookmarkEnd w:id="139"/>
-      <w:bookmarkEnd w:id="140"/>
-    </w:p>
-    <w:p>
-      <w:r>
-        <w:t xml:space="preserve">Technical support is available to Quest customers with a valid maintenance contract and customers who have trial versions. You can access the Quest Support Portal at </w:t>
-      </w:r>
-      <w:hyperlink r:id="rId20" w:history="1">
-        <w:r>
-          <w:rPr>
-            <w:rStyle w:val="Hyperlink"/>
-            <w:rFonts w:eastAsiaTheme="majorEastAsia" w:cs="Arial"/>
-            <w:sz w:val="22"/>
-          </w:rPr>
-          <w:t>https://support.quest.com</w:t>
-        </w:r>
-      </w:hyperlink>
-      <w:r>
-        <w:t>.</w:t>
-      </w:r>
-    </w:p>
-    <w:p>
-      <w:r>
-        <w:t>The Support Portal provides self-help tools you can use to solve problems quickly and independently, 24 hours a day, 365 days a year. The Support Portal enables you to:</w:t>
-      </w:r>
-    </w:p>
-    <w:p>
-      <w:pPr>
-        <w:pStyle w:val="ListParagraph"/>
-        <w:numPr>
-          <w:ilvl w:val="0"/>
-          <w:numId w:val="7"/>
-        </w:numPr>
-        <w:rPr>
-          <w:color w:val="auto"/>
-        </w:rPr>
-      </w:pPr>
-      <w:r>
-        <w:t>Submit and manage a Service Request</w:t>
-      </w:r>
-    </w:p>
-    <w:p>
-      <w:pPr>
-        <w:pStyle w:val="ListParagraph"/>
-        <w:numPr>
-          <w:ilvl w:val="0"/>
-          <w:numId w:val="7"/>
-        </w:numPr>
-      </w:pPr>
-      <w:r>
-        <w:t>View Knowledge Base articles</w:t>
-      </w:r>
-    </w:p>
-    <w:p>
-      <w:pPr>
-        <w:pStyle w:val="ListParagraph"/>
-        <w:numPr>
-          <w:ilvl w:val="0"/>
-          <w:numId w:val="7"/>
-        </w:numPr>
-      </w:pPr>
-      <w:r>
-        <w:t>Sign up for product notifications</w:t>
-      </w:r>
-    </w:p>
-    <w:p>
-      <w:pPr>
-        <w:pStyle w:val="ListParagraph"/>
-        <w:numPr>
-          <w:ilvl w:val="0"/>
-          <w:numId w:val="7"/>
-        </w:numPr>
-      </w:pPr>
-      <w:r>
-        <w:t>Download software and technical documentation</w:t>
-      </w:r>
-    </w:p>
-    <w:p>
-      <w:pPr>
-        <w:pStyle w:val="ListParagraph"/>
-        <w:numPr>
-          <w:ilvl w:val="0"/>
-          <w:numId w:val="7"/>
-        </w:numPr>
-      </w:pPr>
-      <w:r>
-        <w:t>View how-to-videos</w:t>
-      </w:r>
-    </w:p>
-    <w:p>
-      <w:pPr>
-        <w:pStyle w:val="ListParagraph"/>
-        <w:numPr>
-          <w:ilvl w:val="0"/>
-          <w:numId w:val="7"/>
-        </w:numPr>
-      </w:pPr>
-      <w:r>
-        <w:t>Engage in community discussions</w:t>
-      </w:r>
-    </w:p>
-    <w:p>
-      <w:pPr>
-        <w:pStyle w:val="ListParagraph"/>
-        <w:numPr>
-          <w:ilvl w:val="0"/>
-          <w:numId w:val="7"/>
-        </w:numPr>
-      </w:pPr>
-      <w:r>
-        <w:t>Chat with support engineers online</w:t>
-      </w:r>
-    </w:p>
-    <w:p>
-      <w:pPr>
-        <w:pStyle w:val="ListParagraph"/>
-        <w:numPr>
-          <w:ilvl w:val="0"/>
-          <w:numId w:val="7"/>
-        </w:numPr>
-      </w:pPr>
-      <w:r>
-        <w:t>View services to assist you with your product.</w:t>
-      </w:r>
-    </w:p>
-    <w:p>
-      <w:pPr>
-        <w:rPr>
-          <w:u w:color="FFFFFF"/>
         </w:rPr>
       </w:pPr>
     </w:p>
@@ -12464,59 +12107,6 @@
     <w:r>
       <w:rPr>
         <w:noProof/>
-        <w:color w:val="59D2EE"/>
-      </w:rPr>
-      <w:drawing>
-        <wp:inline distT="0" distB="0" distL="0" distR="0" wp14:anchorId="512DC250" wp14:editId="63845F23">
-          <wp:extent cx="1408437" cy="381000"/>
-          <wp:effectExtent l="0" t="0" r="1270" b="0"/>
-          <wp:docPr id="1253244340" name="Picture 1253244340"/>
-          <wp:cNvGraphicFramePr>
-            <a:graphicFrameLocks xmlns:a="http://schemas.openxmlformats.org/drawingml/2006/main" noChangeAspect="1"/>
-          </wp:cNvGraphicFramePr>
-          <a:graphic xmlns:a="http://schemas.openxmlformats.org/drawingml/2006/main">
-            <a:graphicData uri="http://schemas.openxmlformats.org/drawingml/2006/picture">
-              <pic:pic xmlns:pic="http://schemas.openxmlformats.org/drawingml/2006/picture">
-                <pic:nvPicPr>
-                  <pic:cNvPr id="5" name="Quest-R-NatGrey-CMYK.jpg"/>
-                  <pic:cNvPicPr/>
-                </pic:nvPicPr>
-                <pic:blipFill>
-                  <a:blip r:embed="rId1">
-                    <a:extLst>
-                      <a:ext uri="{28A0092B-C50C-407E-A947-70E740481C1C}">
-                        <a14:useLocalDpi xmlns:a14="http://schemas.microsoft.com/office/drawing/2010/main" val="0"/>
-                      </a:ext>
-                    </a:extLst>
-                  </a:blip>
-                  <a:stretch>
-                    <a:fillRect/>
-                  </a:stretch>
-                </pic:blipFill>
-                <pic:spPr>
-                  <a:xfrm>
-                    <a:off x="0" y="0"/>
-                    <a:ext cx="1428342" cy="386385"/>
-                  </a:xfrm>
-                  <a:prstGeom prst="rect">
-                    <a:avLst/>
-                  </a:prstGeom>
-                </pic:spPr>
-              </pic:pic>
-            </a:graphicData>
-          </a:graphic>
-        </wp:inline>
-      </w:drawing>
-    </w:r>
-    <w:r>
-      <w:rPr>
-        <w:noProof/>
-      </w:rPr>
-      <w:tab/>
-    </w:r>
-    <w:r>
-      <w:rPr>
-        <w:noProof/>
       </w:rPr>
       <w:t>CONFIDENTIAL</w:t>
     </w:r>
@@ -12570,7 +12160,13 @@
       <w:rPr>
         <w:noProof/>
       </w:rPr>
-      <w:t xml:space="preserve"> CONFIDENTIAL</w:t>
+      <w:t xml:space="preserve"> </w:t>
+    </w:r>
+    <w:r>
+      <w:rPr>
+        <w:noProof/>
+      </w:rPr>
+      <w:t>CONFIDENTIAL</w:t>
     </w:r>
   </w:p>
 </w:ftr>
@@ -12664,21 +12260,21 @@
                           <w:r>
                             <w:rPr>
                               <w:rFonts w:cs="Arial"/>
-                              <w:color w:val="BFBFBF"/>
+                              <w:color w:val="auto"/>
                             </w:rPr>
                             <w:fldChar w:fldCharType="begin"/>
                           </w:r>
                           <w:r>
                             <w:rPr>
                               <w:rFonts w:cs="Arial"/>
-                              <w:color w:val="BFBFBF"/>
+                              <w:color w:val="auto"/>
                             </w:rPr>
                             <w:instrText xml:space="preserve"> FILENAME \* MERGEFORMAT </w:instrText>
                           </w:r>
                           <w:r>
                             <w:rPr>
                               <w:rFonts w:cs="Arial"/>
-                              <w:color w:val="BFBFBF"/>
+                              <w:color w:val="auto"/>
                             </w:rPr>
                             <w:fldChar w:fldCharType="separate"/>
                           </w:r>
@@ -12686,7 +12282,7 @@
                             <w:rPr>
                               <w:rFonts w:cs="Arial"/>
                               <w:noProof/>
-                              <w:color w:val="BFBFBF"/>
+                              <w:color w:val="auto"/>
                             </w:rPr>
                             <w:t>(</w:t>
                           </w:r>
@@ -12694,7 +12290,7 @@
                             <w:rPr>
                               <w:rFonts w:cs="Arial"/>
                               <w:noProof/>
-                              <w:color w:val="BFBFBF"/>
+                              <w:color w:val="auto"/>
                             </w:rPr>
                             <w:t>[Customer Name]</w:t>
                           </w:r>
@@ -12702,14 +12298,14 @@
                             <w:rPr>
                               <w:rFonts w:cs="Arial"/>
                               <w:noProof/>
-                              <w:color w:val="BFBFBF"/>
+                              <w:color w:val="auto"/>
                             </w:rPr>
-                            <w:t xml:space="preserve"> - PC12681) Discovery and Assessment Findings Report V1.0.docx</w:t>
+                            <w:t>) Discovery and Assessment Findings Report V1.0.docx</w:t>
                           </w:r>
                           <w:r>
                             <w:rPr>
                               <w:rFonts w:cs="Arial"/>
-                              <w:color w:val="BFBFBF"/>
+                              <w:color w:val="auto"/>
                             </w:rPr>
                             <w:fldChar w:fldCharType="end"/>
                           </w:r>
@@ -12747,21 +12343,21 @@
                     <w:r>
                       <w:rPr>
                         <w:rFonts w:cs="Arial"/>
-                        <w:color w:val="BFBFBF"/>
+                        <w:color w:val="auto"/>
                       </w:rPr>
                       <w:fldChar w:fldCharType="begin"/>
                     </w:r>
                     <w:r>
                       <w:rPr>
                         <w:rFonts w:cs="Arial"/>
-                        <w:color w:val="BFBFBF"/>
+                        <w:color w:val="auto"/>
                       </w:rPr>
                       <w:instrText xml:space="preserve"> FILENAME \* MERGEFORMAT </w:instrText>
                     </w:r>
                     <w:r>
                       <w:rPr>
                         <w:rFonts w:cs="Arial"/>
-                        <w:color w:val="BFBFBF"/>
+                        <w:color w:val="auto"/>
                       </w:rPr>
                       <w:fldChar w:fldCharType="separate"/>
                     </w:r>
@@ -12769,7 +12365,7 @@
                       <w:rPr>
                         <w:rFonts w:cs="Arial"/>
                         <w:noProof/>
-                        <w:color w:val="BFBFBF"/>
+                        <w:color w:val="auto"/>
                       </w:rPr>
                       <w:t>(</w:t>
                     </w:r>
@@ -12777,7 +12373,7 @@
                       <w:rPr>
                         <w:rFonts w:cs="Arial"/>
                         <w:noProof/>
-                        <w:color w:val="BFBFBF"/>
+                        <w:color w:val="auto"/>
                       </w:rPr>
                       <w:t>[Customer Name]</w:t>
                     </w:r>
@@ -12785,14 +12381,14 @@
                       <w:rPr>
                         <w:rFonts w:cs="Arial"/>
                         <w:noProof/>
-                        <w:color w:val="BFBFBF"/>
+                        <w:color w:val="auto"/>
                       </w:rPr>
-                      <w:t xml:space="preserve"> - PC12681) Discovery and Assessment Findings Report V1.0.docx</w:t>
+                      <w:t>) Discovery and Assessment Findings Report V1.0.docx</w:t>
                     </w:r>
                     <w:r>
                       <w:rPr>
                         <w:rFonts w:cs="Arial"/>
-                        <w:color w:val="BFBFBF"/>
+                        <w:color w:val="auto"/>
                       </w:rPr>
                       <w:fldChar w:fldCharType="end"/>
                     </w:r>
@@ -20843,25 +20439,6 @@
 </file>
 
 <file path=customXml/item1.xml><?xml version="1.0" encoding="utf-8"?>
-<p:properties xmlns:p="http://schemas.microsoft.com/office/2006/metadata/properties" xmlns:xsi="http://www.w3.org/2001/XMLSchema-instance" xmlns:pc="http://schemas.microsoft.com/office/infopath/2007/PartnerControls">
-  <documentManagement/>
-</p:properties>
-</file>
-
-<file path=customXml/item2.xml><?xml version="1.0" encoding="utf-8"?>
-<b:Sources xmlns:b="http://schemas.openxmlformats.org/officeDocument/2006/bibliography" xmlns="http://schemas.openxmlformats.org/officeDocument/2006/bibliography" SelectedStyle="/APA.XSL" StyleName="APA"/>
-</file>
-
-<file path=customXml/item3.xml><?xml version="1.0" encoding="utf-8"?>
-<?mso-contentType ?>
-<FormTemplates xmlns="http://schemas.microsoft.com/sharepoint/v3/contenttype/forms">
-  <Display>DocumentLibraryForm</Display>
-  <Edit>DocumentLibraryForm</Edit>
-  <New>DocumentLibraryForm</New>
-</FormTemplates>
-</file>
-
-<file path=customXml/item4.xml><?xml version="1.0" encoding="utf-8"?>
 <ct:contentTypeSchema xmlns:ct="http://schemas.microsoft.com/office/2006/metadata/contentType" xmlns:ma="http://schemas.microsoft.com/office/2006/metadata/properties/metaAttributes" ct:_="" ma:_="" ma:contentTypeName="Document" ma:contentTypeID="0x010100E8CB6F3EDD43474AA10481D50BB64020" ma:contentTypeVersion="4" ma:contentTypeDescription="Create a new document." ma:contentTypeScope="" ma:versionID="be0fb91248b2e97ea45459c2c5c0e22c">
   <xsd:schema xmlns:xsd="http://www.w3.org/2001/XMLSchema" xmlns:xs="http://www.w3.org/2001/XMLSchema" xmlns:p="http://schemas.microsoft.com/office/2006/metadata/properties" xmlns:ns2="564344db-7381-46cc-ad20-5587031b0ed9" targetNamespace="http://schemas.microsoft.com/office/2006/metadata/properties" ma:root="true" ma:fieldsID="9b3be8367740804d7b19f678bfda6a23" ns2:_="">
     <xsd:import namespace="564344db-7381-46cc-ad20-5587031b0ed9"/>
@@ -21005,32 +20582,26 @@
 </ct:contentTypeSchema>
 </file>
 
-<file path=customXml/itemProps1.xml><?xml version="1.0" encoding="utf-8"?>
-<ds:datastoreItem xmlns:ds="http://schemas.openxmlformats.org/officeDocument/2006/customXml" ds:itemID="{EEF0FF5E-EC80-4EC7-816E-8FD3FB1F00C5}">
-  <ds:schemaRefs>
-    <ds:schemaRef ds:uri="http://schemas.microsoft.com/office/2006/metadata/properties"/>
-    <ds:schemaRef ds:uri="http://schemas.microsoft.com/office/infopath/2007/PartnerControls"/>
-  </ds:schemaRefs>
-</ds:datastoreItem>
+<file path=customXml/item2.xml><?xml version="1.0" encoding="utf-8"?>
+<?mso-contentType ?>
+<FormTemplates xmlns="http://schemas.microsoft.com/sharepoint/v3/contenttype/forms">
+  <Display>DocumentLibraryForm</Display>
+  <Edit>DocumentLibraryForm</Edit>
+  <New>DocumentLibraryForm</New>
+</FormTemplates>
 </file>
 
-<file path=customXml/itemProps2.xml><?xml version="1.0" encoding="utf-8"?>
-<ds:datastoreItem xmlns:ds="http://schemas.openxmlformats.org/officeDocument/2006/customXml" ds:itemID="{1F2F4FAC-1BAA-4C15-8BEC-869F6AC26C67}">
-  <ds:schemaRefs>
-    <ds:schemaRef ds:uri="http://schemas.openxmlformats.org/officeDocument/2006/bibliography"/>
-  </ds:schemaRefs>
-</ds:datastoreItem>
+<file path=customXml/item3.xml><?xml version="1.0" encoding="utf-8"?>
+<b:Sources xmlns:b="http://schemas.openxmlformats.org/officeDocument/2006/bibliography" xmlns="http://schemas.openxmlformats.org/officeDocument/2006/bibliography" SelectedStyle="/APA.XSL" StyleName="APA"/>
 </file>
 
-<file path=customXml/itemProps3.xml><?xml version="1.0" encoding="utf-8"?>
-<ds:datastoreItem xmlns:ds="http://schemas.openxmlformats.org/officeDocument/2006/customXml" ds:itemID="{6830A3BC-7801-49DF-97A3-727FA35DA724}">
-  <ds:schemaRefs>
-    <ds:schemaRef ds:uri="http://schemas.microsoft.com/sharepoint/v3/contenttype/forms"/>
-  </ds:schemaRefs>
-</ds:datastoreItem>
+<file path=customXml/item4.xml><?xml version="1.0" encoding="utf-8"?>
+<p:properties xmlns:p="http://schemas.microsoft.com/office/2006/metadata/properties" xmlns:xsi="http://www.w3.org/2001/XMLSchema-instance" xmlns:pc="http://schemas.microsoft.com/office/infopath/2007/PartnerControls">
+  <documentManagement/>
+</p:properties>
 </file>
 
-<file path=customXml/itemProps4.xml><?xml version="1.0" encoding="utf-8"?>
+<file path=customXml/itemProps1.xml><?xml version="1.0" encoding="utf-8"?>
 <ds:datastoreItem xmlns:ds="http://schemas.openxmlformats.org/officeDocument/2006/customXml" ds:itemID="{EC30F5FF-22C8-4A05-8DCE-BA118E3692D7}">
   <ds:schemaRefs>
     <ds:schemaRef ds:uri="http://schemas.microsoft.com/office/2006/metadata/contentType"/>
@@ -21046,4 +20617,29 @@
     <ds:schemaRef ds:uri="http://schemas.microsoft.com/internal/obd"/>
   </ds:schemaRefs>
 </ds:datastoreItem>
+</file>
+
+<file path=customXml/itemProps2.xml><?xml version="1.0" encoding="utf-8"?>
+<ds:datastoreItem xmlns:ds="http://schemas.openxmlformats.org/officeDocument/2006/customXml" ds:itemID="{6830A3BC-7801-49DF-97A3-727FA35DA724}">
+  <ds:schemaRefs>
+    <ds:schemaRef ds:uri="http://schemas.microsoft.com/sharepoint/v3/contenttype/forms"/>
+  </ds:schemaRefs>
+</ds:datastoreItem>
+</file>
+
+<file path=customXml/itemProps3.xml><?xml version="1.0" encoding="utf-8"?>
+<ds:datastoreItem xmlns:ds="http://schemas.openxmlformats.org/officeDocument/2006/customXml" ds:itemID="{1F2F4FAC-1BAA-4C15-8BEC-869F6AC26C67}">
+  <ds:schemaRefs>
+    <ds:schemaRef ds:uri="http://schemas.openxmlformats.org/officeDocument/2006/bibliography"/>
+  </ds:schemaRefs>
+</ds:datastoreItem>
+</file>
+
+<file path=customXml/itemProps4.xml><?xml version="1.0" encoding="utf-8"?>
+<ds:datastoreItem xmlns:ds="http://schemas.openxmlformats.org/officeDocument/2006/customXml" ds:itemID="{EEF0FF5E-EC80-4EC7-816E-8FD3FB1F00C5}">
+  <ds:schemaRefs>
+    <ds:schemaRef ds:uri="http://schemas.microsoft.com/office/2006/metadata/properties"/>
+    <ds:schemaRef ds:uri="http://schemas.microsoft.com/office/infopath/2007/PartnerControls"/>
+  </ds:schemaRefs>
+</ds:datastoreItem>
 </file>
</xml_diff>